<commit_message>
Cập nhật bản Word kịch bản demo (thêm hướng dẫn tạo CSDL, chạy localhost)
Co-Authored-By: Claude Opus 5.5 <noreply@anthropic.com>
</commit_message>
<xml_diff>
--- a/docs/demo/KichBanVideoDemo.docx
+++ b/docs/demo/KichBanVideoDemo.docx
@@ -687,7 +687,191 @@
         <w:rPr>
           <w:rFonts w:eastAsia="Times New Roman"/>
         </w:rPr>
-        <w:t>1. Chuẩn bị trước khi quay (không quay phần này)</w:t>
+        <w:t>1. Cài đặt, tạo cơ sở dữ liệu và chạy website trên localhost</w:t>
+      </w:r>
+    </w:p>
+    <w:p>
+      <w:pPr>
+        <w:pStyle w:val="NormalWeb"/>
+        <w:rPr>
+          <w:sz w:val="26"/>
+          <w:szCs w:val="26"/>
+        </w:rPr>
+      </w:pPr>
+      <w:r>
+        <w:rPr>
+          <w:sz w:val="26"/>
+          <w:szCs w:val="26"/>
+        </w:rPr>
+        <w:t>Ph</w:t>
+      </w:r>
+      <w:r>
+        <w:rPr>
+          <w:sz w:val="26"/>
+          <w:szCs w:val="26"/>
+        </w:rPr>
+        <w:t>ầ</w:t>
+      </w:r>
+      <w:r>
+        <w:rPr>
+          <w:sz w:val="26"/>
+          <w:szCs w:val="26"/>
+        </w:rPr>
+        <w:t>n này ch</w:t>
+      </w:r>
+      <w:r>
+        <w:rPr>
+          <w:sz w:val="26"/>
+          <w:szCs w:val="26"/>
+        </w:rPr>
+        <w:t>ỉ</w:t>
+      </w:r>
+      <w:r>
+        <w:rPr>
+          <w:sz w:val="26"/>
+          <w:szCs w:val="26"/>
+        </w:rPr>
+        <w:t xml:space="preserve"> c</w:t>
+      </w:r>
+      <w:r>
+        <w:rPr>
+          <w:sz w:val="26"/>
+          <w:szCs w:val="26"/>
+        </w:rPr>
+        <w:t>ầ</w:t>
+      </w:r>
+      <w:r>
+        <w:rPr>
+          <w:sz w:val="26"/>
+          <w:szCs w:val="26"/>
+        </w:rPr>
+        <w:t>n làm m</w:t>
+      </w:r>
+      <w:r>
+        <w:rPr>
+          <w:sz w:val="26"/>
+          <w:szCs w:val="26"/>
+        </w:rPr>
+        <w:t>ộ</w:t>
+      </w:r>
+      <w:r>
+        <w:rPr>
+          <w:sz w:val="26"/>
+          <w:szCs w:val="26"/>
+        </w:rPr>
+        <w:t>t l</w:t>
+      </w:r>
+      <w:r>
+        <w:rPr>
+          <w:sz w:val="26"/>
+          <w:szCs w:val="26"/>
+        </w:rPr>
+        <w:t>ầ</w:t>
+      </w:r>
+      <w:r>
+        <w:rPr>
+          <w:sz w:val="26"/>
+          <w:szCs w:val="26"/>
+        </w:rPr>
+        <w:t>n trên máy dùng đ</w:t>
+      </w:r>
+      <w:r>
+        <w:rPr>
+          <w:sz w:val="26"/>
+          <w:szCs w:val="26"/>
+        </w:rPr>
+        <w:t>ể</w:t>
+      </w:r>
+      <w:r>
+        <w:rPr>
+          <w:sz w:val="26"/>
+          <w:szCs w:val="26"/>
+        </w:rPr>
+        <w:t xml:space="preserve"> quay. N</w:t>
+      </w:r>
+      <w:r>
+        <w:rPr>
+          <w:sz w:val="26"/>
+          <w:szCs w:val="26"/>
+        </w:rPr>
+        <w:t>ế</w:t>
+      </w:r>
+      <w:r>
+        <w:rPr>
+          <w:sz w:val="26"/>
+          <w:szCs w:val="26"/>
+        </w:rPr>
+        <w:t>u website đã ch</w:t>
+      </w:r>
+      <w:r>
+        <w:rPr>
+          <w:sz w:val="26"/>
+          <w:szCs w:val="26"/>
+        </w:rPr>
+        <w:t>ạ</w:t>
+      </w:r>
+      <w:r>
+        <w:rPr>
+          <w:sz w:val="26"/>
+          <w:szCs w:val="26"/>
+        </w:rPr>
+        <w:t>y đư</w:t>
+      </w:r>
+      <w:r>
+        <w:rPr>
+          <w:sz w:val="26"/>
+          <w:szCs w:val="26"/>
+        </w:rPr>
+        <w:t>ợ</w:t>
+      </w:r>
+      <w:r>
+        <w:rPr>
+          <w:sz w:val="26"/>
+          <w:szCs w:val="26"/>
+        </w:rPr>
+        <w:t>c t</w:t>
+      </w:r>
+      <w:r>
+        <w:rPr>
+          <w:sz w:val="26"/>
+          <w:szCs w:val="26"/>
+        </w:rPr>
+        <w:t>ạ</w:t>
+      </w:r>
+      <w:r>
+        <w:rPr>
+          <w:sz w:val="26"/>
+          <w:szCs w:val="26"/>
+        </w:rPr>
+        <w:t>i http://localhost:5080 thì chuy</w:t>
+      </w:r>
+      <w:r>
+        <w:rPr>
+          <w:sz w:val="26"/>
+          <w:szCs w:val="26"/>
+        </w:rPr>
+        <w:t>ể</w:t>
+      </w:r>
+      <w:r>
+        <w:rPr>
+          <w:sz w:val="26"/>
+          <w:szCs w:val="26"/>
+        </w:rPr>
+        <w:t>n sang m</w:t>
+      </w:r>
+      <w:r>
+        <w:rPr>
+          <w:sz w:val="26"/>
+          <w:szCs w:val="26"/>
+        </w:rPr>
+        <w:t>ụ</w:t>
+      </w:r>
+      <w:r>
+        <w:rPr>
+          <w:sz w:val="26"/>
+          <w:szCs w:val="26"/>
+        </w:rPr>
+        <w:t>c 2.</w:t>
       </w:r>
     </w:p>
     <w:p>
@@ -701,7 +885,1618 @@
         <w:rPr>
           <w:rFonts w:eastAsia="Times New Roman"/>
         </w:rPr>
-        <w:t>1.1. Đặt lại dữ liệu</w:t>
+        <w:t>1.1. Phần mềm cần có</w:t>
+      </w:r>
+    </w:p>
+    <w:tbl>
+      <w:tblPr>
+        <w:tblW w:w="5000" w:type="pct"/>
+        <w:tblCellMar>
+          <w:top w:w="15" w:type="dxa"/>
+          <w:left w:w="15" w:type="dxa"/>
+          <w:bottom w:w="15" w:type="dxa"/>
+          <w:right w:w="15" w:type="dxa"/>
+        </w:tblCellMar>
+        <w:tblLook w:val="04A0" w:firstRow="1" w:lastRow="0" w:firstColumn="1" w:lastColumn="0" w:noHBand="0" w:noVBand="1"/>
+      </w:tblPr>
+      <w:tblGrid>
+        <w:gridCol w:w="2087"/>
+        <w:gridCol w:w="3494"/>
+        <w:gridCol w:w="3475"/>
+      </w:tblGrid>
+      <w:tr>
+        <w:tc>
+          <w:tcPr>
+            <w:tcW w:w="0" w:type="auto"/>
+            <w:tcBorders>
+              <w:top w:val="single" w:sz="6" w:space="0" w:color="000000"/>
+              <w:left w:val="single" w:sz="6" w:space="0" w:color="000000"/>
+              <w:bottom w:val="single" w:sz="6" w:space="0" w:color="000000"/>
+              <w:right w:val="single" w:sz="6" w:space="0" w:color="000000"/>
+            </w:tcBorders>
+            <w:shd w:val="clear" w:color="auto" w:fill="D9E2F3"/>
+            <w:tcMar>
+              <w:top w:w="60" w:type="dxa"/>
+              <w:left w:w="100" w:type="dxa"/>
+              <w:bottom w:w="60" w:type="dxa"/>
+              <w:right w:w="100" w:type="dxa"/>
+            </w:tcMar>
+            <w:hideMark/>
+          </w:tcPr>
+          <w:p>
+            <w:pPr>
+              <w:spacing w:line="288" w:lineRule="auto"/>
+              <w:rPr>
+                <w:b/>
+                <w:bCs/>
+              </w:rPr>
+            </w:pPr>
+            <w:r>
+              <w:rPr>
+                <w:b/>
+                <w:bCs/>
+              </w:rPr>
+              <w:t>Ph</w:t>
+            </w:r>
+            <w:r>
+              <w:rPr>
+                <w:b/>
+                <w:bCs/>
+              </w:rPr>
+              <w:t>ầ</w:t>
+            </w:r>
+            <w:r>
+              <w:rPr>
+                <w:b/>
+                <w:bCs/>
+              </w:rPr>
+              <w:t>n m</w:t>
+            </w:r>
+            <w:r>
+              <w:rPr>
+                <w:b/>
+                <w:bCs/>
+              </w:rPr>
+              <w:t>ề</w:t>
+            </w:r>
+            <w:r>
+              <w:rPr>
+                <w:b/>
+                <w:bCs/>
+              </w:rPr>
+              <w:t>m</w:t>
+            </w:r>
+          </w:p>
+        </w:tc>
+        <w:tc>
+          <w:tcPr>
+            <w:tcW w:w="0" w:type="auto"/>
+            <w:tcBorders>
+              <w:top w:val="single" w:sz="6" w:space="0" w:color="000000"/>
+              <w:left w:val="single" w:sz="6" w:space="0" w:color="000000"/>
+              <w:bottom w:val="single" w:sz="6" w:space="0" w:color="000000"/>
+              <w:right w:val="single" w:sz="6" w:space="0" w:color="000000"/>
+            </w:tcBorders>
+            <w:shd w:val="clear" w:color="auto" w:fill="D9E2F3"/>
+            <w:tcMar>
+              <w:top w:w="60" w:type="dxa"/>
+              <w:left w:w="100" w:type="dxa"/>
+              <w:bottom w:w="60" w:type="dxa"/>
+              <w:right w:w="100" w:type="dxa"/>
+            </w:tcMar>
+            <w:hideMark/>
+          </w:tcPr>
+          <w:p>
+            <w:pPr>
+              <w:spacing w:line="288" w:lineRule="auto"/>
+              <w:rPr>
+                <w:b/>
+                <w:bCs/>
+              </w:rPr>
+            </w:pPr>
+            <w:r>
+              <w:rPr>
+                <w:b/>
+                <w:bCs/>
+              </w:rPr>
+              <w:t>Ghi chú</w:t>
+            </w:r>
+          </w:p>
+        </w:tc>
+        <w:tc>
+          <w:tcPr>
+            <w:tcW w:w="0" w:type="auto"/>
+            <w:tcBorders>
+              <w:top w:val="single" w:sz="6" w:space="0" w:color="000000"/>
+              <w:left w:val="single" w:sz="6" w:space="0" w:color="000000"/>
+              <w:bottom w:val="single" w:sz="6" w:space="0" w:color="000000"/>
+              <w:right w:val="single" w:sz="6" w:space="0" w:color="000000"/>
+            </w:tcBorders>
+            <w:shd w:val="clear" w:color="auto" w:fill="D9E2F3"/>
+            <w:tcMar>
+              <w:top w:w="60" w:type="dxa"/>
+              <w:left w:w="100" w:type="dxa"/>
+              <w:bottom w:w="60" w:type="dxa"/>
+              <w:right w:w="100" w:type="dxa"/>
+            </w:tcMar>
+            <w:hideMark/>
+          </w:tcPr>
+          <w:p>
+            <w:pPr>
+              <w:spacing w:line="288" w:lineRule="auto"/>
+              <w:rPr>
+                <w:b/>
+                <w:bCs/>
+              </w:rPr>
+            </w:pPr>
+            <w:r>
+              <w:rPr>
+                <w:b/>
+                <w:bCs/>
+              </w:rPr>
+              <w:t>Cách ki</w:t>
+            </w:r>
+            <w:r>
+              <w:rPr>
+                <w:b/>
+                <w:bCs/>
+              </w:rPr>
+              <w:t>ể</w:t>
+            </w:r>
+            <w:r>
+              <w:rPr>
+                <w:b/>
+                <w:bCs/>
+              </w:rPr>
+              <w:t>m tra</w:t>
+            </w:r>
+          </w:p>
+        </w:tc>
+      </w:tr>
+      <w:tr>
+        <w:tc>
+          <w:tcPr>
+            <w:tcW w:w="0" w:type="auto"/>
+            <w:tcBorders>
+              <w:top w:val="single" w:sz="6" w:space="0" w:color="000000"/>
+              <w:left w:val="single" w:sz="6" w:space="0" w:color="000000"/>
+              <w:bottom w:val="single" w:sz="6" w:space="0" w:color="000000"/>
+              <w:right w:val="single" w:sz="6" w:space="0" w:color="000000"/>
+            </w:tcBorders>
+            <w:tcMar>
+              <w:top w:w="60" w:type="dxa"/>
+              <w:left w:w="100" w:type="dxa"/>
+              <w:bottom w:w="60" w:type="dxa"/>
+              <w:right w:w="100" w:type="dxa"/>
+            </w:tcMar>
+            <w:hideMark/>
+          </w:tcPr>
+          <w:p>
+            <w:pPr>
+              <w:spacing w:line="288" w:lineRule="auto"/>
+            </w:pPr>
+            <w:r>
+              <w:t>.NET 8 SDK</w:t>
+            </w:r>
+          </w:p>
+        </w:tc>
+        <w:tc>
+          <w:tcPr>
+            <w:tcW w:w="0" w:type="auto"/>
+            <w:tcBorders>
+              <w:top w:val="single" w:sz="6" w:space="0" w:color="000000"/>
+              <w:left w:val="single" w:sz="6" w:space="0" w:color="000000"/>
+              <w:bottom w:val="single" w:sz="6" w:space="0" w:color="000000"/>
+              <w:right w:val="single" w:sz="6" w:space="0" w:color="000000"/>
+            </w:tcBorders>
+            <w:tcMar>
+              <w:top w:w="60" w:type="dxa"/>
+              <w:left w:w="100" w:type="dxa"/>
+              <w:bottom w:w="60" w:type="dxa"/>
+              <w:right w:w="100" w:type="dxa"/>
+            </w:tcMar>
+            <w:hideMark/>
+          </w:tcPr>
+          <w:p>
+            <w:pPr>
+              <w:spacing w:line="288" w:lineRule="auto"/>
+            </w:pPr>
+            <w:r>
+              <w:t>T</w:t>
+            </w:r>
+            <w:r>
+              <w:t>ả</w:t>
+            </w:r>
+            <w:r>
+              <w:t>i t</w:t>
+            </w:r>
+            <w:r>
+              <w:t>ạ</w:t>
+            </w:r>
+            <w:r>
+              <w:t>i dotnet.microsoft.com, b</w:t>
+            </w:r>
+            <w:r>
+              <w:t>ả</w:t>
+            </w:r>
+            <w:r>
+              <w:t>n SDK 8.0.x cho Windows x64</w:t>
+            </w:r>
+          </w:p>
+        </w:tc>
+        <w:tc>
+          <w:tcPr>
+            <w:tcW w:w="0" w:type="auto"/>
+            <w:tcBorders>
+              <w:top w:val="single" w:sz="6" w:space="0" w:color="000000"/>
+              <w:left w:val="single" w:sz="6" w:space="0" w:color="000000"/>
+              <w:bottom w:val="single" w:sz="6" w:space="0" w:color="000000"/>
+              <w:right w:val="single" w:sz="6" w:space="0" w:color="000000"/>
+            </w:tcBorders>
+            <w:tcMar>
+              <w:top w:w="60" w:type="dxa"/>
+              <w:left w:w="100" w:type="dxa"/>
+              <w:bottom w:w="60" w:type="dxa"/>
+              <w:right w:w="100" w:type="dxa"/>
+            </w:tcMar>
+            <w:hideMark/>
+          </w:tcPr>
+          <w:p>
+            <w:pPr>
+              <w:spacing w:line="288" w:lineRule="auto"/>
+            </w:pPr>
+            <w:r>
+              <w:t>M</w:t>
+            </w:r>
+            <w:r>
+              <w:t>ở</w:t>
+            </w:r>
+            <w:r>
+              <w:t xml:space="preserve"> PowerShell, gõ </w:t>
+            </w:r>
+            <w:r>
+              <w:rPr>
+                <w:rStyle w:val="HTMLCode"/>
+              </w:rPr>
+              <w:t>dotnet --list-sdks</w:t>
+            </w:r>
+            <w:r>
+              <w:t xml:space="preserve"> → có dòng b</w:t>
+            </w:r>
+            <w:r>
+              <w:t>ắ</w:t>
+            </w:r>
+            <w:r>
+              <w:t>t đ</w:t>
+            </w:r>
+            <w:r>
+              <w:t>ầ</w:t>
+            </w:r>
+            <w:r>
+              <w:t>u b</w:t>
+            </w:r>
+            <w:r>
+              <w:t>ằ</w:t>
+            </w:r>
+            <w:r>
+              <w:t>ng 8.0</w:t>
+            </w:r>
+          </w:p>
+        </w:tc>
+      </w:tr>
+      <w:tr>
+        <w:tc>
+          <w:tcPr>
+            <w:tcW w:w="0" w:type="auto"/>
+            <w:tcBorders>
+              <w:top w:val="single" w:sz="6" w:space="0" w:color="000000"/>
+              <w:left w:val="single" w:sz="6" w:space="0" w:color="000000"/>
+              <w:bottom w:val="single" w:sz="6" w:space="0" w:color="000000"/>
+              <w:right w:val="single" w:sz="6" w:space="0" w:color="000000"/>
+            </w:tcBorders>
+            <w:tcMar>
+              <w:top w:w="60" w:type="dxa"/>
+              <w:left w:w="100" w:type="dxa"/>
+              <w:bottom w:w="60" w:type="dxa"/>
+              <w:right w:w="100" w:type="dxa"/>
+            </w:tcMar>
+            <w:hideMark/>
+          </w:tcPr>
+          <w:p>
+            <w:pPr>
+              <w:spacing w:line="288" w:lineRule="auto"/>
+            </w:pPr>
+            <w:r>
+              <w:t>SQL Server 2022 Express</w:t>
+            </w:r>
+          </w:p>
+        </w:tc>
+        <w:tc>
+          <w:tcPr>
+            <w:tcW w:w="0" w:type="auto"/>
+            <w:tcBorders>
+              <w:top w:val="single" w:sz="6" w:space="0" w:color="000000"/>
+              <w:left w:val="single" w:sz="6" w:space="0" w:color="000000"/>
+              <w:bottom w:val="single" w:sz="6" w:space="0" w:color="000000"/>
+              <w:right w:val="single" w:sz="6" w:space="0" w:color="000000"/>
+            </w:tcBorders>
+            <w:tcMar>
+              <w:top w:w="60" w:type="dxa"/>
+              <w:left w:w="100" w:type="dxa"/>
+              <w:bottom w:w="60" w:type="dxa"/>
+              <w:right w:w="100" w:type="dxa"/>
+            </w:tcMar>
+            <w:hideMark/>
+          </w:tcPr>
+          <w:p>
+            <w:pPr>
+              <w:spacing w:line="288" w:lineRule="auto"/>
+            </w:pPr>
+            <w:r>
+              <w:t>Khi cài ch</w:t>
+            </w:r>
+            <w:r>
+              <w:t>ọ</w:t>
+            </w:r>
+            <w:r>
+              <w:t>n Basic; tên instance m</w:t>
+            </w:r>
+            <w:r>
+              <w:t>ặ</w:t>
+            </w:r>
+            <w:r>
+              <w:t>c đ</w:t>
+            </w:r>
+            <w:r>
+              <w:t>ị</w:t>
+            </w:r>
+            <w:r>
+              <w:t>nh là SQLEXPRESS</w:t>
+            </w:r>
+          </w:p>
+        </w:tc>
+        <w:tc>
+          <w:tcPr>
+            <w:tcW w:w="0" w:type="auto"/>
+            <w:tcBorders>
+              <w:top w:val="single" w:sz="6" w:space="0" w:color="000000"/>
+              <w:left w:val="single" w:sz="6" w:space="0" w:color="000000"/>
+              <w:bottom w:val="single" w:sz="6" w:space="0" w:color="000000"/>
+              <w:right w:val="single" w:sz="6" w:space="0" w:color="000000"/>
+            </w:tcBorders>
+            <w:tcMar>
+              <w:top w:w="60" w:type="dxa"/>
+              <w:left w:w="100" w:type="dxa"/>
+              <w:bottom w:w="60" w:type="dxa"/>
+              <w:right w:w="100" w:type="dxa"/>
+            </w:tcMar>
+            <w:hideMark/>
+          </w:tcPr>
+          <w:p>
+            <w:pPr>
+              <w:spacing w:line="288" w:lineRule="auto"/>
+            </w:pPr>
+            <w:r>
+              <w:t>M</w:t>
+            </w:r>
+            <w:r>
+              <w:t>ở</w:t>
+            </w:r>
+            <w:r>
+              <w:t xml:space="preserve"> services.msc → d</w:t>
+            </w:r>
+            <w:r>
+              <w:t>ị</w:t>
+            </w:r>
+            <w:r>
+              <w:t>ch v</w:t>
+            </w:r>
+            <w:r>
+              <w:t>ụ</w:t>
+            </w:r>
+            <w:r>
+              <w:t xml:space="preserve"> SQL Server (SQLEXPRESS) </w:t>
+            </w:r>
+            <w:r>
+              <w:t>ở</w:t>
+            </w:r>
+            <w:r>
+              <w:t xml:space="preserve"> tr</w:t>
+            </w:r>
+            <w:r>
+              <w:t>ạ</w:t>
+            </w:r>
+            <w:r>
+              <w:t>ng thái Running</w:t>
+            </w:r>
+          </w:p>
+        </w:tc>
+      </w:tr>
+      <w:tr>
+        <w:tc>
+          <w:tcPr>
+            <w:tcW w:w="0" w:type="auto"/>
+            <w:tcBorders>
+              <w:top w:val="single" w:sz="6" w:space="0" w:color="000000"/>
+              <w:left w:val="single" w:sz="6" w:space="0" w:color="000000"/>
+              <w:bottom w:val="single" w:sz="6" w:space="0" w:color="000000"/>
+              <w:right w:val="single" w:sz="6" w:space="0" w:color="000000"/>
+            </w:tcBorders>
+            <w:tcMar>
+              <w:top w:w="60" w:type="dxa"/>
+              <w:left w:w="100" w:type="dxa"/>
+              <w:bottom w:w="60" w:type="dxa"/>
+              <w:right w:w="100" w:type="dxa"/>
+            </w:tcMar>
+            <w:hideMark/>
+          </w:tcPr>
+          <w:p>
+            <w:pPr>
+              <w:spacing w:line="288" w:lineRule="auto"/>
+            </w:pPr>
+            <w:r>
+              <w:t>SQL Server Management Studio (SSMS)</w:t>
+            </w:r>
+          </w:p>
+        </w:tc>
+        <w:tc>
+          <w:tcPr>
+            <w:tcW w:w="0" w:type="auto"/>
+            <w:tcBorders>
+              <w:top w:val="single" w:sz="6" w:space="0" w:color="000000"/>
+              <w:left w:val="single" w:sz="6" w:space="0" w:color="000000"/>
+              <w:bottom w:val="single" w:sz="6" w:space="0" w:color="000000"/>
+              <w:right w:val="single" w:sz="6" w:space="0" w:color="000000"/>
+            </w:tcBorders>
+            <w:tcMar>
+              <w:top w:w="60" w:type="dxa"/>
+              <w:left w:w="100" w:type="dxa"/>
+              <w:bottom w:w="60" w:type="dxa"/>
+              <w:right w:w="100" w:type="dxa"/>
+            </w:tcMar>
+            <w:hideMark/>
+          </w:tcPr>
+          <w:p>
+            <w:pPr>
+              <w:spacing w:line="288" w:lineRule="auto"/>
+            </w:pPr>
+            <w:r>
+              <w:t>Đ</w:t>
+            </w:r>
+            <w:r>
+              <w:t>ể</w:t>
+            </w:r>
+            <w:r>
+              <w:t xml:space="preserve"> xem cơ s</w:t>
+            </w:r>
+            <w:r>
+              <w:t>ở</w:t>
+            </w:r>
+            <w:r>
+              <w:t xml:space="preserve"> d</w:t>
+            </w:r>
+            <w:r>
+              <w:t>ữ</w:t>
+            </w:r>
+            <w:r>
+              <w:t xml:space="preserve"> li</w:t>
+            </w:r>
+            <w:r>
+              <w:t>ệ</w:t>
+            </w:r>
+            <w:r>
+              <w:t>u khi quay c</w:t>
+            </w:r>
+            <w:r>
+              <w:t>ả</w:t>
+            </w:r>
+            <w:r>
+              <w:t>nh m</w:t>
+            </w:r>
+            <w:r>
+              <w:t>ở</w:t>
+            </w:r>
+            <w:r>
+              <w:t xml:space="preserve"> đ</w:t>
+            </w:r>
+            <w:r>
+              <w:t>ầ</w:t>
+            </w:r>
+            <w:r>
+              <w:t>u</w:t>
+            </w:r>
+          </w:p>
+        </w:tc>
+        <w:tc>
+          <w:tcPr>
+            <w:tcW w:w="0" w:type="auto"/>
+            <w:tcBorders>
+              <w:top w:val="single" w:sz="6" w:space="0" w:color="000000"/>
+              <w:left w:val="single" w:sz="6" w:space="0" w:color="000000"/>
+              <w:bottom w:val="single" w:sz="6" w:space="0" w:color="000000"/>
+              <w:right w:val="single" w:sz="6" w:space="0" w:color="000000"/>
+            </w:tcBorders>
+            <w:tcMar>
+              <w:top w:w="60" w:type="dxa"/>
+              <w:left w:w="100" w:type="dxa"/>
+              <w:bottom w:w="60" w:type="dxa"/>
+              <w:right w:w="100" w:type="dxa"/>
+            </w:tcMar>
+            <w:hideMark/>
+          </w:tcPr>
+          <w:p>
+            <w:pPr>
+              <w:spacing w:line="288" w:lineRule="auto"/>
+            </w:pPr>
+            <w:r>
+              <w:t>M</w:t>
+            </w:r>
+            <w:r>
+              <w:t>ở</w:t>
+            </w:r>
+            <w:r>
+              <w:t xml:space="preserve"> SSMS, k</w:t>
+            </w:r>
+            <w:r>
+              <w:t>ế</w:t>
+            </w:r>
+            <w:r>
+              <w:t>t n</w:t>
+            </w:r>
+            <w:r>
+              <w:t>ố</w:t>
+            </w:r>
+            <w:r>
+              <w:t xml:space="preserve">i Server name </w:t>
+            </w:r>
+            <w:r>
+              <w:rPr>
+                <w:rStyle w:val="HTMLCode"/>
+              </w:rPr>
+              <w:t>.\SQLEXPRESS</w:t>
+            </w:r>
+            <w:r>
+              <w:t>, Authentication: Windows Authentication</w:t>
+            </w:r>
+          </w:p>
+        </w:tc>
+      </w:tr>
+      <w:tr>
+        <w:tc>
+          <w:tcPr>
+            <w:tcW w:w="0" w:type="auto"/>
+            <w:tcBorders>
+              <w:top w:val="single" w:sz="6" w:space="0" w:color="000000"/>
+              <w:left w:val="single" w:sz="6" w:space="0" w:color="000000"/>
+              <w:bottom w:val="single" w:sz="6" w:space="0" w:color="000000"/>
+              <w:right w:val="single" w:sz="6" w:space="0" w:color="000000"/>
+            </w:tcBorders>
+            <w:tcMar>
+              <w:top w:w="60" w:type="dxa"/>
+              <w:left w:w="100" w:type="dxa"/>
+              <w:bottom w:w="60" w:type="dxa"/>
+              <w:right w:w="100" w:type="dxa"/>
+            </w:tcMar>
+            <w:hideMark/>
+          </w:tcPr>
+          <w:p>
+            <w:pPr>
+              <w:spacing w:line="288" w:lineRule="auto"/>
+            </w:pPr>
+            <w:r>
+              <w:t>Visual Studio 2022</w:t>
+            </w:r>
+          </w:p>
+        </w:tc>
+        <w:tc>
+          <w:tcPr>
+            <w:tcW w:w="0" w:type="auto"/>
+            <w:tcBorders>
+              <w:top w:val="single" w:sz="6" w:space="0" w:color="000000"/>
+              <w:left w:val="single" w:sz="6" w:space="0" w:color="000000"/>
+              <w:bottom w:val="single" w:sz="6" w:space="0" w:color="000000"/>
+              <w:right w:val="single" w:sz="6" w:space="0" w:color="000000"/>
+            </w:tcBorders>
+            <w:tcMar>
+              <w:top w:w="60" w:type="dxa"/>
+              <w:left w:w="100" w:type="dxa"/>
+              <w:bottom w:w="60" w:type="dxa"/>
+              <w:right w:w="100" w:type="dxa"/>
+            </w:tcMar>
+            <w:hideMark/>
+          </w:tcPr>
+          <w:p>
+            <w:pPr>
+              <w:spacing w:line="288" w:lineRule="auto"/>
+            </w:pPr>
+            <w:r>
+              <w:t>Workload ASP.NET and web development; ch</w:t>
+            </w:r>
+            <w:r>
+              <w:t>ỉ</w:t>
+            </w:r>
+            <w:r>
+              <w:t xml:space="preserve"> dùng đ</w:t>
+            </w:r>
+            <w:r>
+              <w:t>ể</w:t>
+            </w:r>
+            <w:r>
+              <w:t xml:space="preserve"> m</w:t>
+            </w:r>
+            <w:r>
+              <w:t>ở</w:t>
+            </w:r>
+            <w:r>
+              <w:t xml:space="preserve"> code khi quay</w:t>
+            </w:r>
+          </w:p>
+        </w:tc>
+        <w:tc>
+          <w:tcPr>
+            <w:tcW w:w="0" w:type="auto"/>
+            <w:tcBorders>
+              <w:top w:val="single" w:sz="6" w:space="0" w:color="000000"/>
+              <w:left w:val="single" w:sz="6" w:space="0" w:color="000000"/>
+              <w:bottom w:val="single" w:sz="6" w:space="0" w:color="000000"/>
+              <w:right w:val="single" w:sz="6" w:space="0" w:color="000000"/>
+            </w:tcBorders>
+            <w:tcMar>
+              <w:top w:w="60" w:type="dxa"/>
+              <w:left w:w="100" w:type="dxa"/>
+              <w:bottom w:w="60" w:type="dxa"/>
+              <w:right w:w="100" w:type="dxa"/>
+            </w:tcMar>
+            <w:hideMark/>
+          </w:tcPr>
+          <w:p>
+            <w:pPr>
+              <w:spacing w:line="288" w:lineRule="auto"/>
+            </w:pPr>
+            <w:r>
+              <w:t>M</w:t>
+            </w:r>
+            <w:r>
+              <w:t>ở</w:t>
+            </w:r>
+            <w:r>
+              <w:t xml:space="preserve"> đư</w:t>
+            </w:r>
+            <w:r>
+              <w:t>ợ</w:t>
+            </w:r>
+            <w:r>
+              <w:t>c t</w:t>
+            </w:r>
+            <w:r>
+              <w:t>ệ</w:t>
+            </w:r>
+            <w:r>
+              <w:t>p TVUStartup.sln</w:t>
+            </w:r>
+          </w:p>
+        </w:tc>
+      </w:tr>
+      <w:tr>
+        <w:tc>
+          <w:tcPr>
+            <w:tcW w:w="0" w:type="auto"/>
+            <w:tcBorders>
+              <w:top w:val="single" w:sz="6" w:space="0" w:color="000000"/>
+              <w:left w:val="single" w:sz="6" w:space="0" w:color="000000"/>
+              <w:bottom w:val="single" w:sz="6" w:space="0" w:color="000000"/>
+              <w:right w:val="single" w:sz="6" w:space="0" w:color="000000"/>
+            </w:tcBorders>
+            <w:tcMar>
+              <w:top w:w="60" w:type="dxa"/>
+              <w:left w:w="100" w:type="dxa"/>
+              <w:bottom w:w="60" w:type="dxa"/>
+              <w:right w:w="100" w:type="dxa"/>
+            </w:tcMar>
+            <w:hideMark/>
+          </w:tcPr>
+          <w:p>
+            <w:pPr>
+              <w:spacing w:line="288" w:lineRule="auto"/>
+            </w:pPr>
+            <w:r>
+              <w:t>Git (không b</w:t>
+            </w:r>
+            <w:r>
+              <w:t>ắ</w:t>
+            </w:r>
+            <w:r>
+              <w:t>t bu</w:t>
+            </w:r>
+            <w:r>
+              <w:t>ộ</w:t>
+            </w:r>
+            <w:r>
+              <w:t>c)</w:t>
+            </w:r>
+          </w:p>
+        </w:tc>
+        <w:tc>
+          <w:tcPr>
+            <w:tcW w:w="0" w:type="auto"/>
+            <w:tcBorders>
+              <w:top w:val="single" w:sz="6" w:space="0" w:color="000000"/>
+              <w:left w:val="single" w:sz="6" w:space="0" w:color="000000"/>
+              <w:bottom w:val="single" w:sz="6" w:space="0" w:color="000000"/>
+              <w:right w:val="single" w:sz="6" w:space="0" w:color="000000"/>
+            </w:tcBorders>
+            <w:tcMar>
+              <w:top w:w="60" w:type="dxa"/>
+              <w:left w:w="100" w:type="dxa"/>
+              <w:bottom w:w="60" w:type="dxa"/>
+              <w:right w:w="100" w:type="dxa"/>
+            </w:tcMar>
+            <w:hideMark/>
+          </w:tcPr>
+          <w:p>
+            <w:pPr>
+              <w:spacing w:line="288" w:lineRule="auto"/>
+            </w:pPr>
+            <w:r>
+              <w:t>Dùng đ</w:t>
+            </w:r>
+            <w:r>
+              <w:t>ể</w:t>
+            </w:r>
+            <w:r>
+              <w:t xml:space="preserve"> t</w:t>
+            </w:r>
+            <w:r>
+              <w:t>ả</w:t>
+            </w:r>
+            <w:r>
+              <w:t>i mã ngu</w:t>
+            </w:r>
+            <w:r>
+              <w:t>ồ</w:t>
+            </w:r>
+            <w:r>
+              <w:t>n t</w:t>
+            </w:r>
+            <w:r>
+              <w:t>ừ</w:t>
+            </w:r>
+            <w:r>
+              <w:t xml:space="preserve"> GitHub</w:t>
+            </w:r>
+          </w:p>
+        </w:tc>
+        <w:tc>
+          <w:tcPr>
+            <w:tcW w:w="0" w:type="auto"/>
+            <w:tcBorders>
+              <w:top w:val="single" w:sz="6" w:space="0" w:color="000000"/>
+              <w:left w:val="single" w:sz="6" w:space="0" w:color="000000"/>
+              <w:bottom w:val="single" w:sz="6" w:space="0" w:color="000000"/>
+              <w:right w:val="single" w:sz="6" w:space="0" w:color="000000"/>
+            </w:tcBorders>
+            <w:tcMar>
+              <w:top w:w="60" w:type="dxa"/>
+              <w:left w:w="100" w:type="dxa"/>
+              <w:bottom w:w="60" w:type="dxa"/>
+              <w:right w:w="100" w:type="dxa"/>
+            </w:tcMar>
+            <w:hideMark/>
+          </w:tcPr>
+          <w:p>
+            <w:pPr>
+              <w:spacing w:line="288" w:lineRule="auto"/>
+            </w:pPr>
+            <w:r>
+              <w:rPr>
+                <w:rStyle w:val="HTMLCode"/>
+              </w:rPr>
+              <w:t>git --version</w:t>
+            </w:r>
+          </w:p>
+        </w:tc>
+      </w:tr>
+    </w:tbl>
+    <w:p>
+      <w:pPr>
+        <w:pStyle w:val="Heading3"/>
+        <w:rPr>
+          <w:rFonts w:eastAsia="Times New Roman"/>
+        </w:rPr>
+      </w:pPr>
+      <w:r>
+        <w:rPr>
+          <w:rFonts w:eastAsia="Times New Roman"/>
+        </w:rPr>
+        <w:t>1.2. Lấy mã nguồn</w:t>
+      </w:r>
+    </w:p>
+    <w:p>
+      <w:pPr>
+        <w:pStyle w:val="NormalWeb"/>
+        <w:rPr>
+          <w:sz w:val="26"/>
+          <w:szCs w:val="26"/>
+        </w:rPr>
+      </w:pPr>
+      <w:r>
+        <w:rPr>
+          <w:sz w:val="26"/>
+          <w:szCs w:val="26"/>
+        </w:rPr>
+        <w:t>M</w:t>
+      </w:r>
+      <w:r>
+        <w:rPr>
+          <w:sz w:val="26"/>
+          <w:szCs w:val="26"/>
+        </w:rPr>
+        <w:t>ở</w:t>
+      </w:r>
+      <w:r>
+        <w:rPr>
+          <w:sz w:val="26"/>
+          <w:szCs w:val="26"/>
+        </w:rPr>
+        <w:t xml:space="preserve"> PowerShell t</w:t>
+      </w:r>
+      <w:r>
+        <w:rPr>
+          <w:sz w:val="26"/>
+          <w:szCs w:val="26"/>
+        </w:rPr>
+        <w:t>ạ</w:t>
+      </w:r>
+      <w:r>
+        <w:rPr>
+          <w:sz w:val="26"/>
+          <w:szCs w:val="26"/>
+        </w:rPr>
+        <w:t>i thư m</w:t>
+      </w:r>
+      <w:r>
+        <w:rPr>
+          <w:sz w:val="26"/>
+          <w:szCs w:val="26"/>
+        </w:rPr>
+        <w:t>ụ</w:t>
+      </w:r>
+      <w:r>
+        <w:rPr>
+          <w:sz w:val="26"/>
+          <w:szCs w:val="26"/>
+        </w:rPr>
+        <w:t>c mu</w:t>
+      </w:r>
+      <w:r>
+        <w:rPr>
+          <w:sz w:val="26"/>
+          <w:szCs w:val="26"/>
+        </w:rPr>
+        <w:t>ố</w:t>
+      </w:r>
+      <w:r>
+        <w:rPr>
+          <w:sz w:val="26"/>
+          <w:szCs w:val="26"/>
+        </w:rPr>
+        <w:t>n lưu, ch</w:t>
+      </w:r>
+      <w:r>
+        <w:rPr>
+          <w:sz w:val="26"/>
+          <w:szCs w:val="26"/>
+        </w:rPr>
+        <w:t>ạ</w:t>
+      </w:r>
+      <w:r>
+        <w:rPr>
+          <w:sz w:val="26"/>
+          <w:szCs w:val="26"/>
+        </w:rPr>
+        <w:t>y:</w:t>
+      </w:r>
+    </w:p>
+    <w:p>
+      <w:pPr>
+        <w:pStyle w:val="code"/>
+      </w:pPr>
+      <w:r>
+        <w:t>git clone </w:t>
+      </w:r>
+      <w:r>
+        <w:t>https://github.com/taophuong/TVU.git</w:t>
+      </w:r>
+      <w:r>
+        <w:br/>
+        <w:t>cd TVU</w:t>
+      </w:r>
+    </w:p>
+    <w:p>
+      <w:pPr>
+        <w:pStyle w:val="NormalWeb"/>
+        <w:rPr>
+          <w:sz w:val="26"/>
+          <w:szCs w:val="26"/>
+        </w:rPr>
+      </w:pPr>
+      <w:r>
+        <w:rPr>
+          <w:sz w:val="26"/>
+          <w:szCs w:val="26"/>
+        </w:rPr>
+        <w:t>Ho</w:t>
+      </w:r>
+      <w:r>
+        <w:rPr>
+          <w:sz w:val="26"/>
+          <w:szCs w:val="26"/>
+        </w:rPr>
+        <w:t>ặ</w:t>
+      </w:r>
+      <w:r>
+        <w:rPr>
+          <w:sz w:val="26"/>
+          <w:szCs w:val="26"/>
+        </w:rPr>
+        <w:t>c gi</w:t>
+      </w:r>
+      <w:r>
+        <w:rPr>
+          <w:sz w:val="26"/>
+          <w:szCs w:val="26"/>
+        </w:rPr>
+        <w:t>ả</w:t>
+      </w:r>
+      <w:r>
+        <w:rPr>
+          <w:sz w:val="26"/>
+          <w:szCs w:val="26"/>
+        </w:rPr>
+        <w:t>i nén t</w:t>
+      </w:r>
+      <w:r>
+        <w:rPr>
+          <w:sz w:val="26"/>
+          <w:szCs w:val="26"/>
+        </w:rPr>
+        <w:t>ệ</w:t>
+      </w:r>
+      <w:r>
+        <w:rPr>
+          <w:sz w:val="26"/>
+          <w:szCs w:val="26"/>
+        </w:rPr>
+        <w:t>p zip mã ngu</w:t>
+      </w:r>
+      <w:r>
+        <w:rPr>
+          <w:sz w:val="26"/>
+          <w:szCs w:val="26"/>
+        </w:rPr>
+        <w:t>ồ</w:t>
+      </w:r>
+      <w:r>
+        <w:rPr>
+          <w:sz w:val="26"/>
+          <w:szCs w:val="26"/>
+        </w:rPr>
+        <w:t>n c</w:t>
+      </w:r>
+      <w:r>
+        <w:rPr>
+          <w:sz w:val="26"/>
+          <w:szCs w:val="26"/>
+        </w:rPr>
+        <w:t>ủ</w:t>
+      </w:r>
+      <w:r>
+        <w:rPr>
+          <w:sz w:val="26"/>
+          <w:szCs w:val="26"/>
+        </w:rPr>
+        <w:t>a đ</w:t>
+      </w:r>
+      <w:r>
+        <w:rPr>
+          <w:sz w:val="26"/>
+          <w:szCs w:val="26"/>
+        </w:rPr>
+        <w:t>ồ</w:t>
+      </w:r>
+      <w:r>
+        <w:rPr>
+          <w:sz w:val="26"/>
+          <w:szCs w:val="26"/>
+        </w:rPr>
+        <w:t xml:space="preserve"> án. Các l</w:t>
+      </w:r>
+      <w:r>
+        <w:rPr>
+          <w:sz w:val="26"/>
+          <w:szCs w:val="26"/>
+        </w:rPr>
+        <w:t>ệ</w:t>
+      </w:r>
+      <w:r>
+        <w:rPr>
+          <w:sz w:val="26"/>
+          <w:szCs w:val="26"/>
+        </w:rPr>
+        <w:t>nh bên dư</w:t>
+      </w:r>
+      <w:r>
+        <w:rPr>
+          <w:sz w:val="26"/>
+          <w:szCs w:val="26"/>
+        </w:rPr>
+        <w:t>ớ</w:t>
+      </w:r>
+      <w:r>
+        <w:rPr>
+          <w:sz w:val="26"/>
+          <w:szCs w:val="26"/>
+        </w:rPr>
+        <w:t>i đ</w:t>
+      </w:r>
+      <w:r>
+        <w:rPr>
+          <w:sz w:val="26"/>
+          <w:szCs w:val="26"/>
+        </w:rPr>
+        <w:t>ề</w:t>
+      </w:r>
+      <w:r>
+        <w:rPr>
+          <w:sz w:val="26"/>
+          <w:szCs w:val="26"/>
+        </w:rPr>
+        <w:t>u ch</w:t>
+      </w:r>
+      <w:r>
+        <w:rPr>
+          <w:sz w:val="26"/>
+          <w:szCs w:val="26"/>
+        </w:rPr>
+        <w:t>ạ</w:t>
+      </w:r>
+      <w:r>
+        <w:rPr>
+          <w:sz w:val="26"/>
+          <w:szCs w:val="26"/>
+        </w:rPr>
+        <w:t>y trong thư m</w:t>
+      </w:r>
+      <w:r>
+        <w:rPr>
+          <w:sz w:val="26"/>
+          <w:szCs w:val="26"/>
+        </w:rPr>
+        <w:t>ụ</w:t>
+      </w:r>
+      <w:r>
+        <w:rPr>
+          <w:sz w:val="26"/>
+          <w:szCs w:val="26"/>
+        </w:rPr>
+        <w:t>c g</w:t>
+      </w:r>
+      <w:r>
+        <w:rPr>
+          <w:sz w:val="26"/>
+          <w:szCs w:val="26"/>
+        </w:rPr>
+        <w:t>ố</w:t>
+      </w:r>
+      <w:r>
+        <w:rPr>
+          <w:sz w:val="26"/>
+          <w:szCs w:val="26"/>
+        </w:rPr>
+        <w:t>c c</w:t>
+      </w:r>
+      <w:r>
+        <w:rPr>
+          <w:sz w:val="26"/>
+          <w:szCs w:val="26"/>
+        </w:rPr>
+        <w:t>ủ</w:t>
+      </w:r>
+      <w:r>
+        <w:rPr>
+          <w:sz w:val="26"/>
+          <w:szCs w:val="26"/>
+        </w:rPr>
+        <w:t>a mã ngu</w:t>
+      </w:r>
+      <w:r>
+        <w:rPr>
+          <w:sz w:val="26"/>
+          <w:szCs w:val="26"/>
+        </w:rPr>
+        <w:t>ồ</w:t>
+      </w:r>
+      <w:r>
+        <w:rPr>
+          <w:sz w:val="26"/>
+          <w:szCs w:val="26"/>
+        </w:rPr>
+        <w:t>n (thư m</w:t>
+      </w:r>
+      <w:r>
+        <w:rPr>
+          <w:sz w:val="26"/>
+          <w:szCs w:val="26"/>
+        </w:rPr>
+        <w:t>ụ</w:t>
+      </w:r>
+      <w:r>
+        <w:rPr>
+          <w:sz w:val="26"/>
+          <w:szCs w:val="26"/>
+        </w:rPr>
+        <w:t>c ch</w:t>
+      </w:r>
+      <w:r>
+        <w:rPr>
+          <w:sz w:val="26"/>
+          <w:szCs w:val="26"/>
+        </w:rPr>
+        <w:t>ứ</w:t>
+      </w:r>
+      <w:r>
+        <w:rPr>
+          <w:sz w:val="26"/>
+          <w:szCs w:val="26"/>
+        </w:rPr>
+        <w:t>a TVUStartup.sln).</w:t>
+      </w:r>
+    </w:p>
+    <w:p>
+      <w:pPr>
+        <w:pStyle w:val="Heading3"/>
+        <w:rPr>
+          <w:rFonts w:eastAsia="Times New Roman"/>
+        </w:rPr>
+      </w:pPr>
+      <w:r>
+        <w:rPr>
+          <w:rFonts w:eastAsia="Times New Roman"/>
+        </w:rPr>
+        <w:lastRenderedPageBreak/>
+        <w:t>1.3. Tạo cơ sở dữ liệu</w:t>
+      </w:r>
+    </w:p>
+    <w:p>
+      <w:pPr>
+        <w:pStyle w:val="NormalWeb"/>
+        <w:rPr>
+          <w:sz w:val="26"/>
+          <w:szCs w:val="26"/>
+        </w:rPr>
+      </w:pPr>
+      <w:r>
+        <w:rPr>
+          <w:b/>
+          <w:bCs/>
+          <w:sz w:val="26"/>
+          <w:szCs w:val="26"/>
+        </w:rPr>
+        <w:t>Bư</w:t>
+      </w:r>
+      <w:r>
+        <w:rPr>
+          <w:b/>
+          <w:bCs/>
+          <w:sz w:val="26"/>
+          <w:szCs w:val="26"/>
+        </w:rPr>
+        <w:t>ớ</w:t>
+      </w:r>
+      <w:r>
+        <w:rPr>
+          <w:b/>
+          <w:bCs/>
+          <w:sz w:val="26"/>
+          <w:szCs w:val="26"/>
+        </w:rPr>
+        <w:t>c 1 – Ki</w:t>
+      </w:r>
+      <w:r>
+        <w:rPr>
+          <w:b/>
+          <w:bCs/>
+          <w:sz w:val="26"/>
+          <w:szCs w:val="26"/>
+        </w:rPr>
+        <w:t>ể</w:t>
+      </w:r>
+      <w:r>
+        <w:rPr>
+          <w:b/>
+          <w:bCs/>
+          <w:sz w:val="26"/>
+          <w:szCs w:val="26"/>
+        </w:rPr>
+        <w:t>m tra chu</w:t>
+      </w:r>
+      <w:r>
+        <w:rPr>
+          <w:b/>
+          <w:bCs/>
+          <w:sz w:val="26"/>
+          <w:szCs w:val="26"/>
+        </w:rPr>
+        <w:t>ỗ</w:t>
+      </w:r>
+      <w:r>
+        <w:rPr>
+          <w:b/>
+          <w:bCs/>
+          <w:sz w:val="26"/>
+          <w:szCs w:val="26"/>
+        </w:rPr>
+        <w:t>i k</w:t>
+      </w:r>
+      <w:r>
+        <w:rPr>
+          <w:b/>
+          <w:bCs/>
+          <w:sz w:val="26"/>
+          <w:szCs w:val="26"/>
+        </w:rPr>
+        <w:t>ế</w:t>
+      </w:r>
+      <w:r>
+        <w:rPr>
+          <w:b/>
+          <w:bCs/>
+          <w:sz w:val="26"/>
+          <w:szCs w:val="26"/>
+        </w:rPr>
+        <w:t>t n</w:t>
+      </w:r>
+      <w:r>
+        <w:rPr>
+          <w:b/>
+          <w:bCs/>
+          <w:sz w:val="26"/>
+          <w:szCs w:val="26"/>
+        </w:rPr>
+        <w:t>ố</w:t>
+      </w:r>
+      <w:r>
+        <w:rPr>
+          <w:b/>
+          <w:bCs/>
+          <w:sz w:val="26"/>
+          <w:szCs w:val="26"/>
+        </w:rPr>
+        <w:t>i.</w:t>
+      </w:r>
+      <w:r>
+        <w:rPr>
+          <w:sz w:val="26"/>
+          <w:szCs w:val="26"/>
+        </w:rPr>
+        <w:t xml:space="preserve"> M</w:t>
+      </w:r>
+      <w:r>
+        <w:rPr>
+          <w:sz w:val="26"/>
+          <w:szCs w:val="26"/>
+        </w:rPr>
+        <w:t>ở</w:t>
+      </w:r>
+      <w:r>
+        <w:rPr>
+          <w:sz w:val="26"/>
+          <w:szCs w:val="26"/>
+        </w:rPr>
+        <w:t xml:space="preserve"> </w:t>
+      </w:r>
+      <w:r>
+        <w:rPr>
+          <w:rStyle w:val="HTMLCode"/>
+        </w:rPr>
+        <w:t>TVUStartup.Web/appsettings.json</w:t>
+      </w:r>
+      <w:r>
+        <w:rPr>
+          <w:sz w:val="26"/>
+          <w:szCs w:val="26"/>
+        </w:rPr>
+        <w:t xml:space="preserve">, dòng </w:t>
+      </w:r>
+      <w:r>
+        <w:rPr>
+          <w:rStyle w:val="HTMLCode"/>
+        </w:rPr>
+        <w:t>DefaultConnection</w:t>
+      </w:r>
+      <w:r>
+        <w:rPr>
+          <w:sz w:val="26"/>
+          <w:szCs w:val="26"/>
+        </w:rPr>
+        <w:t xml:space="preserve"> đang tr</w:t>
+      </w:r>
+      <w:r>
+        <w:rPr>
+          <w:sz w:val="26"/>
+          <w:szCs w:val="26"/>
+        </w:rPr>
+        <w:t>ỏ</w:t>
+      </w:r>
+      <w:r>
+        <w:rPr>
+          <w:sz w:val="26"/>
+          <w:szCs w:val="26"/>
+        </w:rPr>
+        <w:t xml:space="preserve"> t</w:t>
+      </w:r>
+      <w:r>
+        <w:rPr>
+          <w:sz w:val="26"/>
+          <w:szCs w:val="26"/>
+        </w:rPr>
+        <w:t>ớ</w:t>
+      </w:r>
+      <w:r>
+        <w:rPr>
+          <w:sz w:val="26"/>
+          <w:szCs w:val="26"/>
+        </w:rPr>
+        <w:t xml:space="preserve">i </w:t>
+      </w:r>
+      <w:r>
+        <w:rPr>
+          <w:rStyle w:val="HTMLCode"/>
+        </w:rPr>
+        <w:t>Server=.\SQLEXPRESS;Database=TVUStartupDB;Trusted_Connection=True;...</w:t>
+      </w:r>
+      <w:r>
+        <w:rPr>
+          <w:sz w:val="26"/>
+          <w:szCs w:val="26"/>
+        </w:rPr>
+        <w:t>. N</w:t>
+      </w:r>
+      <w:r>
+        <w:rPr>
+          <w:sz w:val="26"/>
+          <w:szCs w:val="26"/>
+        </w:rPr>
+        <w:t>ế</w:t>
+      </w:r>
+      <w:r>
+        <w:rPr>
+          <w:sz w:val="26"/>
+          <w:szCs w:val="26"/>
+        </w:rPr>
+        <w:t>u máy cài SQL Server v</w:t>
+      </w:r>
+      <w:r>
+        <w:rPr>
+          <w:sz w:val="26"/>
+          <w:szCs w:val="26"/>
+        </w:rPr>
+        <w:t>ớ</w:t>
+      </w:r>
+      <w:r>
+        <w:rPr>
+          <w:sz w:val="26"/>
+          <w:szCs w:val="26"/>
+        </w:rPr>
+        <w:t>i tên instance khác thì s</w:t>
+      </w:r>
+      <w:r>
+        <w:rPr>
+          <w:sz w:val="26"/>
+          <w:szCs w:val="26"/>
+        </w:rPr>
+        <w:t>ử</w:t>
+      </w:r>
+      <w:r>
+        <w:rPr>
+          <w:sz w:val="26"/>
+          <w:szCs w:val="26"/>
+        </w:rPr>
+        <w:t>a ph</w:t>
+      </w:r>
+      <w:r>
+        <w:rPr>
+          <w:sz w:val="26"/>
+          <w:szCs w:val="26"/>
+        </w:rPr>
+        <w:t>ầ</w:t>
+      </w:r>
+      <w:r>
+        <w:rPr>
+          <w:sz w:val="26"/>
+          <w:szCs w:val="26"/>
+        </w:rPr>
+        <w:t>n Server cho đúng (ví d</w:t>
+      </w:r>
+      <w:r>
+        <w:rPr>
+          <w:sz w:val="26"/>
+          <w:szCs w:val="26"/>
+        </w:rPr>
+        <w:t>ụ</w:t>
+      </w:r>
+      <w:r>
+        <w:rPr>
+          <w:sz w:val="26"/>
+          <w:szCs w:val="26"/>
+        </w:rPr>
+        <w:t xml:space="preserve"> b</w:t>
+      </w:r>
+      <w:r>
+        <w:rPr>
+          <w:sz w:val="26"/>
+          <w:szCs w:val="26"/>
+        </w:rPr>
+        <w:t>ả</w:t>
+      </w:r>
+      <w:r>
+        <w:rPr>
+          <w:sz w:val="26"/>
+          <w:szCs w:val="26"/>
+        </w:rPr>
+        <w:t xml:space="preserve">n Developer dùng </w:t>
+      </w:r>
+      <w:r>
+        <w:rPr>
+          <w:rStyle w:val="HTMLCode"/>
+        </w:rPr>
+        <w:t>Server=.</w:t>
+      </w:r>
+      <w:r>
+        <w:rPr>
+          <w:sz w:val="26"/>
+          <w:szCs w:val="26"/>
+        </w:rPr>
+        <w:t xml:space="preserve">, LocalDB dùng </w:t>
+      </w:r>
+      <w:r>
+        <w:rPr>
+          <w:rStyle w:val="HTMLCode"/>
+        </w:rPr>
+        <w:t>Server=(localdb)\MSSQLLocalDB</w:t>
+      </w:r>
+      <w:r>
+        <w:rPr>
+          <w:sz w:val="26"/>
+          <w:szCs w:val="26"/>
+        </w:rPr>
+        <w:t>).</w:t>
+      </w:r>
+    </w:p>
+    <w:p>
+      <w:pPr>
+        <w:pStyle w:val="NormalWeb"/>
+        <w:rPr>
+          <w:sz w:val="26"/>
+          <w:szCs w:val="26"/>
+        </w:rPr>
+      </w:pPr>
+      <w:r>
+        <w:rPr>
+          <w:b/>
+          <w:bCs/>
+          <w:sz w:val="26"/>
+          <w:szCs w:val="26"/>
+        </w:rPr>
+        <w:t>Bư</w:t>
+      </w:r>
+      <w:r>
+        <w:rPr>
+          <w:b/>
+          <w:bCs/>
+          <w:sz w:val="26"/>
+          <w:szCs w:val="26"/>
+        </w:rPr>
+        <w:t>ớ</w:t>
+      </w:r>
+      <w:r>
+        <w:rPr>
+          <w:b/>
+          <w:bCs/>
+          <w:sz w:val="26"/>
+          <w:szCs w:val="26"/>
+        </w:rPr>
+        <w:t>c 2 – T</w:t>
+      </w:r>
+      <w:r>
+        <w:rPr>
+          <w:b/>
+          <w:bCs/>
+          <w:sz w:val="26"/>
+          <w:szCs w:val="26"/>
+        </w:rPr>
+        <w:t>ạ</w:t>
+      </w:r>
+      <w:r>
+        <w:rPr>
+          <w:b/>
+          <w:bCs/>
+          <w:sz w:val="26"/>
+          <w:szCs w:val="26"/>
+        </w:rPr>
+        <w:t>o cơ s</w:t>
+      </w:r>
+      <w:r>
+        <w:rPr>
+          <w:b/>
+          <w:bCs/>
+          <w:sz w:val="26"/>
+          <w:szCs w:val="26"/>
+        </w:rPr>
+        <w:t>ở</w:t>
+      </w:r>
+      <w:r>
+        <w:rPr>
+          <w:b/>
+          <w:bCs/>
+          <w:sz w:val="26"/>
+          <w:szCs w:val="26"/>
+        </w:rPr>
+        <w:t xml:space="preserve"> d</w:t>
+      </w:r>
+      <w:r>
+        <w:rPr>
+          <w:b/>
+          <w:bCs/>
+          <w:sz w:val="26"/>
+          <w:szCs w:val="26"/>
+        </w:rPr>
+        <w:t>ữ</w:t>
+      </w:r>
+      <w:r>
+        <w:rPr>
+          <w:b/>
+          <w:bCs/>
+          <w:sz w:val="26"/>
+          <w:szCs w:val="26"/>
+        </w:rPr>
+        <w:t xml:space="preserve"> li</w:t>
+      </w:r>
+      <w:r>
+        <w:rPr>
+          <w:b/>
+          <w:bCs/>
+          <w:sz w:val="26"/>
+          <w:szCs w:val="26"/>
+        </w:rPr>
+        <w:t>ệ</w:t>
+      </w:r>
+      <w:r>
+        <w:rPr>
+          <w:b/>
+          <w:bCs/>
+          <w:sz w:val="26"/>
+          <w:szCs w:val="26"/>
+        </w:rPr>
+        <w:t>u (ch</w:t>
+      </w:r>
+      <w:r>
+        <w:rPr>
+          <w:b/>
+          <w:bCs/>
+          <w:sz w:val="26"/>
+          <w:szCs w:val="26"/>
+        </w:rPr>
+        <w:t>ọ</w:t>
+      </w:r>
+      <w:r>
+        <w:rPr>
+          <w:b/>
+          <w:bCs/>
+          <w:sz w:val="26"/>
+          <w:szCs w:val="26"/>
+        </w:rPr>
+        <w:t>n 1 trong 2 cách).</w:t>
       </w:r>
     </w:p>
     <w:p>
@@ -721,10 +2516,20 @@
       <w:r>
         <w:rPr>
           <w:rFonts w:eastAsia="Times New Roman"/>
-          <w:sz w:val="26"/>
-          <w:szCs w:val="26"/>
-        </w:rPr>
-        <w:t>Chạy tệp docs/demo/dat_lai_du_lieu.ps1 (chuột phải → Run with PowerShell). Tệp này dừng website, xóa CSDL, xóa ảnh đã tải lên khi chạy thử rồi chạy lại website tại http://localhost:5080 với dữ liệu mẫu sạch.</w:t>
+          <w:b/>
+          <w:bCs/>
+          <w:sz w:val="26"/>
+          <w:szCs w:val="26"/>
+        </w:rPr>
+        <w:t>Cách 1 (đơn giản nhất):</w:t>
+      </w:r>
+      <w:r>
+        <w:rPr>
+          <w:rFonts w:eastAsia="Times New Roman"/>
+          <w:sz w:val="26"/>
+          <w:szCs w:val="26"/>
+        </w:rPr>
+        <w:t xml:space="preserve"> không cần làm gì thêm. Lần đầu chạy website (mục 1.4), chương trình tự tạo cơ sở dữ liệu TVUStartupDB bằng migration của Entity Framework Core và nạp dữ liệu mẫu.</w:t>
       </w:r>
     </w:p>
     <w:p>
@@ -744,17 +2549,745 @@
       <w:r>
         <w:rPr>
           <w:rFonts w:eastAsia="Times New Roman"/>
-          <w:sz w:val="26"/>
-          <w:szCs w:val="26"/>
-        </w:rPr>
-        <w:t>Giữ nguyên cửa sổ PowerShell đó trong suốt lúc quay (đóng là website dừng).</w:t>
+          <w:b/>
+          <w:bCs/>
+          <w:sz w:val="26"/>
+          <w:szCs w:val="26"/>
+        </w:rPr>
+        <w:t>Cách 2 – tạo trước bằng lệnh EF Core:</w:t>
+      </w:r>
+    </w:p>
+    <w:p>
+      <w:pPr>
+        <w:pStyle w:val="code"/>
+      </w:pPr>
+      <w:r>
+        <w:t>cd TVUStartup.Web</w:t>
+      </w:r>
+      <w:r>
+        <w:br/>
+        <w:t>dotnet tool restore</w:t>
+      </w:r>
+      <w:r>
+        <w:br/>
+        <w:t>dotnet ef database update</w:t>
+      </w:r>
+      <w:r>
+        <w:br/>
+        <w:t>cd ..</w:t>
+      </w:r>
+    </w:p>
+    <w:p>
+      <w:pPr>
+        <w:pStyle w:val="NormalWeb"/>
+        <w:rPr>
+          <w:sz w:val="26"/>
+          <w:szCs w:val="26"/>
+        </w:rPr>
+      </w:pPr>
+      <w:r>
+        <w:rPr>
+          <w:sz w:val="26"/>
+          <w:szCs w:val="26"/>
+        </w:rPr>
+        <w:t>L</w:t>
+      </w:r>
+      <w:r>
+        <w:rPr>
+          <w:sz w:val="26"/>
+          <w:szCs w:val="26"/>
+        </w:rPr>
+        <w:t>ệ</w:t>
+      </w:r>
+      <w:r>
+        <w:rPr>
+          <w:sz w:val="26"/>
+          <w:szCs w:val="26"/>
+        </w:rPr>
+        <w:t xml:space="preserve">nh </w:t>
+      </w:r>
+      <w:r>
+        <w:rPr>
+          <w:rStyle w:val="HTMLCode"/>
+        </w:rPr>
+        <w:t>dotnet tool restore</w:t>
+      </w:r>
+      <w:r>
+        <w:rPr>
+          <w:sz w:val="26"/>
+          <w:szCs w:val="26"/>
+        </w:rPr>
+        <w:t xml:space="preserve"> cài công c</w:t>
+      </w:r>
+      <w:r>
+        <w:rPr>
+          <w:sz w:val="26"/>
+          <w:szCs w:val="26"/>
+        </w:rPr>
+        <w:t>ụ</w:t>
+      </w:r>
+      <w:r>
+        <w:rPr>
+          <w:sz w:val="26"/>
+          <w:szCs w:val="26"/>
+        </w:rPr>
+        <w:t xml:space="preserve"> dotnet-ef (phiên b</w:t>
+      </w:r>
+      <w:r>
+        <w:rPr>
+          <w:sz w:val="26"/>
+          <w:szCs w:val="26"/>
+        </w:rPr>
+        <w:t>ả</w:t>
+      </w:r>
+      <w:r>
+        <w:rPr>
+          <w:sz w:val="26"/>
+          <w:szCs w:val="26"/>
+        </w:rPr>
+        <w:t>n 8.0.10) theo t</w:t>
+      </w:r>
+      <w:r>
+        <w:rPr>
+          <w:sz w:val="26"/>
+          <w:szCs w:val="26"/>
+        </w:rPr>
+        <w:t>ệ</w:t>
+      </w:r>
+      <w:r>
+        <w:rPr>
+          <w:sz w:val="26"/>
+          <w:szCs w:val="26"/>
+        </w:rPr>
+        <w:t>p .config/dotnet-tools.json; l</w:t>
+      </w:r>
+      <w:r>
+        <w:rPr>
+          <w:sz w:val="26"/>
+          <w:szCs w:val="26"/>
+        </w:rPr>
+        <w:t>ệ</w:t>
+      </w:r>
+      <w:r>
+        <w:rPr>
+          <w:sz w:val="26"/>
+          <w:szCs w:val="26"/>
+        </w:rPr>
+        <w:t xml:space="preserve">nh </w:t>
+      </w:r>
+      <w:r>
+        <w:rPr>
+          <w:rStyle w:val="HTMLCode"/>
+        </w:rPr>
+        <w:t>dotnet ef database update</w:t>
+      </w:r>
+      <w:r>
+        <w:rPr>
+          <w:sz w:val="26"/>
+          <w:szCs w:val="26"/>
+        </w:rPr>
+        <w:t xml:space="preserve"> </w:t>
+      </w:r>
+      <w:r>
+        <w:rPr>
+          <w:sz w:val="26"/>
+          <w:szCs w:val="26"/>
+        </w:rPr>
+        <w:t>t</w:t>
+      </w:r>
+      <w:r>
+        <w:rPr>
+          <w:sz w:val="26"/>
+          <w:szCs w:val="26"/>
+        </w:rPr>
+        <w:t>ạ</w:t>
+      </w:r>
+      <w:r>
+        <w:rPr>
+          <w:sz w:val="26"/>
+          <w:szCs w:val="26"/>
+        </w:rPr>
+        <w:t>o cơ s</w:t>
+      </w:r>
+      <w:r>
+        <w:rPr>
+          <w:sz w:val="26"/>
+          <w:szCs w:val="26"/>
+        </w:rPr>
+        <w:t>ở</w:t>
+      </w:r>
+      <w:r>
+        <w:rPr>
+          <w:sz w:val="26"/>
+          <w:szCs w:val="26"/>
+        </w:rPr>
+        <w:t xml:space="preserve"> d</w:t>
+      </w:r>
+      <w:r>
+        <w:rPr>
+          <w:sz w:val="26"/>
+          <w:szCs w:val="26"/>
+        </w:rPr>
+        <w:t>ữ</w:t>
+      </w:r>
+      <w:r>
+        <w:rPr>
+          <w:sz w:val="26"/>
+          <w:szCs w:val="26"/>
+        </w:rPr>
+        <w:t xml:space="preserve"> li</w:t>
+      </w:r>
+      <w:r>
+        <w:rPr>
+          <w:sz w:val="26"/>
+          <w:szCs w:val="26"/>
+        </w:rPr>
+        <w:t>ệ</w:t>
+      </w:r>
+      <w:r>
+        <w:rPr>
+          <w:sz w:val="26"/>
+          <w:szCs w:val="26"/>
+        </w:rPr>
+        <w:t>u và 14 b</w:t>
+      </w:r>
+      <w:r>
+        <w:rPr>
+          <w:sz w:val="26"/>
+          <w:szCs w:val="26"/>
+        </w:rPr>
+        <w:t>ả</w:t>
+      </w:r>
+      <w:r>
+        <w:rPr>
+          <w:sz w:val="26"/>
+          <w:szCs w:val="26"/>
+        </w:rPr>
+        <w:t>ng. D</w:t>
+      </w:r>
+      <w:r>
+        <w:rPr>
+          <w:sz w:val="26"/>
+          <w:szCs w:val="26"/>
+        </w:rPr>
+        <w:t>ữ</w:t>
+      </w:r>
+      <w:r>
+        <w:rPr>
+          <w:sz w:val="26"/>
+          <w:szCs w:val="26"/>
+        </w:rPr>
+        <w:t xml:space="preserve"> li</w:t>
+      </w:r>
+      <w:r>
+        <w:rPr>
+          <w:sz w:val="26"/>
+          <w:szCs w:val="26"/>
+        </w:rPr>
+        <w:t>ệ</w:t>
+      </w:r>
+      <w:r>
+        <w:rPr>
+          <w:sz w:val="26"/>
+          <w:szCs w:val="26"/>
+        </w:rPr>
+        <w:t>u m</w:t>
+      </w:r>
+      <w:r>
+        <w:rPr>
+          <w:sz w:val="26"/>
+          <w:szCs w:val="26"/>
+        </w:rPr>
+        <w:t>ẫ</w:t>
+      </w:r>
+      <w:r>
+        <w:rPr>
+          <w:sz w:val="26"/>
+          <w:szCs w:val="26"/>
+        </w:rPr>
+        <w:t>u đư</w:t>
+      </w:r>
+      <w:r>
+        <w:rPr>
+          <w:sz w:val="26"/>
+          <w:szCs w:val="26"/>
+        </w:rPr>
+        <w:t>ợ</w:t>
+      </w:r>
+      <w:r>
+        <w:rPr>
+          <w:sz w:val="26"/>
+          <w:szCs w:val="26"/>
+        </w:rPr>
+        <w:t>c n</w:t>
+      </w:r>
+      <w:r>
+        <w:rPr>
+          <w:sz w:val="26"/>
+          <w:szCs w:val="26"/>
+        </w:rPr>
+        <w:t>ạ</w:t>
+      </w:r>
+      <w:r>
+        <w:rPr>
+          <w:sz w:val="26"/>
+          <w:szCs w:val="26"/>
+        </w:rPr>
+        <w:t xml:space="preserve">p </w:t>
+      </w:r>
+      <w:r>
+        <w:rPr>
+          <w:sz w:val="26"/>
+          <w:szCs w:val="26"/>
+        </w:rPr>
+        <w:t>ở</w:t>
+      </w:r>
+      <w:r>
+        <w:rPr>
+          <w:sz w:val="26"/>
+          <w:szCs w:val="26"/>
+        </w:rPr>
+        <w:t xml:space="preserve"> l</w:t>
+      </w:r>
+      <w:r>
+        <w:rPr>
+          <w:sz w:val="26"/>
+          <w:szCs w:val="26"/>
+        </w:rPr>
+        <w:t>ầ</w:t>
+      </w:r>
+      <w:r>
+        <w:rPr>
+          <w:sz w:val="26"/>
+          <w:szCs w:val="26"/>
+        </w:rPr>
+        <w:t>n ch</w:t>
+      </w:r>
+      <w:r>
+        <w:rPr>
+          <w:sz w:val="26"/>
+          <w:szCs w:val="26"/>
+        </w:rPr>
+        <w:t>ạ</w:t>
+      </w:r>
+      <w:r>
+        <w:rPr>
+          <w:sz w:val="26"/>
+          <w:szCs w:val="26"/>
+        </w:rPr>
+        <w:t>y website đ</w:t>
+      </w:r>
+      <w:r>
+        <w:rPr>
+          <w:sz w:val="26"/>
+          <w:szCs w:val="26"/>
+        </w:rPr>
+        <w:t>ầ</w:t>
+      </w:r>
+      <w:r>
+        <w:rPr>
+          <w:sz w:val="26"/>
+          <w:szCs w:val="26"/>
+        </w:rPr>
+        <w:t>u tiên.</w:t>
+      </w:r>
+    </w:p>
+    <w:p>
+      <w:pPr>
+        <w:pStyle w:val="NormalWeb"/>
+        <w:rPr>
+          <w:sz w:val="26"/>
+          <w:szCs w:val="26"/>
+        </w:rPr>
+      </w:pPr>
+      <w:r>
+        <w:rPr>
+          <w:b/>
+          <w:bCs/>
+          <w:sz w:val="26"/>
+          <w:szCs w:val="26"/>
+        </w:rPr>
+        <w:t>Bư</w:t>
+      </w:r>
+      <w:r>
+        <w:rPr>
+          <w:b/>
+          <w:bCs/>
+          <w:sz w:val="26"/>
+          <w:szCs w:val="26"/>
+        </w:rPr>
+        <w:t>ớ</w:t>
+      </w:r>
+      <w:r>
+        <w:rPr>
+          <w:b/>
+          <w:bCs/>
+          <w:sz w:val="26"/>
+          <w:szCs w:val="26"/>
+        </w:rPr>
+        <w:t>c 3 – Ki</w:t>
+      </w:r>
+      <w:r>
+        <w:rPr>
+          <w:b/>
+          <w:bCs/>
+          <w:sz w:val="26"/>
+          <w:szCs w:val="26"/>
+        </w:rPr>
+        <w:t>ể</w:t>
+      </w:r>
+      <w:r>
+        <w:rPr>
+          <w:b/>
+          <w:bCs/>
+          <w:sz w:val="26"/>
+          <w:szCs w:val="26"/>
+        </w:rPr>
+        <w:t>m tra trong SSMS</w:t>
+      </w:r>
+      <w:r>
+        <w:rPr>
+          <w:sz w:val="26"/>
+          <w:szCs w:val="26"/>
+        </w:rPr>
+        <w:t xml:space="preserve"> (sau khi đã ch</w:t>
+      </w:r>
+      <w:r>
+        <w:rPr>
+          <w:sz w:val="26"/>
+          <w:szCs w:val="26"/>
+        </w:rPr>
+        <w:t>ạ</w:t>
+      </w:r>
+      <w:r>
+        <w:rPr>
+          <w:sz w:val="26"/>
+          <w:szCs w:val="26"/>
+        </w:rPr>
+        <w:t>y website ít nh</w:t>
+      </w:r>
+      <w:r>
+        <w:rPr>
+          <w:sz w:val="26"/>
+          <w:szCs w:val="26"/>
+        </w:rPr>
+        <w:t>ấ</w:t>
+      </w:r>
+      <w:r>
+        <w:rPr>
+          <w:sz w:val="26"/>
+          <w:szCs w:val="26"/>
+        </w:rPr>
+        <w:t>t m</w:t>
+      </w:r>
+      <w:r>
+        <w:rPr>
+          <w:sz w:val="26"/>
+          <w:szCs w:val="26"/>
+        </w:rPr>
+        <w:t>ộ</w:t>
+      </w:r>
+      <w:r>
+        <w:rPr>
+          <w:sz w:val="26"/>
+          <w:szCs w:val="26"/>
+        </w:rPr>
+        <w:t>t l</w:t>
+      </w:r>
+      <w:r>
+        <w:rPr>
+          <w:sz w:val="26"/>
+          <w:szCs w:val="26"/>
+        </w:rPr>
+        <w:t>ầ</w:t>
+      </w:r>
+      <w:r>
+        <w:rPr>
+          <w:sz w:val="26"/>
+          <w:szCs w:val="26"/>
+        </w:rPr>
+        <w:t>n): k</w:t>
+      </w:r>
+      <w:r>
+        <w:rPr>
+          <w:sz w:val="26"/>
+          <w:szCs w:val="26"/>
+        </w:rPr>
+        <w:t>ế</w:t>
+      </w:r>
+      <w:r>
+        <w:rPr>
+          <w:sz w:val="26"/>
+          <w:szCs w:val="26"/>
+        </w:rPr>
+        <w:t>t n</w:t>
+      </w:r>
+      <w:r>
+        <w:rPr>
+          <w:sz w:val="26"/>
+          <w:szCs w:val="26"/>
+        </w:rPr>
+        <w:t>ố</w:t>
+      </w:r>
+      <w:r>
+        <w:rPr>
+          <w:sz w:val="26"/>
+          <w:szCs w:val="26"/>
+        </w:rPr>
+        <w:t xml:space="preserve">i </w:t>
+      </w:r>
+      <w:r>
+        <w:rPr>
+          <w:rStyle w:val="HTMLCode"/>
+        </w:rPr>
+        <w:t>.\SQLEXPRESS</w:t>
+      </w:r>
+      <w:r>
+        <w:rPr>
+          <w:sz w:val="26"/>
+          <w:szCs w:val="26"/>
+        </w:rPr>
+        <w:t xml:space="preserve"> → Databases → TVUStartupDB → Tables có 14 b</w:t>
+      </w:r>
+      <w:r>
+        <w:rPr>
+          <w:sz w:val="26"/>
+          <w:szCs w:val="26"/>
+        </w:rPr>
+        <w:t>ả</w:t>
+      </w:r>
+      <w:r>
+        <w:rPr>
+          <w:sz w:val="26"/>
+          <w:szCs w:val="26"/>
+        </w:rPr>
+        <w:t>ng (Account, Banner, Category, Comment, ContactRequest, Faculty, News, Project, ProjectFeature, ProjectImage, ProjectVersion, Role, TeamMember, Vote) cùng b</w:t>
+      </w:r>
+      <w:r>
+        <w:rPr>
+          <w:sz w:val="26"/>
+          <w:szCs w:val="26"/>
+        </w:rPr>
+        <w:t>ả</w:t>
+      </w:r>
+      <w:r>
+        <w:rPr>
+          <w:sz w:val="26"/>
+          <w:szCs w:val="26"/>
+        </w:rPr>
+        <w:t>ng __EFMigrationsHistory. Ch</w:t>
+      </w:r>
+      <w:r>
+        <w:rPr>
+          <w:sz w:val="26"/>
+          <w:szCs w:val="26"/>
+        </w:rPr>
+        <w:t>ạ</w:t>
+      </w:r>
+      <w:r>
+        <w:rPr>
+          <w:sz w:val="26"/>
+          <w:szCs w:val="26"/>
+        </w:rPr>
+        <w:t>y th</w:t>
+      </w:r>
+      <w:r>
+        <w:rPr>
+          <w:sz w:val="26"/>
+          <w:szCs w:val="26"/>
+        </w:rPr>
+        <w:t>ử</w:t>
+      </w:r>
+      <w:r>
+        <w:rPr>
+          <w:sz w:val="26"/>
+          <w:szCs w:val="26"/>
+        </w:rPr>
+        <w:t xml:space="preserve"> truy v</w:t>
+      </w:r>
+      <w:r>
+        <w:rPr>
+          <w:sz w:val="26"/>
+          <w:szCs w:val="26"/>
+        </w:rPr>
+        <w:t>ấ</w:t>
+      </w:r>
+      <w:r>
+        <w:rPr>
+          <w:sz w:val="26"/>
+          <w:szCs w:val="26"/>
+        </w:rPr>
+        <w:t xml:space="preserve">n </w:t>
+      </w:r>
+      <w:r>
+        <w:rPr>
+          <w:rStyle w:val="HTMLCode"/>
+        </w:rPr>
+        <w:t>SELECT COUNT(*) FROM Project</w:t>
+      </w:r>
+      <w:r>
+        <w:rPr>
+          <w:sz w:val="26"/>
+          <w:szCs w:val="26"/>
+        </w:rPr>
+        <w:t xml:space="preserve"> → k</w:t>
+      </w:r>
+      <w:r>
+        <w:rPr>
+          <w:sz w:val="26"/>
+          <w:szCs w:val="26"/>
+        </w:rPr>
+        <w:t>ế</w:t>
+      </w:r>
+      <w:r>
+        <w:rPr>
+          <w:sz w:val="26"/>
+          <w:szCs w:val="26"/>
+        </w:rPr>
+        <w:t>t qu</w:t>
+      </w:r>
+      <w:r>
+        <w:rPr>
+          <w:sz w:val="26"/>
+          <w:szCs w:val="26"/>
+        </w:rPr>
+        <w:t>ả</w:t>
+      </w:r>
+      <w:r>
+        <w:rPr>
+          <w:sz w:val="26"/>
+          <w:szCs w:val="26"/>
+        </w:rPr>
+        <w:t xml:space="preserve"> 13 d</w:t>
+      </w:r>
+      <w:r>
+        <w:rPr>
+          <w:sz w:val="26"/>
+          <w:szCs w:val="26"/>
+        </w:rPr>
+        <w:t>ự</w:t>
+      </w:r>
+      <w:r>
+        <w:rPr>
+          <w:sz w:val="26"/>
+          <w:szCs w:val="26"/>
+        </w:rPr>
+        <w:t xml:space="preserve"> án m</w:t>
+      </w:r>
+      <w:r>
+        <w:rPr>
+          <w:sz w:val="26"/>
+          <w:szCs w:val="26"/>
+        </w:rPr>
+        <w:t>ẫ</w:t>
+      </w:r>
+      <w:r>
+        <w:rPr>
+          <w:sz w:val="26"/>
+          <w:szCs w:val="26"/>
+        </w:rPr>
+        <w:t>u.</w:t>
+      </w:r>
+    </w:p>
+    <w:p>
+      <w:pPr>
+        <w:pStyle w:val="Heading3"/>
+        <w:rPr>
+          <w:rFonts w:eastAsia="Times New Roman"/>
+        </w:rPr>
+      </w:pPr>
+      <w:r>
+        <w:rPr>
+          <w:rFonts w:eastAsia="Times New Roman"/>
+        </w:rPr>
+        <w:t>1.4. Chạy website lên localhost</w:t>
+      </w:r>
+    </w:p>
+    <w:p>
+      <w:pPr>
+        <w:pStyle w:val="NormalWeb"/>
+        <w:rPr>
+          <w:sz w:val="26"/>
+          <w:szCs w:val="26"/>
+        </w:rPr>
+      </w:pPr>
+      <w:r>
+        <w:rPr>
+          <w:sz w:val="26"/>
+          <w:szCs w:val="26"/>
+        </w:rPr>
+        <w:t>Trong PowerShell, t</w:t>
+      </w:r>
+      <w:r>
+        <w:rPr>
+          <w:sz w:val="26"/>
+          <w:szCs w:val="26"/>
+        </w:rPr>
+        <w:t>ạ</w:t>
+      </w:r>
+      <w:r>
+        <w:rPr>
+          <w:sz w:val="26"/>
+          <w:szCs w:val="26"/>
+        </w:rPr>
+        <w:t>i thư m</w:t>
+      </w:r>
+      <w:r>
+        <w:rPr>
+          <w:sz w:val="26"/>
+          <w:szCs w:val="26"/>
+        </w:rPr>
+        <w:t>ụ</w:t>
+      </w:r>
+      <w:r>
+        <w:rPr>
+          <w:sz w:val="26"/>
+          <w:szCs w:val="26"/>
+        </w:rPr>
+        <w:t>c g</w:t>
+      </w:r>
+      <w:r>
+        <w:rPr>
+          <w:sz w:val="26"/>
+          <w:szCs w:val="26"/>
+        </w:rPr>
+        <w:t>ố</w:t>
+      </w:r>
+      <w:r>
+        <w:rPr>
+          <w:sz w:val="26"/>
+          <w:szCs w:val="26"/>
+        </w:rPr>
+        <w:t>c mã ngu</w:t>
+      </w:r>
+      <w:r>
+        <w:rPr>
+          <w:sz w:val="26"/>
+          <w:szCs w:val="26"/>
+        </w:rPr>
+        <w:t>ồ</w:t>
+      </w:r>
+      <w:r>
+        <w:rPr>
+          <w:sz w:val="26"/>
+          <w:szCs w:val="26"/>
+        </w:rPr>
+        <w:t>n:</w:t>
+      </w:r>
+    </w:p>
+    <w:p>
+      <w:pPr>
+        <w:pStyle w:val="code"/>
+      </w:pPr>
+      <w:r>
+        <w:t>dotnet run --project TVUStartup.Web --urls http://localhost:5080</w:t>
       </w:r>
     </w:p>
     <w:p>
       <w:pPr>
         <w:numPr>
           <w:ilvl w:val="0"/>
-          <w:numId w:val="1"/>
+          <w:numId w:val="2"/>
         </w:numPr>
         <w:spacing w:before="100" w:beforeAutospacing="1" w:after="60" w:line="360" w:lineRule="auto"/>
         <w:jc w:val="both"/>
@@ -770,7 +3303,91 @@
           <w:sz w:val="26"/>
           <w:szCs w:val="26"/>
         </w:rPr>
-        <w:t>Nếu quay hỏng giữa chừng, chạy lại tệp này rồi quay lại từ đầu, vì dự án demo đã được tạo ở lần quay trước.</w:t>
+        <w:t xml:space="preserve">Lần đầu sẽ mất khoảng 30 giây – 1 phút để build và tạo cơ sở dữ liệu. Khi cửa sổ hiện dòng </w:t>
+      </w:r>
+      <w:r>
+        <w:rPr>
+          <w:rStyle w:val="HTMLCode"/>
+        </w:rPr>
+        <w:t>Now listening on: http://localhost:5080</w:t>
+      </w:r>
+      <w:r>
+        <w:rPr>
+          <w:rFonts w:eastAsia="Times New Roman"/>
+          <w:sz w:val="26"/>
+          <w:szCs w:val="26"/>
+        </w:rPr>
+        <w:t xml:space="preserve"> là website đã chạy.</w:t>
+      </w:r>
+    </w:p>
+    <w:p>
+      <w:pPr>
+        <w:numPr>
+          <w:ilvl w:val="0"/>
+          <w:numId w:val="2"/>
+        </w:numPr>
+        <w:spacing w:before="100" w:beforeAutospacing="1" w:after="60" w:line="360" w:lineRule="auto"/>
+        <w:jc w:val="both"/>
+        <w:rPr>
+          <w:rFonts w:eastAsia="Times New Roman"/>
+          <w:sz w:val="26"/>
+          <w:szCs w:val="26"/>
+        </w:rPr>
+      </w:pPr>
+      <w:r>
+        <w:rPr>
+          <w:rFonts w:eastAsia="Times New Roman"/>
+          <w:sz w:val="26"/>
+          <w:szCs w:val="26"/>
+        </w:rPr>
+        <w:lastRenderedPageBreak/>
+        <w:t>Mở trình duyệt, vào http://localhost:5080 → thấy trang chủ TVU Startup với banner và dự án nổi bật là thành công.</w:t>
+      </w:r>
+    </w:p>
+    <w:p>
+      <w:pPr>
+        <w:numPr>
+          <w:ilvl w:val="0"/>
+          <w:numId w:val="2"/>
+        </w:numPr>
+        <w:spacing w:before="100" w:beforeAutospacing="1" w:after="60" w:line="360" w:lineRule="auto"/>
+        <w:jc w:val="both"/>
+        <w:rPr>
+          <w:rFonts w:eastAsia="Times New Roman"/>
+          <w:sz w:val="26"/>
+          <w:szCs w:val="26"/>
+        </w:rPr>
+      </w:pPr>
+      <w:r>
+        <w:rPr>
+          <w:rFonts w:eastAsia="Times New Roman"/>
+          <w:sz w:val="26"/>
+          <w:szCs w:val="26"/>
+        </w:rPr>
+        <w:t>Giữ nguyên cửa sổ PowerShell trong suốt lúc quay; nhấn Ctrl+C trong cửa sổ đó để dừng website.</w:t>
+      </w:r>
+    </w:p>
+    <w:p>
+      <w:pPr>
+        <w:numPr>
+          <w:ilvl w:val="0"/>
+          <w:numId w:val="2"/>
+        </w:numPr>
+        <w:spacing w:before="100" w:beforeAutospacing="1" w:after="60" w:line="360" w:lineRule="auto"/>
+        <w:jc w:val="both"/>
+        <w:rPr>
+          <w:rFonts w:eastAsia="Times New Roman"/>
+          <w:sz w:val="26"/>
+          <w:szCs w:val="26"/>
+        </w:rPr>
+      </w:pPr>
+      <w:r>
+        <w:rPr>
+          <w:rFonts w:eastAsia="Times New Roman"/>
+          <w:sz w:val="26"/>
+          <w:szCs w:val="26"/>
+        </w:rPr>
+        <w:t>Có thể chạy bằng Visual Studio (mở TVUStartup.sln, nhấn F5) nhưng khi đó cổng sẽ khác 5080 (ví dụ http://localhost:5247). Nên dùng lệnh trên để địa chỉ khớp với kịch bản.</w:t>
       </w:r>
     </w:p>
     <w:p>
@@ -784,7 +3401,854 @@
         <w:rPr>
           <w:rFonts w:eastAsia="Times New Roman"/>
         </w:rPr>
-        <w:t>1.2. Tài khoản và dữ liệu nhập</w:t>
+        <w:t>1.5. Lỗi thường gặp</w:t>
+      </w:r>
+    </w:p>
+    <w:tbl>
+      <w:tblPr>
+        <w:tblW w:w="5000" w:type="pct"/>
+        <w:tblCellMar>
+          <w:top w:w="15" w:type="dxa"/>
+          <w:left w:w="15" w:type="dxa"/>
+          <w:bottom w:w="15" w:type="dxa"/>
+          <w:right w:w="15" w:type="dxa"/>
+        </w:tblCellMar>
+        <w:tblLook w:val="04A0" w:firstRow="1" w:lastRow="0" w:firstColumn="1" w:lastColumn="0" w:noHBand="0" w:noVBand="1"/>
+      </w:tblPr>
+      <w:tblGrid>
+        <w:gridCol w:w="3403"/>
+        <w:gridCol w:w="5653"/>
+      </w:tblGrid>
+      <w:tr>
+        <w:tc>
+          <w:tcPr>
+            <w:tcW w:w="0" w:type="auto"/>
+            <w:tcBorders>
+              <w:top w:val="single" w:sz="6" w:space="0" w:color="000000"/>
+              <w:left w:val="single" w:sz="6" w:space="0" w:color="000000"/>
+              <w:bottom w:val="single" w:sz="6" w:space="0" w:color="000000"/>
+              <w:right w:val="single" w:sz="6" w:space="0" w:color="000000"/>
+            </w:tcBorders>
+            <w:shd w:val="clear" w:color="auto" w:fill="D9E2F3"/>
+            <w:tcMar>
+              <w:top w:w="60" w:type="dxa"/>
+              <w:left w:w="100" w:type="dxa"/>
+              <w:bottom w:w="60" w:type="dxa"/>
+              <w:right w:w="100" w:type="dxa"/>
+            </w:tcMar>
+            <w:hideMark/>
+          </w:tcPr>
+          <w:p>
+            <w:pPr>
+              <w:spacing w:line="288" w:lineRule="auto"/>
+              <w:rPr>
+                <w:b/>
+                <w:bCs/>
+              </w:rPr>
+            </w:pPr>
+            <w:r>
+              <w:rPr>
+                <w:b/>
+                <w:bCs/>
+              </w:rPr>
+              <w:t>Hi</w:t>
+            </w:r>
+            <w:r>
+              <w:rPr>
+                <w:b/>
+                <w:bCs/>
+              </w:rPr>
+              <w:t>ệ</w:t>
+            </w:r>
+            <w:r>
+              <w:rPr>
+                <w:b/>
+                <w:bCs/>
+              </w:rPr>
+              <w:t>n tư</w:t>
+            </w:r>
+            <w:r>
+              <w:rPr>
+                <w:b/>
+                <w:bCs/>
+              </w:rPr>
+              <w:t>ợ</w:t>
+            </w:r>
+            <w:r>
+              <w:rPr>
+                <w:b/>
+                <w:bCs/>
+              </w:rPr>
+              <w:t>ng</w:t>
+            </w:r>
+          </w:p>
+        </w:tc>
+        <w:tc>
+          <w:tcPr>
+            <w:tcW w:w="0" w:type="auto"/>
+            <w:tcBorders>
+              <w:top w:val="single" w:sz="6" w:space="0" w:color="000000"/>
+              <w:left w:val="single" w:sz="6" w:space="0" w:color="000000"/>
+              <w:bottom w:val="single" w:sz="6" w:space="0" w:color="000000"/>
+              <w:right w:val="single" w:sz="6" w:space="0" w:color="000000"/>
+            </w:tcBorders>
+            <w:shd w:val="clear" w:color="auto" w:fill="D9E2F3"/>
+            <w:tcMar>
+              <w:top w:w="60" w:type="dxa"/>
+              <w:left w:w="100" w:type="dxa"/>
+              <w:bottom w:w="60" w:type="dxa"/>
+              <w:right w:w="100" w:type="dxa"/>
+            </w:tcMar>
+            <w:hideMark/>
+          </w:tcPr>
+          <w:p>
+            <w:pPr>
+              <w:spacing w:line="288" w:lineRule="auto"/>
+              <w:rPr>
+                <w:b/>
+                <w:bCs/>
+              </w:rPr>
+            </w:pPr>
+            <w:r>
+              <w:rPr>
+                <w:b/>
+                <w:bCs/>
+              </w:rPr>
+              <w:t>Nguyên nhân và cách x</w:t>
+            </w:r>
+            <w:r>
+              <w:rPr>
+                <w:b/>
+                <w:bCs/>
+              </w:rPr>
+              <w:t>ử</w:t>
+            </w:r>
+            <w:r>
+              <w:rPr>
+                <w:b/>
+                <w:bCs/>
+              </w:rPr>
+              <w:t xml:space="preserve"> lý</w:t>
+            </w:r>
+          </w:p>
+        </w:tc>
+      </w:tr>
+      <w:tr>
+        <w:tc>
+          <w:tcPr>
+            <w:tcW w:w="0" w:type="auto"/>
+            <w:tcBorders>
+              <w:top w:val="single" w:sz="6" w:space="0" w:color="000000"/>
+              <w:left w:val="single" w:sz="6" w:space="0" w:color="000000"/>
+              <w:bottom w:val="single" w:sz="6" w:space="0" w:color="000000"/>
+              <w:right w:val="single" w:sz="6" w:space="0" w:color="000000"/>
+            </w:tcBorders>
+            <w:tcMar>
+              <w:top w:w="60" w:type="dxa"/>
+              <w:left w:w="100" w:type="dxa"/>
+              <w:bottom w:w="60" w:type="dxa"/>
+              <w:right w:w="100" w:type="dxa"/>
+            </w:tcMar>
+            <w:hideMark/>
+          </w:tcPr>
+          <w:p>
+            <w:pPr>
+              <w:spacing w:line="288" w:lineRule="auto"/>
+            </w:pPr>
+            <w:r>
+              <w:t>A network-related or instance-specific error… / Cannot open database</w:t>
+            </w:r>
+          </w:p>
+        </w:tc>
+        <w:tc>
+          <w:tcPr>
+            <w:tcW w:w="0" w:type="auto"/>
+            <w:tcBorders>
+              <w:top w:val="single" w:sz="6" w:space="0" w:color="000000"/>
+              <w:left w:val="single" w:sz="6" w:space="0" w:color="000000"/>
+              <w:bottom w:val="single" w:sz="6" w:space="0" w:color="000000"/>
+              <w:right w:val="single" w:sz="6" w:space="0" w:color="000000"/>
+            </w:tcBorders>
+            <w:tcMar>
+              <w:top w:w="60" w:type="dxa"/>
+              <w:left w:w="100" w:type="dxa"/>
+              <w:bottom w:w="60" w:type="dxa"/>
+              <w:right w:w="100" w:type="dxa"/>
+            </w:tcMar>
+            <w:hideMark/>
+          </w:tcPr>
+          <w:p>
+            <w:pPr>
+              <w:spacing w:line="288" w:lineRule="auto"/>
+            </w:pPr>
+            <w:r>
+              <w:t>SQL Server chưa ch</w:t>
+            </w:r>
+            <w:r>
+              <w:t>ạ</w:t>
+            </w:r>
+            <w:r>
+              <w:t>y ho</w:t>
+            </w:r>
+            <w:r>
+              <w:t>ặ</w:t>
+            </w:r>
+            <w:r>
+              <w:t>c sai tên instance. B</w:t>
+            </w:r>
+            <w:r>
+              <w:t>ậ</w:t>
+            </w:r>
+            <w:r>
+              <w:t>t d</w:t>
+            </w:r>
+            <w:r>
+              <w:t>ị</w:t>
+            </w:r>
+            <w:r>
+              <w:t>ch v</w:t>
+            </w:r>
+            <w:r>
+              <w:t>ụ</w:t>
+            </w:r>
+            <w:r>
+              <w:t xml:space="preserve"> SQL Server (SQLEXPRESS) trong services.msc, ho</w:t>
+            </w:r>
+            <w:r>
+              <w:t>ặ</w:t>
+            </w:r>
+            <w:r>
+              <w:t>c s</w:t>
+            </w:r>
+            <w:r>
+              <w:t>ử</w:t>
+            </w:r>
+            <w:r>
+              <w:t>a chu</w:t>
+            </w:r>
+            <w:r>
+              <w:t>ỗ</w:t>
+            </w:r>
+            <w:r>
+              <w:t>i k</w:t>
+            </w:r>
+            <w:r>
+              <w:t>ế</w:t>
+            </w:r>
+            <w:r>
+              <w:t>t n</w:t>
+            </w:r>
+            <w:r>
+              <w:t>ố</w:t>
+            </w:r>
+            <w:r>
+              <w:t xml:space="preserve">i </w:t>
+            </w:r>
+            <w:r>
+              <w:t>ở</w:t>
+            </w:r>
+            <w:r>
+              <w:t xml:space="preserve"> m</w:t>
+            </w:r>
+            <w:r>
+              <w:t>ụ</w:t>
+            </w:r>
+            <w:r>
+              <w:t>c 1.3.</w:t>
+            </w:r>
+          </w:p>
+        </w:tc>
+      </w:tr>
+      <w:tr>
+        <w:tc>
+          <w:tcPr>
+            <w:tcW w:w="0" w:type="auto"/>
+            <w:tcBorders>
+              <w:top w:val="single" w:sz="6" w:space="0" w:color="000000"/>
+              <w:left w:val="single" w:sz="6" w:space="0" w:color="000000"/>
+              <w:bottom w:val="single" w:sz="6" w:space="0" w:color="000000"/>
+              <w:right w:val="single" w:sz="6" w:space="0" w:color="000000"/>
+            </w:tcBorders>
+            <w:tcMar>
+              <w:top w:w="60" w:type="dxa"/>
+              <w:left w:w="100" w:type="dxa"/>
+              <w:bottom w:w="60" w:type="dxa"/>
+              <w:right w:w="100" w:type="dxa"/>
+            </w:tcMar>
+            <w:hideMark/>
+          </w:tcPr>
+          <w:p>
+            <w:pPr>
+              <w:spacing w:line="288" w:lineRule="auto"/>
+            </w:pPr>
+            <w:r>
+              <w:t>Failed to bind to address http://127.0.0.1:5080: address already in use</w:t>
+            </w:r>
+          </w:p>
+        </w:tc>
+        <w:tc>
+          <w:tcPr>
+            <w:tcW w:w="0" w:type="auto"/>
+            <w:tcBorders>
+              <w:top w:val="single" w:sz="6" w:space="0" w:color="000000"/>
+              <w:left w:val="single" w:sz="6" w:space="0" w:color="000000"/>
+              <w:bottom w:val="single" w:sz="6" w:space="0" w:color="000000"/>
+              <w:right w:val="single" w:sz="6" w:space="0" w:color="000000"/>
+            </w:tcBorders>
+            <w:tcMar>
+              <w:top w:w="60" w:type="dxa"/>
+              <w:left w:w="100" w:type="dxa"/>
+              <w:bottom w:w="60" w:type="dxa"/>
+              <w:right w:w="100" w:type="dxa"/>
+            </w:tcMar>
+            <w:hideMark/>
+          </w:tcPr>
+          <w:p>
+            <w:pPr>
+              <w:spacing w:line="288" w:lineRule="auto"/>
+            </w:pPr>
+            <w:r>
+              <w:t>Website đang ch</w:t>
+            </w:r>
+            <w:r>
+              <w:t>ạ</w:t>
+            </w:r>
+            <w:r>
+              <w:t xml:space="preserve">y </w:t>
+            </w:r>
+            <w:r>
+              <w:t>ở</w:t>
+            </w:r>
+            <w:r>
+              <w:t xml:space="preserve"> m</w:t>
+            </w:r>
+            <w:r>
+              <w:t>ộ</w:t>
+            </w:r>
+            <w:r>
+              <w:t>t c</w:t>
+            </w:r>
+            <w:r>
+              <w:t>ử</w:t>
+            </w:r>
+            <w:r>
+              <w:t>a s</w:t>
+            </w:r>
+            <w:r>
+              <w:t>ổ</w:t>
+            </w:r>
+            <w:r>
+              <w:t xml:space="preserve"> khác. Đóng c</w:t>
+            </w:r>
+            <w:r>
+              <w:t>ử</w:t>
+            </w:r>
+            <w:r>
+              <w:t>a s</w:t>
+            </w:r>
+            <w:r>
+              <w:t>ổ</w:t>
+            </w:r>
+            <w:r>
+              <w:t xml:space="preserve"> đó (Ctrl+C), ho</w:t>
+            </w:r>
+            <w:r>
+              <w:t>ặ</w:t>
+            </w:r>
+            <w:r>
+              <w:t>c ch</w:t>
+            </w:r>
+            <w:r>
+              <w:t>ạ</w:t>
+            </w:r>
+            <w:r>
+              <w:t>y dat_lai_du_lieu.ps1 (t</w:t>
+            </w:r>
+            <w:r>
+              <w:t>ệ</w:t>
+            </w:r>
+            <w:r>
+              <w:t>p này t</w:t>
+            </w:r>
+            <w:r>
+              <w:t>ự</w:t>
+            </w:r>
+            <w:r>
+              <w:t xml:space="preserve"> d</w:t>
+            </w:r>
+            <w:r>
+              <w:t>ừ</w:t>
+            </w:r>
+            <w:r>
+              <w:t>ng website cũ).</w:t>
+            </w:r>
+          </w:p>
+        </w:tc>
+      </w:tr>
+      <w:tr>
+        <w:tc>
+          <w:tcPr>
+            <w:tcW w:w="0" w:type="auto"/>
+            <w:tcBorders>
+              <w:top w:val="single" w:sz="6" w:space="0" w:color="000000"/>
+              <w:left w:val="single" w:sz="6" w:space="0" w:color="000000"/>
+              <w:bottom w:val="single" w:sz="6" w:space="0" w:color="000000"/>
+              <w:right w:val="single" w:sz="6" w:space="0" w:color="000000"/>
+            </w:tcBorders>
+            <w:tcMar>
+              <w:top w:w="60" w:type="dxa"/>
+              <w:left w:w="100" w:type="dxa"/>
+              <w:bottom w:w="60" w:type="dxa"/>
+              <w:right w:w="100" w:type="dxa"/>
+            </w:tcMar>
+            <w:hideMark/>
+          </w:tcPr>
+          <w:p>
+            <w:pPr>
+              <w:spacing w:line="288" w:lineRule="auto"/>
+            </w:pPr>
+            <w:r>
+              <w:t>Could not execute because the specified command or file was not found (dotnet-ef)</w:t>
+            </w:r>
+          </w:p>
+        </w:tc>
+        <w:tc>
+          <w:tcPr>
+            <w:tcW w:w="0" w:type="auto"/>
+            <w:tcBorders>
+              <w:top w:val="single" w:sz="6" w:space="0" w:color="000000"/>
+              <w:left w:val="single" w:sz="6" w:space="0" w:color="000000"/>
+              <w:bottom w:val="single" w:sz="6" w:space="0" w:color="000000"/>
+              <w:right w:val="single" w:sz="6" w:space="0" w:color="000000"/>
+            </w:tcBorders>
+            <w:tcMar>
+              <w:top w:w="60" w:type="dxa"/>
+              <w:left w:w="100" w:type="dxa"/>
+              <w:bottom w:w="60" w:type="dxa"/>
+              <w:right w:w="100" w:type="dxa"/>
+            </w:tcMar>
+            <w:hideMark/>
+          </w:tcPr>
+          <w:p>
+            <w:pPr>
+              <w:spacing w:line="288" w:lineRule="auto"/>
+            </w:pPr>
+            <w:r>
+              <w:t>Chưa cài công c</w:t>
+            </w:r>
+            <w:r>
+              <w:t>ụ</w:t>
+            </w:r>
+            <w:r>
+              <w:t xml:space="preserve"> EF Core. Ch</w:t>
+            </w:r>
+            <w:r>
+              <w:t>ạ</w:t>
+            </w:r>
+            <w:r>
+              <w:t xml:space="preserve">y </w:t>
+            </w:r>
+            <w:r>
+              <w:rPr>
+                <w:rStyle w:val="HTMLCode"/>
+              </w:rPr>
+              <w:t>dotnet tool restore</w:t>
+            </w:r>
+            <w:r>
+              <w:t xml:space="preserve"> trong thư m</w:t>
+            </w:r>
+            <w:r>
+              <w:t>ụ</w:t>
+            </w:r>
+            <w:r>
+              <w:t>c mã ngu</w:t>
+            </w:r>
+            <w:r>
+              <w:t>ồ</w:t>
+            </w:r>
+            <w:r>
+              <w:t>n.</w:t>
+            </w:r>
+          </w:p>
+        </w:tc>
+      </w:tr>
+      <w:tr>
+        <w:tc>
+          <w:tcPr>
+            <w:tcW w:w="0" w:type="auto"/>
+            <w:tcBorders>
+              <w:top w:val="single" w:sz="6" w:space="0" w:color="000000"/>
+              <w:left w:val="single" w:sz="6" w:space="0" w:color="000000"/>
+              <w:bottom w:val="single" w:sz="6" w:space="0" w:color="000000"/>
+              <w:right w:val="single" w:sz="6" w:space="0" w:color="000000"/>
+            </w:tcBorders>
+            <w:tcMar>
+              <w:top w:w="60" w:type="dxa"/>
+              <w:left w:w="100" w:type="dxa"/>
+              <w:bottom w:w="60" w:type="dxa"/>
+              <w:right w:w="100" w:type="dxa"/>
+            </w:tcMar>
+            <w:hideMark/>
+          </w:tcPr>
+          <w:p>
+            <w:pPr>
+              <w:spacing w:line="288" w:lineRule="auto"/>
+            </w:pPr>
+            <w:r>
+              <w:t>The command could not be loaded / không ch</w:t>
+            </w:r>
+            <w:r>
+              <w:t>ạ</w:t>
+            </w:r>
+            <w:r>
+              <w:t>y đư</w:t>
+            </w:r>
+            <w:r>
+              <w:t>ợ</w:t>
+            </w:r>
+            <w:r>
+              <w:t>c t</w:t>
+            </w:r>
+            <w:r>
+              <w:t>ệ</w:t>
+            </w:r>
+            <w:r>
+              <w:t>p .ps1</w:t>
+            </w:r>
+          </w:p>
+        </w:tc>
+        <w:tc>
+          <w:tcPr>
+            <w:tcW w:w="0" w:type="auto"/>
+            <w:tcBorders>
+              <w:top w:val="single" w:sz="6" w:space="0" w:color="000000"/>
+              <w:left w:val="single" w:sz="6" w:space="0" w:color="000000"/>
+              <w:bottom w:val="single" w:sz="6" w:space="0" w:color="000000"/>
+              <w:right w:val="single" w:sz="6" w:space="0" w:color="000000"/>
+            </w:tcBorders>
+            <w:tcMar>
+              <w:top w:w="60" w:type="dxa"/>
+              <w:left w:w="100" w:type="dxa"/>
+              <w:bottom w:w="60" w:type="dxa"/>
+              <w:right w:w="100" w:type="dxa"/>
+            </w:tcMar>
+            <w:hideMark/>
+          </w:tcPr>
+          <w:p>
+            <w:pPr>
+              <w:spacing w:line="288" w:lineRule="auto"/>
+            </w:pPr>
+            <w:r>
+              <w:t>Windows ch</w:t>
+            </w:r>
+            <w:r>
+              <w:t>ặ</w:t>
+            </w:r>
+            <w:r>
+              <w:t>n ch</w:t>
+            </w:r>
+            <w:r>
+              <w:t>ạ</w:t>
+            </w:r>
+            <w:r>
+              <w:t>y script. Ch</w:t>
+            </w:r>
+            <w:r>
+              <w:t>ạ</w:t>
+            </w:r>
+            <w:r>
+              <w:t>y b</w:t>
+            </w:r>
+            <w:r>
+              <w:t>ằ</w:t>
+            </w:r>
+            <w:r>
+              <w:t>ng l</w:t>
+            </w:r>
+            <w:r>
+              <w:t>ệ</w:t>
+            </w:r>
+            <w:r>
+              <w:t xml:space="preserve">nh </w:t>
+            </w:r>
+            <w:r>
+              <w:rPr>
+                <w:rStyle w:val="HTMLCode"/>
+              </w:rPr>
+              <w:t>powershell -ExecutionPolicy Bypass -File docs\demo\dat_lai_du_lieu.ps1</w:t>
+            </w:r>
+            <w:r>
+              <w:t>.</w:t>
+            </w:r>
+          </w:p>
+        </w:tc>
+      </w:tr>
+      <w:tr>
+        <w:tc>
+          <w:tcPr>
+            <w:tcW w:w="0" w:type="auto"/>
+            <w:tcBorders>
+              <w:top w:val="single" w:sz="6" w:space="0" w:color="000000"/>
+              <w:left w:val="single" w:sz="6" w:space="0" w:color="000000"/>
+              <w:bottom w:val="single" w:sz="6" w:space="0" w:color="000000"/>
+              <w:right w:val="single" w:sz="6" w:space="0" w:color="000000"/>
+            </w:tcBorders>
+            <w:tcMar>
+              <w:top w:w="60" w:type="dxa"/>
+              <w:left w:w="100" w:type="dxa"/>
+              <w:bottom w:w="60" w:type="dxa"/>
+              <w:right w:w="100" w:type="dxa"/>
+            </w:tcMar>
+            <w:hideMark/>
+          </w:tcPr>
+          <w:p>
+            <w:pPr>
+              <w:spacing w:line="288" w:lineRule="auto"/>
+            </w:pPr>
+            <w:r>
+              <w:t>Trang web hi</w:t>
+            </w:r>
+            <w:r>
+              <w:t>ệ</w:t>
+            </w:r>
+            <w:r>
+              <w:t>n nhưng không có d</w:t>
+            </w:r>
+            <w:r>
+              <w:t>ự</w:t>
+            </w:r>
+            <w:r>
+              <w:t xml:space="preserve"> án nào</w:t>
+            </w:r>
+          </w:p>
+        </w:tc>
+        <w:tc>
+          <w:tcPr>
+            <w:tcW w:w="0" w:type="auto"/>
+            <w:tcBorders>
+              <w:top w:val="single" w:sz="6" w:space="0" w:color="000000"/>
+              <w:left w:val="single" w:sz="6" w:space="0" w:color="000000"/>
+              <w:bottom w:val="single" w:sz="6" w:space="0" w:color="000000"/>
+              <w:right w:val="single" w:sz="6" w:space="0" w:color="000000"/>
+            </w:tcBorders>
+            <w:tcMar>
+              <w:top w:w="60" w:type="dxa"/>
+              <w:left w:w="100" w:type="dxa"/>
+              <w:bottom w:w="60" w:type="dxa"/>
+              <w:right w:w="100" w:type="dxa"/>
+            </w:tcMar>
+            <w:hideMark/>
+          </w:tcPr>
+          <w:p>
+            <w:pPr>
+              <w:spacing w:line="288" w:lineRule="auto"/>
+            </w:pPr>
+            <w:r>
+              <w:t>Cơ s</w:t>
+            </w:r>
+            <w:r>
+              <w:t>ở</w:t>
+            </w:r>
+            <w:r>
+              <w:t xml:space="preserve"> d</w:t>
+            </w:r>
+            <w:r>
+              <w:t>ữ</w:t>
+            </w:r>
+            <w:r>
+              <w:t xml:space="preserve"> li</w:t>
+            </w:r>
+            <w:r>
+              <w:t>ệ</w:t>
+            </w:r>
+            <w:r>
+              <w:t>u đư</w:t>
+            </w:r>
+            <w:r>
+              <w:t>ợ</w:t>
+            </w:r>
+            <w:r>
+              <w:t>c t</w:t>
+            </w:r>
+            <w:r>
+              <w:t>ạ</w:t>
+            </w:r>
+            <w:r>
+              <w:t>o nhưng chưa n</w:t>
+            </w:r>
+            <w:r>
+              <w:t>ạ</w:t>
+            </w:r>
+            <w:r>
+              <w:t>p d</w:t>
+            </w:r>
+            <w:r>
+              <w:t>ữ</w:t>
+            </w:r>
+            <w:r>
+              <w:t xml:space="preserve"> li</w:t>
+            </w:r>
+            <w:r>
+              <w:t>ệ</w:t>
+            </w:r>
+            <w:r>
+              <w:t>u m</w:t>
+            </w:r>
+            <w:r>
+              <w:t>ẫ</w:t>
+            </w:r>
+            <w:r>
+              <w:t>u. Ch</w:t>
+            </w:r>
+            <w:r>
+              <w:t>ạ</w:t>
+            </w:r>
+            <w:r>
+              <w:t>y dat_lai_du_lieu.ps1 đ</w:t>
+            </w:r>
+            <w:r>
+              <w:t>ể</w:t>
+            </w:r>
+            <w:r>
+              <w:t xml:space="preserve"> t</w:t>
+            </w:r>
+            <w:r>
+              <w:t>ạ</w:t>
+            </w:r>
+            <w:r>
+              <w:t>o l</w:t>
+            </w:r>
+            <w:r>
+              <w:t>ạ</w:t>
+            </w:r>
+            <w:r>
+              <w:t>i t</w:t>
+            </w:r>
+            <w:r>
+              <w:t>ừ</w:t>
+            </w:r>
+            <w:r>
+              <w:t xml:space="preserve"> đ</w:t>
+            </w:r>
+            <w:r>
+              <w:t>ầ</w:t>
+            </w:r>
+            <w:r>
+              <w:t>u.</w:t>
+            </w:r>
+          </w:p>
+        </w:tc>
+      </w:tr>
+    </w:tbl>
+    <w:p>
+      <w:pPr>
+        <w:pStyle w:val="Heading2"/>
+        <w:rPr>
+          <w:rFonts w:eastAsia="Times New Roman"/>
+        </w:rPr>
+      </w:pPr>
+      <w:r>
+        <w:rPr>
+          <w:rFonts w:eastAsia="Times New Roman"/>
+        </w:rPr>
+        <w:t>2. Chuẩn bị trước mỗi lần quay (không quay phần này)</w:t>
+      </w:r>
+    </w:p>
+    <w:p>
+      <w:pPr>
+        <w:pStyle w:val="Heading3"/>
+        <w:rPr>
+          <w:rFonts w:eastAsia="Times New Roman"/>
+        </w:rPr>
+      </w:pPr>
+      <w:r>
+        <w:rPr>
+          <w:rFonts w:eastAsia="Times New Roman"/>
+        </w:rPr>
+        <w:t>2.1. Đặt lại dữ liệu</w:t>
+      </w:r>
+    </w:p>
+    <w:p>
+      <w:pPr>
+        <w:numPr>
+          <w:ilvl w:val="0"/>
+          <w:numId w:val="3"/>
+        </w:numPr>
+        <w:spacing w:before="100" w:beforeAutospacing="1" w:after="60" w:line="360" w:lineRule="auto"/>
+        <w:jc w:val="both"/>
+        <w:rPr>
+          <w:rFonts w:eastAsia="Times New Roman"/>
+          <w:sz w:val="26"/>
+          <w:szCs w:val="26"/>
+        </w:rPr>
+      </w:pPr>
+      <w:r>
+        <w:rPr>
+          <w:rFonts w:eastAsia="Times New Roman"/>
+          <w:sz w:val="26"/>
+          <w:szCs w:val="26"/>
+        </w:rPr>
+        <w:t>Chạy tệp docs/demo/dat_lai_du_lieu.ps1 (chuột phải → Run with PowerShell). Tệp này dừng website, xóa CSDL, xóa ảnh đã tải lên khi chạy thử rồi chạy lại website tại http://localhost:5080 với dữ liệu mẫu sạch.</w:t>
+      </w:r>
+    </w:p>
+    <w:p>
+      <w:pPr>
+        <w:numPr>
+          <w:ilvl w:val="0"/>
+          <w:numId w:val="3"/>
+        </w:numPr>
+        <w:spacing w:before="100" w:beforeAutospacing="1" w:after="60" w:line="360" w:lineRule="auto"/>
+        <w:jc w:val="both"/>
+        <w:rPr>
+          <w:rFonts w:eastAsia="Times New Roman"/>
+          <w:sz w:val="26"/>
+          <w:szCs w:val="26"/>
+        </w:rPr>
+      </w:pPr>
+      <w:r>
+        <w:rPr>
+          <w:rFonts w:eastAsia="Times New Roman"/>
+          <w:sz w:val="26"/>
+          <w:szCs w:val="26"/>
+        </w:rPr>
+        <w:t>Giữ nguyên cửa sổ PowerShell đó trong suốt lúc quay (đóng là website dừng).</w:t>
+      </w:r>
+    </w:p>
+    <w:p>
+      <w:pPr>
+        <w:numPr>
+          <w:ilvl w:val="0"/>
+          <w:numId w:val="3"/>
+        </w:numPr>
+        <w:spacing w:before="100" w:beforeAutospacing="1" w:after="60" w:line="360" w:lineRule="auto"/>
+        <w:jc w:val="both"/>
+        <w:rPr>
+          <w:rFonts w:eastAsia="Times New Roman"/>
+          <w:sz w:val="26"/>
+          <w:szCs w:val="26"/>
+        </w:rPr>
+      </w:pPr>
+      <w:r>
+        <w:rPr>
+          <w:rFonts w:eastAsia="Times New Roman"/>
+          <w:sz w:val="26"/>
+          <w:szCs w:val="26"/>
+        </w:rPr>
+        <w:t>Nếu quay hỏng giữa chừng, chạy lại tệp này rồi quay lại từ đầu, vì dự án demo đã được tạo ở lần quay trước.</w:t>
+      </w:r>
+    </w:p>
+    <w:p>
+      <w:pPr>
+        <w:pStyle w:val="Heading3"/>
+        <w:rPr>
+          <w:rFonts w:eastAsia="Times New Roman"/>
+        </w:rPr>
+      </w:pPr>
+      <w:r>
+        <w:rPr>
+          <w:rFonts w:eastAsia="Times New Roman"/>
+        </w:rPr>
+        <w:t>2.2. Tài khoản và dữ liệu nhập</w:t>
       </w:r>
     </w:p>
     <w:tbl>
@@ -1361,13 +4825,75 @@
     </w:tbl>
     <w:p>
       <w:pPr>
-        <w:rPr>
-          <w:rFonts w:eastAsia="Times New Roman"/>
-          <w:vanish/>
+        <w:pStyle w:val="NormalWeb"/>
+        <w:rPr>
           <w:sz w:val="26"/>
           <w:szCs w:val="26"/>
         </w:rPr>
       </w:pPr>
+      <w:r>
+        <w:rPr>
+          <w:sz w:val="26"/>
+          <w:szCs w:val="26"/>
+        </w:rPr>
+        <w:t>D</w:t>
+      </w:r>
+      <w:r>
+        <w:rPr>
+          <w:sz w:val="26"/>
+          <w:szCs w:val="26"/>
+        </w:rPr>
+        <w:t>ữ</w:t>
+      </w:r>
+      <w:r>
+        <w:rPr>
+          <w:sz w:val="26"/>
+          <w:szCs w:val="26"/>
+        </w:rPr>
+        <w:t xml:space="preserve"> li</w:t>
+      </w:r>
+      <w:r>
+        <w:rPr>
+          <w:sz w:val="26"/>
+          <w:szCs w:val="26"/>
+        </w:rPr>
+        <w:t>ệ</w:t>
+      </w:r>
+      <w:r>
+        <w:rPr>
+          <w:sz w:val="26"/>
+          <w:szCs w:val="26"/>
+        </w:rPr>
+        <w:t>u nh</w:t>
+      </w:r>
+      <w:r>
+        <w:rPr>
+          <w:sz w:val="26"/>
+          <w:szCs w:val="26"/>
+        </w:rPr>
+        <w:t>ậ</w:t>
+      </w:r>
+      <w:r>
+        <w:rPr>
+          <w:sz w:val="26"/>
+          <w:szCs w:val="26"/>
+        </w:rPr>
+        <w:t>p cho d</w:t>
+      </w:r>
+      <w:r>
+        <w:rPr>
+          <w:sz w:val="26"/>
+          <w:szCs w:val="26"/>
+        </w:rPr>
+        <w:t>ự</w:t>
+      </w:r>
+      <w:r>
+        <w:rPr>
+          <w:sz w:val="26"/>
+          <w:szCs w:val="26"/>
+        </w:rPr>
+        <w:t xml:space="preserve"> án demo:</w:t>
+      </w:r>
     </w:p>
     <w:tbl>
       <w:tblPr>
@@ -1922,7 +5448,6 @@
               <w:spacing w:line="288" w:lineRule="auto"/>
             </w:pPr>
             <w:r>
-              <w:lastRenderedPageBreak/>
               <w:t>Gi</w:t>
             </w:r>
             <w:r>
@@ -2776,14 +6301,14 @@
         <w:rPr>
           <w:rFonts w:eastAsia="Times New Roman"/>
         </w:rPr>
-        <w:t>1.3. Màn hình và trình duyệt</w:t>
+        <w:t>2.3. Màn hình và trình duyệt</w:t>
       </w:r>
     </w:p>
     <w:p>
       <w:pPr>
         <w:numPr>
           <w:ilvl w:val="0"/>
-          <w:numId w:val="2"/>
+          <w:numId w:val="4"/>
         </w:numPr>
         <w:spacing w:before="100" w:beforeAutospacing="1" w:after="60" w:line="360" w:lineRule="auto"/>
         <w:jc w:val="both"/>
@@ -2806,7 +6331,7 @@
       <w:pPr>
         <w:numPr>
           <w:ilvl w:val="0"/>
-          <w:numId w:val="2"/>
+          <w:numId w:val="4"/>
         </w:numPr>
         <w:spacing w:before="100" w:beforeAutospacing="1" w:after="60" w:line="360" w:lineRule="auto"/>
         <w:jc w:val="both"/>
@@ -2829,7 +6354,7 @@
       <w:pPr>
         <w:numPr>
           <w:ilvl w:val="0"/>
-          <w:numId w:val="2"/>
+          <w:numId w:val="4"/>
         </w:numPr>
         <w:spacing w:before="100" w:beforeAutospacing="1" w:after="60" w:line="360" w:lineRule="auto"/>
         <w:jc w:val="both"/>
@@ -2862,7 +6387,7 @@
       <w:pPr>
         <w:numPr>
           <w:ilvl w:val="0"/>
-          <w:numId w:val="2"/>
+          <w:numId w:val="4"/>
         </w:numPr>
         <w:spacing w:before="100" w:beforeAutospacing="1" w:after="60" w:line="360" w:lineRule="auto"/>
         <w:jc w:val="both"/>
@@ -2895,7 +6420,7 @@
       <w:pPr>
         <w:numPr>
           <w:ilvl w:val="0"/>
-          <w:numId w:val="2"/>
+          <w:numId w:val="4"/>
         </w:numPr>
         <w:spacing w:before="100" w:beforeAutospacing="1" w:after="60" w:line="360" w:lineRule="auto"/>
         <w:jc w:val="both"/>
@@ -2921,14 +6446,22 @@
           <w:sz w:val="26"/>
           <w:szCs w:val="26"/>
         </w:rPr>
-        <w:t xml:space="preserve"> khách, sau đó đăng ký thành sinh viên mới.</w:t>
+        <w:t xml:space="preserve"> </w:t>
+      </w:r>
+      <w:r>
+        <w:rPr>
+          <w:rFonts w:eastAsia="Times New Roman"/>
+          <w:sz w:val="26"/>
+          <w:szCs w:val="26"/>
+        </w:rPr>
+        <w:t>khách, sau đó đăng ký thành sinh viên mới.</w:t>
       </w:r>
     </w:p>
     <w:p>
       <w:pPr>
         <w:numPr>
           <w:ilvl w:val="0"/>
-          <w:numId w:val="2"/>
+          <w:numId w:val="4"/>
         </w:numPr>
         <w:spacing w:before="100" w:beforeAutospacing="1" w:after="60" w:line="360" w:lineRule="auto"/>
         <w:jc w:val="both"/>
@@ -2951,7 +6484,7 @@
       <w:pPr>
         <w:numPr>
           <w:ilvl w:val="0"/>
-          <w:numId w:val="2"/>
+          <w:numId w:val="4"/>
         </w:numPr>
         <w:spacing w:before="100" w:beforeAutospacing="1" w:after="60" w:line="360" w:lineRule="auto"/>
         <w:jc w:val="both"/>
@@ -2974,7 +6507,7 @@
       <w:pPr>
         <w:numPr>
           <w:ilvl w:val="0"/>
-          <w:numId w:val="2"/>
+          <w:numId w:val="4"/>
         </w:numPr>
         <w:spacing w:before="100" w:beforeAutospacing="1" w:after="60" w:line="360" w:lineRule="auto"/>
         <w:jc w:val="both"/>
@@ -3004,8 +6537,7 @@
         <w:rPr>
           <w:rFonts w:eastAsia="Times New Roman"/>
         </w:rPr>
-        <w:lastRenderedPageBreak/>
-        <w:t>2. Kịch bản chi tiết</w:t>
+        <w:t>3. Kịch bản chi tiết</w:t>
       </w:r>
     </w:p>
     <w:p>
@@ -3252,10 +6784,7 @@
               <w:t>ủ</w:t>
             </w:r>
             <w:r>
-              <w:t>a sinh viên T</w:t>
-            </w:r>
-            <w:r>
-              <w:t>rư</w:t>
+              <w:t>a sinh viên Trư</w:t>
             </w:r>
             <w:r>
               <w:t>ờ</w:t>
@@ -5837,7 +9366,7 @@
               <w:t>ụ</w:t>
             </w:r>
             <w:r>
-              <w:t>c 1.2, ch</w:t>
+              <w:t>c 2.2, ch</w:t>
             </w:r>
             <w:r>
               <w:t>ọ</w:t>
@@ -7642,7 +11171,7 @@
               <w:t>ụ</w:t>
             </w:r>
             <w:r>
-              <w:t xml:space="preserve">c 1.2 → </w:t>
+              <w:t xml:space="preserve">c 2.2 → </w:t>
             </w:r>
             <w:r>
               <w:rPr>
@@ -8212,7 +11741,10 @@
               <w:t>Xem website</w:t>
             </w:r>
             <w:r>
-              <w:t xml:space="preserve"> → trang ch</w:t>
+              <w:t xml:space="preserve"> </w:t>
+            </w:r>
+            <w:r>
+              <w:t>→ trang ch</w:t>
             </w:r>
             <w:r>
               <w:t>ủ</w:t>
@@ -10064,14 +13596,14 @@
         <w:rPr>
           <w:rFonts w:eastAsia="Times New Roman"/>
         </w:rPr>
-        <w:t>3. Sau khi quay</w:t>
+        <w:t>4. Sau khi quay</w:t>
       </w:r>
     </w:p>
     <w:p>
       <w:pPr>
         <w:numPr>
           <w:ilvl w:val="0"/>
-          <w:numId w:val="3"/>
+          <w:numId w:val="5"/>
         </w:numPr>
         <w:spacing w:before="100" w:beforeAutospacing="1" w:after="60" w:line="360" w:lineRule="auto"/>
         <w:jc w:val="both"/>
@@ -10094,7 +13626,7 @@
       <w:pPr>
         <w:numPr>
           <w:ilvl w:val="0"/>
-          <w:numId w:val="3"/>
+          <w:numId w:val="5"/>
         </w:numPr>
         <w:spacing w:before="100" w:beforeAutospacing="1" w:after="60" w:line="360" w:lineRule="auto"/>
         <w:jc w:val="both"/>
@@ -10117,7 +13649,7 @@
       <w:pPr>
         <w:numPr>
           <w:ilvl w:val="0"/>
-          <w:numId w:val="3"/>
+          <w:numId w:val="5"/>
         </w:numPr>
         <w:spacing w:before="100" w:beforeAutospacing="1" w:after="60" w:line="360" w:lineRule="auto"/>
         <w:jc w:val="both"/>
@@ -10140,7 +13672,7 @@
       <w:pPr>
         <w:numPr>
           <w:ilvl w:val="0"/>
-          <w:numId w:val="3"/>
+          <w:numId w:val="5"/>
         </w:numPr>
         <w:spacing w:before="100" w:beforeAutospacing="1" w:after="60" w:line="360" w:lineRule="auto"/>
         <w:jc w:val="both"/>
@@ -10172,9 +13704,9 @@
 <file path=word/numbering.xml><?xml version="1.0" encoding="utf-8"?>
 <w:numbering xmlns:wpc="http://schemas.microsoft.com/office/word/2010/wordprocessingCanvas" xmlns:cx="http://schemas.microsoft.com/office/drawing/2014/chartex" xmlns:cx1="http://schemas.microsoft.com/office/drawing/2015/9/8/chartex" xmlns:cx2="http://schemas.microsoft.com/office/drawing/2015/10/21/chartex" xmlns:cx3="http://schemas.microsoft.com/office/drawing/2016/5/9/chartex" xmlns:cx4="http://schemas.microsoft.com/office/drawing/2016/5/10/chartex" xmlns:cx5="http://schemas.microsoft.com/office/drawing/2016/5/11/chartex" xmlns:cx6="http://schemas.microsoft.com/office/drawing/2016/5/12/chartex" xmlns:cx7="http://schemas.microsoft.com/office/drawing/2016/5/13/chartex" xmlns:cx8="http://schemas.microsoft.com/office/drawing/2016/5/14/chartex" xmlns:mc="http://schemas.openxmlformats.org/markup-compatibility/2006" xmlns:aink="http://schemas.microsoft.com/office/drawing/2016/ink" xmlns:am3d="http://schemas.microsoft.com/office/drawing/2017/model3d" xmlns:o="urn:schemas-microsoft-com:office:office" xmlns:oel="http://schemas.microsoft.com/office/2019/extlst" xmlns:r="http://schemas.openxmlformats.org/officeDocument/2006/relationships" xmlns:m="http://schemas.openxmlformats.org/officeDocument/2006/math" xmlns:v="urn:schemas-microsoft-com:vml" xmlns:wp14="http://schemas.microsoft.com/office/word/2010/wordprocessingDrawing" xmlns:wp="http://schemas.openxmlformats.org/drawingml/2006/wordprocessingDrawing" xmlns:w10="urn:schemas-microsoft-com:office:word" xmlns:w="http://schemas.openxmlformats.org/wordprocessingml/2006/main" xmlns:w14="http://schemas.microsoft.com/office/word/2010/wordml" xmlns:w15="http://schemas.microsoft.com/office/word/2012/wordml" xmlns:w16cex="http://schemas.microsoft.com/office/word/2018/wordml/cex" xmlns:w16cid="http://schemas.microsoft.com/office/word/2016/wordml/cid" xmlns:w16="http://schemas.microsoft.com/office/word/2018/wordml" xmlns:w16du="http://schemas.microsoft.com/office/word/2023/wordml/word16du" xmlns:w16sdtdh="http://schemas.microsoft.com/office/word/2020/wordml/sdtdatahash" xmlns:w16sdtfl="http://schemas.microsoft.com/office/word/2024/wordml/sdtformatlock" xmlns:w16se="http://schemas.microsoft.com/office/word/2015/wordml/symex" xmlns:wpg="http://schemas.microsoft.com/office/word/2010/wordprocessingGroup" xmlns:wpi="http://schemas.microsoft.com/office/word/2010/wordprocessingInk" xmlns:wne="http://schemas.microsoft.com/office/word/2006/wordml" xmlns:wps="http://schemas.microsoft.com/office/word/2010/wordprocessingShape" mc:Ignorable="w14 w15 w16se w16cid w16 w16cex w16sdtdh w16sdtfl w16du wp14">
   <w:abstractNum w:abstractNumId="0" w15:restartNumberingAfterBreak="0">
-    <w:nsid w:val="2D5D0F67"/>
+    <w:nsid w:val="2B72795F"/>
     <w:multiLevelType w:val="multilevel"/>
-    <w:tmpl w:val="09B0061C"/>
+    <w:tmpl w:val="08DEA598"/>
     <w:lvl w:ilvl="0">
       <w:start w:val="1"/>
       <w:numFmt w:val="bullet"/>
@@ -10321,9 +13853,9 @@
     </w:lvl>
   </w:abstractNum>
   <w:abstractNum w:abstractNumId="1" w15:restartNumberingAfterBreak="0">
-    <w:nsid w:val="36F769D2"/>
+    <w:nsid w:val="3A434B9A"/>
     <w:multiLevelType w:val="multilevel"/>
-    <w:tmpl w:val="D8C6DF52"/>
+    <w:tmpl w:val="0B8A12AE"/>
     <w:lvl w:ilvl="0">
       <w:start w:val="1"/>
       <w:numFmt w:val="bullet"/>
@@ -10470,9 +14002,9 @@
     </w:lvl>
   </w:abstractNum>
   <w:abstractNum w:abstractNumId="2" w15:restartNumberingAfterBreak="0">
-    <w:nsid w:val="4700209A"/>
+    <w:nsid w:val="3B945390"/>
     <w:multiLevelType w:val="multilevel"/>
-    <w:tmpl w:val="C40CA4C4"/>
+    <w:tmpl w:val="0CB60E9A"/>
     <w:lvl w:ilvl="0">
       <w:start w:val="1"/>
       <w:numFmt w:val="bullet"/>
@@ -10618,13 +14150,317 @@
       </w:rPr>
     </w:lvl>
   </w:abstractNum>
-  <w:num w:numId="1" w16cid:durableId="1861818990">
+  <w:abstractNum w:abstractNumId="3" w15:restartNumberingAfterBreak="0">
+    <w:nsid w:val="4DD354F2"/>
+    <w:multiLevelType w:val="multilevel"/>
+    <w:tmpl w:val="22F2F748"/>
+    <w:lvl w:ilvl="0">
+      <w:start w:val="1"/>
+      <w:numFmt w:val="bullet"/>
+      <w:lvlText w:val=""/>
+      <w:lvlJc w:val="left"/>
+      <w:pPr>
+        <w:tabs>
+          <w:tab w:val="num" w:pos="720"/>
+        </w:tabs>
+        <w:ind w:left="720" w:hanging="360"/>
+      </w:pPr>
+      <w:rPr>
+        <w:rFonts w:ascii="Symbol" w:hAnsi="Symbol" w:hint="default"/>
+        <w:sz w:val="20"/>
+      </w:rPr>
+    </w:lvl>
+    <w:lvl w:ilvl="1" w:tentative="1">
+      <w:start w:val="1"/>
+      <w:numFmt w:val="bullet"/>
+      <w:lvlText w:val="o"/>
+      <w:lvlJc w:val="left"/>
+      <w:pPr>
+        <w:tabs>
+          <w:tab w:val="num" w:pos="1440"/>
+        </w:tabs>
+        <w:ind w:left="1440" w:hanging="360"/>
+      </w:pPr>
+      <w:rPr>
+        <w:rFonts w:ascii="Courier New" w:hAnsi="Courier New" w:hint="default"/>
+        <w:sz w:val="20"/>
+      </w:rPr>
+    </w:lvl>
+    <w:lvl w:ilvl="2" w:tentative="1">
+      <w:start w:val="1"/>
+      <w:numFmt w:val="bullet"/>
+      <w:lvlText w:val=""/>
+      <w:lvlJc w:val="left"/>
+      <w:pPr>
+        <w:tabs>
+          <w:tab w:val="num" w:pos="2160"/>
+        </w:tabs>
+        <w:ind w:left="2160" w:hanging="360"/>
+      </w:pPr>
+      <w:rPr>
+        <w:rFonts w:ascii="Wingdings" w:hAnsi="Wingdings" w:hint="default"/>
+        <w:sz w:val="20"/>
+      </w:rPr>
+    </w:lvl>
+    <w:lvl w:ilvl="3" w:tentative="1">
+      <w:start w:val="1"/>
+      <w:numFmt w:val="bullet"/>
+      <w:lvlText w:val=""/>
+      <w:lvlJc w:val="left"/>
+      <w:pPr>
+        <w:tabs>
+          <w:tab w:val="num" w:pos="2880"/>
+        </w:tabs>
+        <w:ind w:left="2880" w:hanging="360"/>
+      </w:pPr>
+      <w:rPr>
+        <w:rFonts w:ascii="Wingdings" w:hAnsi="Wingdings" w:hint="default"/>
+        <w:sz w:val="20"/>
+      </w:rPr>
+    </w:lvl>
+    <w:lvl w:ilvl="4" w:tentative="1">
+      <w:start w:val="1"/>
+      <w:numFmt w:val="bullet"/>
+      <w:lvlText w:val=""/>
+      <w:lvlJc w:val="left"/>
+      <w:pPr>
+        <w:tabs>
+          <w:tab w:val="num" w:pos="3600"/>
+        </w:tabs>
+        <w:ind w:left="3600" w:hanging="360"/>
+      </w:pPr>
+      <w:rPr>
+        <w:rFonts w:ascii="Wingdings" w:hAnsi="Wingdings" w:hint="default"/>
+        <w:sz w:val="20"/>
+      </w:rPr>
+    </w:lvl>
+    <w:lvl w:ilvl="5" w:tentative="1">
+      <w:start w:val="1"/>
+      <w:numFmt w:val="bullet"/>
+      <w:lvlText w:val=""/>
+      <w:lvlJc w:val="left"/>
+      <w:pPr>
+        <w:tabs>
+          <w:tab w:val="num" w:pos="4320"/>
+        </w:tabs>
+        <w:ind w:left="4320" w:hanging="360"/>
+      </w:pPr>
+      <w:rPr>
+        <w:rFonts w:ascii="Wingdings" w:hAnsi="Wingdings" w:hint="default"/>
+        <w:sz w:val="20"/>
+      </w:rPr>
+    </w:lvl>
+    <w:lvl w:ilvl="6" w:tentative="1">
+      <w:start w:val="1"/>
+      <w:numFmt w:val="bullet"/>
+      <w:lvlText w:val=""/>
+      <w:lvlJc w:val="left"/>
+      <w:pPr>
+        <w:tabs>
+          <w:tab w:val="num" w:pos="5040"/>
+        </w:tabs>
+        <w:ind w:left="5040" w:hanging="360"/>
+      </w:pPr>
+      <w:rPr>
+        <w:rFonts w:ascii="Wingdings" w:hAnsi="Wingdings" w:hint="default"/>
+        <w:sz w:val="20"/>
+      </w:rPr>
+    </w:lvl>
+    <w:lvl w:ilvl="7" w:tentative="1">
+      <w:start w:val="1"/>
+      <w:numFmt w:val="bullet"/>
+      <w:lvlText w:val=""/>
+      <w:lvlJc w:val="left"/>
+      <w:pPr>
+        <w:tabs>
+          <w:tab w:val="num" w:pos="5760"/>
+        </w:tabs>
+        <w:ind w:left="5760" w:hanging="360"/>
+      </w:pPr>
+      <w:rPr>
+        <w:rFonts w:ascii="Wingdings" w:hAnsi="Wingdings" w:hint="default"/>
+        <w:sz w:val="20"/>
+      </w:rPr>
+    </w:lvl>
+    <w:lvl w:ilvl="8" w:tentative="1">
+      <w:start w:val="1"/>
+      <w:numFmt w:val="bullet"/>
+      <w:lvlText w:val=""/>
+      <w:lvlJc w:val="left"/>
+      <w:pPr>
+        <w:tabs>
+          <w:tab w:val="num" w:pos="6480"/>
+        </w:tabs>
+        <w:ind w:left="6480" w:hanging="360"/>
+      </w:pPr>
+      <w:rPr>
+        <w:rFonts w:ascii="Wingdings" w:hAnsi="Wingdings" w:hint="default"/>
+        <w:sz w:val="20"/>
+      </w:rPr>
+    </w:lvl>
+  </w:abstractNum>
+  <w:abstractNum w:abstractNumId="4" w15:restartNumberingAfterBreak="0">
+    <w:nsid w:val="4E1E202D"/>
+    <w:multiLevelType w:val="multilevel"/>
+    <w:tmpl w:val="3B801D90"/>
+    <w:lvl w:ilvl="0">
+      <w:start w:val="1"/>
+      <w:numFmt w:val="bullet"/>
+      <w:lvlText w:val=""/>
+      <w:lvlJc w:val="left"/>
+      <w:pPr>
+        <w:tabs>
+          <w:tab w:val="num" w:pos="720"/>
+        </w:tabs>
+        <w:ind w:left="720" w:hanging="360"/>
+      </w:pPr>
+      <w:rPr>
+        <w:rFonts w:ascii="Symbol" w:hAnsi="Symbol" w:hint="default"/>
+        <w:sz w:val="20"/>
+      </w:rPr>
+    </w:lvl>
+    <w:lvl w:ilvl="1" w:tentative="1">
+      <w:start w:val="1"/>
+      <w:numFmt w:val="bullet"/>
+      <w:lvlText w:val="o"/>
+      <w:lvlJc w:val="left"/>
+      <w:pPr>
+        <w:tabs>
+          <w:tab w:val="num" w:pos="1440"/>
+        </w:tabs>
+        <w:ind w:left="1440" w:hanging="360"/>
+      </w:pPr>
+      <w:rPr>
+        <w:rFonts w:ascii="Courier New" w:hAnsi="Courier New" w:hint="default"/>
+        <w:sz w:val="20"/>
+      </w:rPr>
+    </w:lvl>
+    <w:lvl w:ilvl="2" w:tentative="1">
+      <w:start w:val="1"/>
+      <w:numFmt w:val="bullet"/>
+      <w:lvlText w:val=""/>
+      <w:lvlJc w:val="left"/>
+      <w:pPr>
+        <w:tabs>
+          <w:tab w:val="num" w:pos="2160"/>
+        </w:tabs>
+        <w:ind w:left="2160" w:hanging="360"/>
+      </w:pPr>
+      <w:rPr>
+        <w:rFonts w:ascii="Wingdings" w:hAnsi="Wingdings" w:hint="default"/>
+        <w:sz w:val="20"/>
+      </w:rPr>
+    </w:lvl>
+    <w:lvl w:ilvl="3" w:tentative="1">
+      <w:start w:val="1"/>
+      <w:numFmt w:val="bullet"/>
+      <w:lvlText w:val=""/>
+      <w:lvlJc w:val="left"/>
+      <w:pPr>
+        <w:tabs>
+          <w:tab w:val="num" w:pos="2880"/>
+        </w:tabs>
+        <w:ind w:left="2880" w:hanging="360"/>
+      </w:pPr>
+      <w:rPr>
+        <w:rFonts w:ascii="Wingdings" w:hAnsi="Wingdings" w:hint="default"/>
+        <w:sz w:val="20"/>
+      </w:rPr>
+    </w:lvl>
+    <w:lvl w:ilvl="4" w:tentative="1">
+      <w:start w:val="1"/>
+      <w:numFmt w:val="bullet"/>
+      <w:lvlText w:val=""/>
+      <w:lvlJc w:val="left"/>
+      <w:pPr>
+        <w:tabs>
+          <w:tab w:val="num" w:pos="3600"/>
+        </w:tabs>
+        <w:ind w:left="3600" w:hanging="360"/>
+      </w:pPr>
+      <w:rPr>
+        <w:rFonts w:ascii="Wingdings" w:hAnsi="Wingdings" w:hint="default"/>
+        <w:sz w:val="20"/>
+      </w:rPr>
+    </w:lvl>
+    <w:lvl w:ilvl="5" w:tentative="1">
+      <w:start w:val="1"/>
+      <w:numFmt w:val="bullet"/>
+      <w:lvlText w:val=""/>
+      <w:lvlJc w:val="left"/>
+      <w:pPr>
+        <w:tabs>
+          <w:tab w:val="num" w:pos="4320"/>
+        </w:tabs>
+        <w:ind w:left="4320" w:hanging="360"/>
+      </w:pPr>
+      <w:rPr>
+        <w:rFonts w:ascii="Wingdings" w:hAnsi="Wingdings" w:hint="default"/>
+        <w:sz w:val="20"/>
+      </w:rPr>
+    </w:lvl>
+    <w:lvl w:ilvl="6" w:tentative="1">
+      <w:start w:val="1"/>
+      <w:numFmt w:val="bullet"/>
+      <w:lvlText w:val=""/>
+      <w:lvlJc w:val="left"/>
+      <w:pPr>
+        <w:tabs>
+          <w:tab w:val="num" w:pos="5040"/>
+        </w:tabs>
+        <w:ind w:left="5040" w:hanging="360"/>
+      </w:pPr>
+      <w:rPr>
+        <w:rFonts w:ascii="Wingdings" w:hAnsi="Wingdings" w:hint="default"/>
+        <w:sz w:val="20"/>
+      </w:rPr>
+    </w:lvl>
+    <w:lvl w:ilvl="7" w:tentative="1">
+      <w:start w:val="1"/>
+      <w:numFmt w:val="bullet"/>
+      <w:lvlText w:val=""/>
+      <w:lvlJc w:val="left"/>
+      <w:pPr>
+        <w:tabs>
+          <w:tab w:val="num" w:pos="5760"/>
+        </w:tabs>
+        <w:ind w:left="5760" w:hanging="360"/>
+      </w:pPr>
+      <w:rPr>
+        <w:rFonts w:ascii="Wingdings" w:hAnsi="Wingdings" w:hint="default"/>
+        <w:sz w:val="20"/>
+      </w:rPr>
+    </w:lvl>
+    <w:lvl w:ilvl="8" w:tentative="1">
+      <w:start w:val="1"/>
+      <w:numFmt w:val="bullet"/>
+      <w:lvlText w:val=""/>
+      <w:lvlJc w:val="left"/>
+      <w:pPr>
+        <w:tabs>
+          <w:tab w:val="num" w:pos="6480"/>
+        </w:tabs>
+        <w:ind w:left="6480" w:hanging="360"/>
+      </w:pPr>
+      <w:rPr>
+        <w:rFonts w:ascii="Wingdings" w:hAnsi="Wingdings" w:hint="default"/>
+        <w:sz w:val="20"/>
+      </w:rPr>
+    </w:lvl>
+  </w:abstractNum>
+  <w:num w:numId="1" w16cid:durableId="396632326">
+    <w:abstractNumId w:val="3"/>
+  </w:num>
+  <w:num w:numId="2" w16cid:durableId="542257347">
+    <w:abstractNumId w:val="0"/>
+  </w:num>
+  <w:num w:numId="3" w16cid:durableId="1398943642">
+    <w:abstractNumId w:val="4"/>
+  </w:num>
+  <w:num w:numId="4" w16cid:durableId="35741857">
     <w:abstractNumId w:val="1"/>
   </w:num>
-  <w:num w:numId="2" w16cid:durableId="1800957236">
-    <w:abstractNumId w:val="0"/>
-  </w:num>
-  <w:num w:numId="3" w16cid:durableId="1349287813">
+  <w:num w:numId="5" w16cid:durableId="1086267174">
     <w:abstractNumId w:val="2"/>
   </w:num>
 </w:numbering>

</xml_diff>

<commit_message>
Đưa bước tạo CSDL và chạy localhost vào video demo (Cảnh 2)
Script đặt lại dữ liệu mặc định chỉ dọn dẹp và build sẵn; thêm -ChayWeb để chạy thử.

Co-Authored-By: Claude Opus 5.5 <noreply@anthropic.com>
</commit_message>
<xml_diff>
--- a/docs/demo/KichBanVideoDemo.docx
+++ b/docs/demo/KichBanVideoDemo.docx
@@ -43,7 +43,175 @@
           <w:sz w:val="26"/>
           <w:szCs w:val="26"/>
         </w:rPr>
-        <w:t>ng 10 phút, đi tr</w:t>
+        <w:t>ng 10 phút. Video b</w:t>
+      </w:r>
+      <w:r>
+        <w:rPr>
+          <w:sz w:val="26"/>
+          <w:szCs w:val="26"/>
+        </w:rPr>
+        <w:t>ắ</w:t>
+      </w:r>
+      <w:r>
+        <w:rPr>
+          <w:sz w:val="26"/>
+          <w:szCs w:val="26"/>
+        </w:rPr>
+        <w:t>t đ</w:t>
+      </w:r>
+      <w:r>
+        <w:rPr>
+          <w:sz w:val="26"/>
+          <w:szCs w:val="26"/>
+        </w:rPr>
+        <w:t>ầ</w:t>
+      </w:r>
+      <w:r>
+        <w:rPr>
+          <w:sz w:val="26"/>
+          <w:szCs w:val="26"/>
+        </w:rPr>
+        <w:t>u t</w:t>
+      </w:r>
+      <w:r>
+        <w:rPr>
+          <w:sz w:val="26"/>
+          <w:szCs w:val="26"/>
+        </w:rPr>
+        <w:t>ừ</w:t>
+      </w:r>
+      <w:r>
+        <w:rPr>
+          <w:sz w:val="26"/>
+          <w:szCs w:val="26"/>
+        </w:rPr>
+        <w:t xml:space="preserve"> lúc máy chưa có cơ s</w:t>
+      </w:r>
+      <w:r>
+        <w:rPr>
+          <w:sz w:val="26"/>
+          <w:szCs w:val="26"/>
+        </w:rPr>
+        <w:t>ở</w:t>
+      </w:r>
+      <w:r>
+        <w:rPr>
+          <w:sz w:val="26"/>
+          <w:szCs w:val="26"/>
+        </w:rPr>
+        <w:t xml:space="preserve"> d</w:t>
+      </w:r>
+      <w:r>
+        <w:rPr>
+          <w:sz w:val="26"/>
+          <w:szCs w:val="26"/>
+        </w:rPr>
+        <w:t>ữ</w:t>
+      </w:r>
+      <w:r>
+        <w:rPr>
+          <w:sz w:val="26"/>
+          <w:szCs w:val="26"/>
+        </w:rPr>
+        <w:t xml:space="preserve"> li</w:t>
+      </w:r>
+      <w:r>
+        <w:rPr>
+          <w:sz w:val="26"/>
+          <w:szCs w:val="26"/>
+        </w:rPr>
+        <w:t>ệ</w:t>
+      </w:r>
+      <w:r>
+        <w:rPr>
+          <w:sz w:val="26"/>
+          <w:szCs w:val="26"/>
+        </w:rPr>
+        <w:t>u: t</w:t>
+      </w:r>
+      <w:r>
+        <w:rPr>
+          <w:sz w:val="26"/>
+          <w:szCs w:val="26"/>
+        </w:rPr>
+        <w:t>ạ</w:t>
+      </w:r>
+      <w:r>
+        <w:rPr>
+          <w:sz w:val="26"/>
+          <w:szCs w:val="26"/>
+        </w:rPr>
+        <w:t>o cơ s</w:t>
+      </w:r>
+      <w:r>
+        <w:rPr>
+          <w:sz w:val="26"/>
+          <w:szCs w:val="26"/>
+        </w:rPr>
+        <w:t>ở</w:t>
+      </w:r>
+      <w:r>
+        <w:rPr>
+          <w:sz w:val="26"/>
+          <w:szCs w:val="26"/>
+        </w:rPr>
+        <w:t xml:space="preserve"> d</w:t>
+      </w:r>
+      <w:r>
+        <w:rPr>
+          <w:sz w:val="26"/>
+          <w:szCs w:val="26"/>
+        </w:rPr>
+        <w:t>ữ</w:t>
+      </w:r>
+      <w:r>
+        <w:rPr>
+          <w:sz w:val="26"/>
+          <w:szCs w:val="26"/>
+        </w:rPr>
+        <w:t xml:space="preserve"> li</w:t>
+      </w:r>
+      <w:r>
+        <w:rPr>
+          <w:sz w:val="26"/>
+          <w:szCs w:val="26"/>
+        </w:rPr>
+        <w:t>ệ</w:t>
+      </w:r>
+      <w:r>
+        <w:rPr>
+          <w:sz w:val="26"/>
+          <w:szCs w:val="26"/>
+        </w:rPr>
+        <w:t>u b</w:t>
+      </w:r>
+      <w:r>
+        <w:rPr>
+          <w:sz w:val="26"/>
+          <w:szCs w:val="26"/>
+        </w:rPr>
+        <w:t>ằ</w:t>
+      </w:r>
+      <w:r>
+        <w:rPr>
+          <w:sz w:val="26"/>
+          <w:szCs w:val="26"/>
+        </w:rPr>
+        <w:t>ng migration và ch</w:t>
+      </w:r>
+      <w:r>
+        <w:rPr>
+          <w:sz w:val="26"/>
+          <w:szCs w:val="26"/>
+        </w:rPr>
+        <w:t>ạ</w:t>
+      </w:r>
+      <w:r>
+        <w:rPr>
+          <w:sz w:val="26"/>
+          <w:szCs w:val="26"/>
+        </w:rPr>
+        <w:t>y website lên localhost, sau đó đi tr</w:t>
       </w:r>
       <w:r>
         <w:rPr>
@@ -703,7 +871,35 @@
           <w:sz w:val="26"/>
           <w:szCs w:val="26"/>
         </w:rPr>
-        <w:t>Ph</w:t>
+        <w:t>M</w:t>
+      </w:r>
+      <w:r>
+        <w:rPr>
+          <w:sz w:val="26"/>
+          <w:szCs w:val="26"/>
+        </w:rPr>
+        <w:t>ụ</w:t>
+      </w:r>
+      <w:r>
+        <w:rPr>
+          <w:sz w:val="26"/>
+          <w:szCs w:val="26"/>
+        </w:rPr>
+        <w:t>c 1.1–1.2 ch</w:t>
+      </w:r>
+      <w:r>
+        <w:rPr>
+          <w:sz w:val="26"/>
+          <w:szCs w:val="26"/>
+        </w:rPr>
+        <w:t>ỉ</w:t>
+      </w:r>
+      <w:r>
+        <w:rPr>
+          <w:sz w:val="26"/>
+          <w:szCs w:val="26"/>
+        </w:rPr>
+        <w:t xml:space="preserve"> c</w:t>
       </w:r>
       <w:r>
         <w:rPr>
@@ -717,21 +913,21 @@
           <w:sz w:val="26"/>
           <w:szCs w:val="26"/>
         </w:rPr>
-        <w:t>n này ch</w:t>
-      </w:r>
-      <w:r>
-        <w:rPr>
-          <w:sz w:val="26"/>
-          <w:szCs w:val="26"/>
-        </w:rPr>
-        <w:t>ỉ</w:t>
-      </w:r>
-      <w:r>
-        <w:rPr>
-          <w:sz w:val="26"/>
-          <w:szCs w:val="26"/>
-        </w:rPr>
-        <w:t xml:space="preserve"> c</w:t>
+        <w:t>n làm m</w:t>
+      </w:r>
+      <w:r>
+        <w:rPr>
+          <w:sz w:val="26"/>
+          <w:szCs w:val="26"/>
+        </w:rPr>
+        <w:t>ộ</w:t>
+      </w:r>
+      <w:r>
+        <w:rPr>
+          <w:sz w:val="26"/>
+          <w:szCs w:val="26"/>
+        </w:rPr>
+        <w:t>t l</w:t>
       </w:r>
       <w:r>
         <w:rPr>
@@ -745,7 +941,175 @@
           <w:sz w:val="26"/>
           <w:szCs w:val="26"/>
         </w:rPr>
-        <w:t>n làm m</w:t>
+        <w:t>n trên máy dùng đ</w:t>
+      </w:r>
+      <w:r>
+        <w:rPr>
+          <w:sz w:val="26"/>
+          <w:szCs w:val="26"/>
+        </w:rPr>
+        <w:t>ể</w:t>
+      </w:r>
+      <w:r>
+        <w:rPr>
+          <w:sz w:val="26"/>
+          <w:szCs w:val="26"/>
+        </w:rPr>
+        <w:t xml:space="preserve"> quay. M</w:t>
+      </w:r>
+      <w:r>
+        <w:rPr>
+          <w:sz w:val="26"/>
+          <w:szCs w:val="26"/>
+        </w:rPr>
+        <w:t>ụ</w:t>
+      </w:r>
+      <w:r>
+        <w:rPr>
+          <w:sz w:val="26"/>
+          <w:szCs w:val="26"/>
+        </w:rPr>
+        <w:t>c 1.3–1.4 là các bư</w:t>
+      </w:r>
+      <w:r>
+        <w:rPr>
+          <w:sz w:val="26"/>
+          <w:szCs w:val="26"/>
+        </w:rPr>
+        <w:t>ớ</w:t>
+      </w:r>
+      <w:r>
+        <w:rPr>
+          <w:sz w:val="26"/>
+          <w:szCs w:val="26"/>
+        </w:rPr>
+        <w:t>c s</w:t>
+      </w:r>
+      <w:r>
+        <w:rPr>
+          <w:sz w:val="26"/>
+          <w:szCs w:val="26"/>
+        </w:rPr>
+        <w:t>ẽ</w:t>
+      </w:r>
+      <w:r>
+        <w:rPr>
+          <w:sz w:val="26"/>
+          <w:szCs w:val="26"/>
+        </w:rPr>
+        <w:t xml:space="preserve"> đư</w:t>
+      </w:r>
+      <w:r>
+        <w:rPr>
+          <w:sz w:val="26"/>
+          <w:szCs w:val="26"/>
+        </w:rPr>
+        <w:t>ợ</w:t>
+      </w:r>
+      <w:r>
+        <w:rPr>
+          <w:sz w:val="26"/>
+          <w:szCs w:val="26"/>
+        </w:rPr>
+        <w:t>c làm l</w:t>
+      </w:r>
+      <w:r>
+        <w:rPr>
+          <w:sz w:val="26"/>
+          <w:szCs w:val="26"/>
+        </w:rPr>
+        <w:t>ạ</w:t>
+      </w:r>
+      <w:r>
+        <w:rPr>
+          <w:sz w:val="26"/>
+          <w:szCs w:val="26"/>
+        </w:rPr>
+        <w:t>i trư</w:t>
+      </w:r>
+      <w:r>
+        <w:rPr>
+          <w:sz w:val="26"/>
+          <w:szCs w:val="26"/>
+        </w:rPr>
+        <w:t>ớ</w:t>
+      </w:r>
+      <w:r>
+        <w:rPr>
+          <w:sz w:val="26"/>
+          <w:szCs w:val="26"/>
+        </w:rPr>
+        <w:t xml:space="preserve">c </w:t>
+      </w:r>
+      <w:r>
+        <w:rPr>
+          <w:sz w:val="26"/>
+          <w:szCs w:val="26"/>
+        </w:rPr>
+        <w:t>ố</w:t>
+      </w:r>
+      <w:r>
+        <w:rPr>
+          <w:sz w:val="26"/>
+          <w:szCs w:val="26"/>
+        </w:rPr>
+        <w:t xml:space="preserve">ng kính </w:t>
+      </w:r>
+      <w:r>
+        <w:rPr>
+          <w:sz w:val="26"/>
+          <w:szCs w:val="26"/>
+        </w:rPr>
+        <w:t>ở</w:t>
+      </w:r>
+      <w:r>
+        <w:rPr>
+          <w:sz w:val="26"/>
+          <w:szCs w:val="26"/>
+        </w:rPr>
+        <w:t xml:space="preserve"> C</w:t>
+      </w:r>
+      <w:r>
+        <w:rPr>
+          <w:sz w:val="26"/>
+          <w:szCs w:val="26"/>
+        </w:rPr>
+        <w:t>ả</w:t>
+      </w:r>
+      <w:r>
+        <w:rPr>
+          <w:sz w:val="26"/>
+          <w:szCs w:val="26"/>
+        </w:rPr>
+        <w:t>nh 2; nên ch</w:t>
+      </w:r>
+      <w:r>
+        <w:rPr>
+          <w:sz w:val="26"/>
+          <w:szCs w:val="26"/>
+        </w:rPr>
+        <w:t>ạ</w:t>
+      </w:r>
+      <w:r>
+        <w:rPr>
+          <w:sz w:val="26"/>
+          <w:szCs w:val="26"/>
+        </w:rPr>
+        <w:t>y th</w:t>
+      </w:r>
+      <w:r>
+        <w:rPr>
+          <w:sz w:val="26"/>
+          <w:szCs w:val="26"/>
+        </w:rPr>
+        <w:t>ử</w:t>
+      </w:r>
+      <w:r>
+        <w:rPr>
+          <w:sz w:val="26"/>
+          <w:szCs w:val="26"/>
+        </w:rPr>
+        <w:t xml:space="preserve"> m</w:t>
       </w:r>
       <w:r>
         <w:rPr>
@@ -773,7 +1137,21 @@
           <w:sz w:val="26"/>
           <w:szCs w:val="26"/>
         </w:rPr>
-        <w:t>n trên máy dùng đ</w:t>
+        <w:t>n trư</w:t>
+      </w:r>
+      <w:r>
+        <w:rPr>
+          <w:sz w:val="26"/>
+          <w:szCs w:val="26"/>
+        </w:rPr>
+        <w:t>ớ</w:t>
+      </w:r>
+      <w:r>
+        <w:rPr>
+          <w:sz w:val="26"/>
+          <w:szCs w:val="26"/>
+        </w:rPr>
+        <w:t>c đ</w:t>
       </w:r>
       <w:r>
         <w:rPr>
@@ -787,21 +1165,63 @@
           <w:sz w:val="26"/>
           <w:szCs w:val="26"/>
         </w:rPr>
-        <w:t xml:space="preserve"> quay. N</w:t>
-      </w:r>
-      <w:r>
-        <w:rPr>
-          <w:sz w:val="26"/>
-          <w:szCs w:val="26"/>
-        </w:rPr>
-        <w:t>ế</w:t>
-      </w:r>
-      <w:r>
-        <w:rPr>
-          <w:sz w:val="26"/>
-          <w:szCs w:val="26"/>
-        </w:rPr>
-        <w:t>u website đã ch</w:t>
+        <w:t xml:space="preserve"> ch</w:t>
+      </w:r>
+      <w:r>
+        <w:rPr>
+          <w:sz w:val="26"/>
+          <w:szCs w:val="26"/>
+        </w:rPr>
+        <w:t>ắ</w:t>
+      </w:r>
+      <w:r>
+        <w:rPr>
+          <w:sz w:val="26"/>
+          <w:szCs w:val="26"/>
+        </w:rPr>
+        <w:t>c ch</w:t>
+      </w:r>
+      <w:r>
+        <w:rPr>
+          <w:sz w:val="26"/>
+          <w:szCs w:val="26"/>
+        </w:rPr>
+        <w:t>ắ</w:t>
+      </w:r>
+      <w:r>
+        <w:rPr>
+          <w:sz w:val="26"/>
+          <w:szCs w:val="26"/>
+        </w:rPr>
+        <w:t>n máy không g</w:t>
+      </w:r>
+      <w:r>
+        <w:rPr>
+          <w:sz w:val="26"/>
+          <w:szCs w:val="26"/>
+        </w:rPr>
+        <w:t>ặ</w:t>
+      </w:r>
+      <w:r>
+        <w:rPr>
+          <w:sz w:val="26"/>
+          <w:szCs w:val="26"/>
+        </w:rPr>
+        <w:t>p l</w:t>
+      </w:r>
+      <w:r>
+        <w:rPr>
+          <w:sz w:val="26"/>
+          <w:szCs w:val="26"/>
+        </w:rPr>
+        <w:t>ỗ</w:t>
+      </w:r>
+      <w:r>
+        <w:rPr>
+          <w:sz w:val="26"/>
+          <w:szCs w:val="26"/>
+        </w:rPr>
+        <w:t>i, sau đó ch</w:t>
       </w:r>
       <w:r>
         <w:rPr>
@@ -815,35 +1235,21 @@
           <w:sz w:val="26"/>
           <w:szCs w:val="26"/>
         </w:rPr>
-        <w:t>y đư</w:t>
-      </w:r>
-      <w:r>
-        <w:rPr>
-          <w:sz w:val="26"/>
-          <w:szCs w:val="26"/>
-        </w:rPr>
-        <w:t>ợ</w:t>
-      </w:r>
-      <w:r>
-        <w:rPr>
-          <w:sz w:val="26"/>
-          <w:szCs w:val="26"/>
-        </w:rPr>
-        <w:t>c t</w:t>
-      </w:r>
-      <w:r>
-        <w:rPr>
-          <w:sz w:val="26"/>
-          <w:szCs w:val="26"/>
-        </w:rPr>
-        <w:t>ạ</w:t>
-      </w:r>
-      <w:r>
-        <w:rPr>
-          <w:sz w:val="26"/>
-          <w:szCs w:val="26"/>
-        </w:rPr>
-        <w:t>i http://localhost:5080 thì chuy</w:t>
+        <w:t>y dat_lai_du_lieu.ps1 (m</w:t>
+      </w:r>
+      <w:r>
+        <w:rPr>
+          <w:sz w:val="26"/>
+          <w:szCs w:val="26"/>
+        </w:rPr>
+        <w:t>ụ</w:t>
+      </w:r>
+      <w:r>
+        <w:rPr>
+          <w:sz w:val="26"/>
+          <w:szCs w:val="26"/>
+        </w:rPr>
+        <w:t>c 2.1) đ</w:t>
       </w:r>
       <w:r>
         <w:rPr>
@@ -857,21 +1263,21 @@
           <w:sz w:val="26"/>
           <w:szCs w:val="26"/>
         </w:rPr>
-        <w:t>n sang m</w:t>
-      </w:r>
-      <w:r>
-        <w:rPr>
-          <w:sz w:val="26"/>
-          <w:szCs w:val="26"/>
-        </w:rPr>
-        <w:t>ụ</w:t>
-      </w:r>
-      <w:r>
-        <w:rPr>
-          <w:sz w:val="26"/>
-          <w:szCs w:val="26"/>
-        </w:rPr>
-        <w:t>c 2.</w:t>
+        <w:t xml:space="preserve"> xóa đi trư</w:t>
+      </w:r>
+      <w:r>
+        <w:rPr>
+          <w:sz w:val="26"/>
+          <w:szCs w:val="26"/>
+        </w:rPr>
+        <w:t>ớ</w:t>
+      </w:r>
+      <w:r>
+        <w:rPr>
+          <w:sz w:val="26"/>
+          <w:szCs w:val="26"/>
+        </w:rPr>
+        <w:t>c khi quay.</w:t>
       </w:r>
     </w:p>
     <w:p>
@@ -1367,7 +1773,13 @@
               <w:t>ể</w:t>
             </w:r>
             <w:r>
-              <w:t xml:space="preserve"> xem cơ s</w:t>
+              <w:t xml:space="preserve"> cho th</w:t>
+            </w:r>
+            <w:r>
+              <w:t>ấ</w:t>
+            </w:r>
+            <w:r>
+              <w:t>y cơ s</w:t>
             </w:r>
             <w:r>
               <w:t>ở</w:t>
@@ -1385,25 +1797,25 @@
               <w:t>ệ</w:t>
             </w:r>
             <w:r>
-              <w:t>u khi quay c</w:t>
+              <w:t>u đư</w:t>
+            </w:r>
+            <w:r>
+              <w:t>ợ</w:t>
+            </w:r>
+            <w:r>
+              <w:t>c t</w:t>
+            </w:r>
+            <w:r>
+              <w:t>ạ</w:t>
+            </w:r>
+            <w:r>
+              <w:t>o trong C</w:t>
             </w:r>
             <w:r>
               <w:t>ả</w:t>
             </w:r>
             <w:r>
-              <w:t>nh m</w:t>
-            </w:r>
-            <w:r>
-              <w:t>ở</w:t>
-            </w:r>
-            <w:r>
-              <w:t xml:space="preserve"> đ</w:t>
-            </w:r>
-            <w:r>
-              <w:t>ầ</w:t>
-            </w:r>
-            <w:r>
-              <w:t>u</w:t>
+              <w:t>nh 2</w:t>
             </w:r>
           </w:p>
         </w:tc>
@@ -1802,10 +2214,7 @@
         <w:pStyle w:val="code"/>
       </w:pPr>
       <w:r>
-        <w:t>git clone </w:t>
-      </w:r>
-      <w:r>
-        <w:t>https://github.com/taophuong/TVU.git</w:t>
+        <w:t>git clone https://github.com/taophuong/TVU.git</w:t>
       </w:r>
       <w:r>
         <w:br/>
@@ -1825,6 +2234,7 @@
           <w:sz w:val="26"/>
           <w:szCs w:val="26"/>
         </w:rPr>
+        <w:lastRenderedPageBreak/>
         <w:t>Ho</w:t>
       </w:r>
       <w:r>
@@ -2063,7 +2473,6 @@
         <w:rPr>
           <w:rFonts w:eastAsia="Times New Roman"/>
         </w:rPr>
-        <w:lastRenderedPageBreak/>
         <w:t>1.3. Tạo cơ sở dữ liệu</w:t>
       </w:r>
     </w:p>
@@ -2686,14 +3095,7 @@
           <w:sz w:val="26"/>
           <w:szCs w:val="26"/>
         </w:rPr>
-        <w:t xml:space="preserve"> </w:t>
-      </w:r>
-      <w:r>
-        <w:rPr>
-          <w:sz w:val="26"/>
-          <w:szCs w:val="26"/>
-        </w:rPr>
-        <w:t>t</w:t>
+        <w:t xml:space="preserve"> t</w:t>
       </w:r>
       <w:r>
         <w:rPr>
@@ -3047,7 +3449,14 @@
           <w:sz w:val="26"/>
           <w:szCs w:val="26"/>
         </w:rPr>
-        <w:t xml:space="preserve"> → Databases → TVUStartupDB → Tables có 14 b</w:t>
+        <w:t xml:space="preserve"> </w:t>
+      </w:r>
+      <w:r>
+        <w:rPr>
+          <w:sz w:val="26"/>
+          <w:szCs w:val="26"/>
+        </w:rPr>
+        <w:t>→ Databases → TVUStartupDB → Tables có 14 b</w:t>
       </w:r>
       <w:r>
         <w:rPr>
@@ -3303,6 +3712,7 @@
           <w:sz w:val="26"/>
           <w:szCs w:val="26"/>
         </w:rPr>
+        <w:lastRenderedPageBreak/>
         <w:t xml:space="preserve">Lần đầu sẽ mất khoảng 30 giây – 1 phút để build và tạo cơ sở dữ liệu. Khi cửa sổ hiện dòng </w:t>
       </w:r>
       <w:r>
@@ -3340,7 +3750,6 @@
           <w:sz w:val="26"/>
           <w:szCs w:val="26"/>
         </w:rPr>
-        <w:lastRenderedPageBreak/>
         <w:t>Mở trình duyệt, vào http://localhost:5080 → thấy trang chủ TVU Startup với banner và dự án nổi bật là thành công.</w:t>
       </w:r>
     </w:p>
@@ -3416,8 +3825,8 @@
         <w:tblLook w:val="04A0" w:firstRow="1" w:lastRow="0" w:firstColumn="1" w:lastColumn="0" w:noHBand="0" w:noVBand="1"/>
       </w:tblPr>
       <w:tblGrid>
-        <w:gridCol w:w="3403"/>
-        <w:gridCol w:w="5653"/>
+        <w:gridCol w:w="3165"/>
+        <w:gridCol w:w="5891"/>
       </w:tblGrid>
       <w:tr>
         <w:tc>
@@ -4104,37 +4513,220 @@
               <w:t>ạ</w:t>
             </w:r>
             <w:r>
-              <w:t>y dat_lai_du_lieu.ps1 đ</w:t>
+              <w:t>y dat_lai_du_lieu.ps1 r</w:t>
+            </w:r>
+            <w:r>
+              <w:t>ồ</w:t>
+            </w:r>
+            <w:r>
+              <w:t>i làm l</w:t>
+            </w:r>
+            <w:r>
+              <w:t>ạ</w:t>
+            </w:r>
+            <w:r>
+              <w:t>i m</w:t>
+            </w:r>
+            <w:r>
+              <w:t>ụ</w:t>
+            </w:r>
+            <w:r>
+              <w:t>c 1.3–1.4.</w:t>
+            </w:r>
+          </w:p>
+        </w:tc>
+      </w:tr>
+      <w:tr>
+        <w:tc>
+          <w:tcPr>
+            <w:tcW w:w="0" w:type="auto"/>
+            <w:tcBorders>
+              <w:top w:val="single" w:sz="6" w:space="0" w:color="000000"/>
+              <w:left w:val="single" w:sz="6" w:space="0" w:color="000000"/>
+              <w:bottom w:val="single" w:sz="6" w:space="0" w:color="000000"/>
+              <w:right w:val="single" w:sz="6" w:space="0" w:color="000000"/>
+            </w:tcBorders>
+            <w:tcMar>
+              <w:top w:w="60" w:type="dxa"/>
+              <w:left w:w="100" w:type="dxa"/>
+              <w:bottom w:w="60" w:type="dxa"/>
+              <w:right w:w="100" w:type="dxa"/>
+            </w:tcMar>
+            <w:hideMark/>
+          </w:tcPr>
+          <w:p>
+            <w:pPr>
+              <w:spacing w:line="288" w:lineRule="auto"/>
+            </w:pPr>
+            <w:r>
+              <w:t>Hi</w:t>
+            </w:r>
+            <w:r>
+              <w:t>ệ</w:t>
+            </w:r>
+            <w:r>
+              <w:t>n c</w:t>
+            </w:r>
+            <w:r>
+              <w:t>ả</w:t>
+            </w:r>
+            <w:r>
+              <w:t>nh báo NU1902 (HtmlSanitizer) khi ch</w:t>
+            </w:r>
+            <w:r>
+              <w:t>ạ</w:t>
+            </w:r>
+            <w:r>
+              <w:t>y dotnet run</w:t>
+            </w:r>
+          </w:p>
+        </w:tc>
+        <w:tc>
+          <w:tcPr>
+            <w:tcW w:w="0" w:type="auto"/>
+            <w:tcBorders>
+              <w:top w:val="single" w:sz="6" w:space="0" w:color="000000"/>
+              <w:left w:val="single" w:sz="6" w:space="0" w:color="000000"/>
+              <w:bottom w:val="single" w:sz="6" w:space="0" w:color="000000"/>
+              <w:right w:val="single" w:sz="6" w:space="0" w:color="000000"/>
+            </w:tcBorders>
+            <w:tcMar>
+              <w:top w:w="60" w:type="dxa"/>
+              <w:left w:w="100" w:type="dxa"/>
+              <w:bottom w:w="60" w:type="dxa"/>
+              <w:right w:w="100" w:type="dxa"/>
+            </w:tcMar>
+            <w:hideMark/>
+          </w:tcPr>
+          <w:p>
+            <w:pPr>
+              <w:spacing w:line="288" w:lineRule="auto"/>
+            </w:pPr>
+            <w:r>
+              <w:t>C</w:t>
+            </w:r>
+            <w:r>
+              <w:t>ả</w:t>
+            </w:r>
+            <w:r>
+              <w:t>nh báo c</w:t>
+            </w:r>
+            <w:r>
+              <w:t>ủ</w:t>
+            </w:r>
+            <w:r>
+              <w:t>a NuGet v</w:t>
+            </w:r>
+            <w:r>
+              <w:t>ề</w:t>
+            </w:r>
+            <w:r>
+              <w:t xml:space="preserve"> thư vi</w:t>
+            </w:r>
+            <w:r>
+              <w:t>ệ</w:t>
+            </w:r>
+            <w:r>
+              <w:t xml:space="preserve">n, không </w:t>
+            </w:r>
+            <w:r>
+              <w:t>ả</w:t>
+            </w:r>
+            <w:r>
+              <w:t>nh hư</w:t>
+            </w:r>
+            <w:r>
+              <w:t>ở</w:t>
+            </w:r>
+            <w:r>
+              <w:t>ng ch</w:t>
+            </w:r>
+            <w:r>
+              <w:t>ạ</w:t>
+            </w:r>
+            <w:r>
+              <w:t>y website. Khi quay, dùng tham s</w:t>
+            </w:r>
+            <w:r>
+              <w:t>ố</w:t>
+            </w:r>
+            <w:r>
+              <w:t xml:space="preserve"> </w:t>
+            </w:r>
+            <w:r>
+              <w:rPr>
+                <w:rStyle w:val="HTMLCode"/>
+              </w:rPr>
+              <w:t>--no-build</w:t>
+            </w:r>
+            <w:r>
+              <w:t xml:space="preserve"> (mã ngu</w:t>
+            </w:r>
+            <w:r>
+              <w:t>ồ</w:t>
+            </w:r>
+            <w:r>
+              <w:t>n đã đư</w:t>
+            </w:r>
+            <w:r>
+              <w:t>ợ</w:t>
+            </w:r>
+            <w:r>
+              <w:t>c build s</w:t>
+            </w:r>
+            <w:r>
+              <w:t>ẵ</w:t>
+            </w:r>
+            <w:r>
+              <w:t xml:space="preserve">n </w:t>
+            </w:r>
+            <w:r>
+              <w:t>ở</w:t>
+            </w:r>
+            <w:r>
+              <w:t xml:space="preserve"> m</w:t>
+            </w:r>
+            <w:r>
+              <w:t>ụ</w:t>
+            </w:r>
+            <w:r>
+              <w:t>c 2.1) đ</w:t>
             </w:r>
             <w:r>
               <w:t>ể</w:t>
             </w:r>
             <w:r>
-              <w:t xml:space="preserve"> t</w:t>
-            </w:r>
-            <w:r>
-              <w:t>ạ</w:t>
-            </w:r>
-            <w:r>
-              <w:t>o l</w:t>
-            </w:r>
-            <w:r>
-              <w:t>ạ</w:t>
-            </w:r>
-            <w:r>
-              <w:t>i t</w:t>
-            </w:r>
-            <w:r>
-              <w:t>ừ</w:t>
-            </w:r>
-            <w:r>
-              <w:t xml:space="preserve"> đ</w:t>
-            </w:r>
-            <w:r>
-              <w:t>ầ</w:t>
-            </w:r>
-            <w:r>
-              <w:t>u.</w:t>
+              <w:t xml:space="preserve"> c</w:t>
+            </w:r>
+            <w:r>
+              <w:t>ử</w:t>
+            </w:r>
+            <w:r>
+              <w:t>a s</w:t>
+            </w:r>
+            <w:r>
+              <w:t>ổ</w:t>
+            </w:r>
+            <w:r>
+              <w:t xml:space="preserve"> l</w:t>
+            </w:r>
+            <w:r>
+              <w:t>ệ</w:t>
+            </w:r>
+            <w:r>
+              <w:t>nh không hi</w:t>
+            </w:r>
+            <w:r>
+              <w:t>ệ</w:t>
+            </w:r>
+            <w:r>
+              <w:t>n c</w:t>
+            </w:r>
+            <w:r>
+              <w:t>ả</w:t>
+            </w:r>
+            <w:r>
+              <w:t>nh báo này.</w:t>
             </w:r>
           </w:p>
         </w:tc>
@@ -4188,7 +4780,7 @@
           <w:sz w:val="26"/>
           <w:szCs w:val="26"/>
         </w:rPr>
-        <w:t>Chạy tệp docs/demo/dat_lai_du_lieu.ps1 (chuột phải → Run with PowerShell). Tệp này dừng website, xóa CSDL, xóa ảnh đã tải lên khi chạy thử rồi chạy lại website tại http://localhost:5080 với dữ liệu mẫu sạch.</w:t>
+        <w:t>Chạy tệp docs/demo/dat_lai_du_lieu.ps1 (chuột phải → Run with PowerShell). Tệp này dừng website nếu đang chạy, xóa CSDL TVUStartupDB, xóa ảnh đã tải lên khi chạy thử và build sẵn mã nguồn. Khi cửa sổ báo "Đã sẵn sàng quay: chưa có CSDL, website chưa chạy" thì nhấn Enter để đóng.</w:t>
       </w:r>
     </w:p>
     <w:p>
@@ -4211,7 +4803,7 @@
           <w:sz w:val="26"/>
           <w:szCs w:val="26"/>
         </w:rPr>
-        <w:t>Giữ nguyên cửa sổ PowerShell đó trong suốt lúc quay (đóng là website dừng).</w:t>
+        <w:t>Sau bước này máy ở đúng trạng thái đầu video: SQL Server chưa có TVUStartupDB, website chưa chạy.</w:t>
       </w:r>
     </w:p>
     <w:p>
@@ -4234,7 +4826,44 @@
           <w:sz w:val="26"/>
           <w:szCs w:val="26"/>
         </w:rPr>
-        <w:t>Nếu quay hỏng giữa chừng, chạy lại tệp này rồi quay lại từ đầu, vì dự án demo đã được tạo ở lần quay trước.</w:t>
+        <w:t>Nếu quay hỏng giữa chừng: nhấn Ctrl+C ở cửa sổ đang chạy website, chạy lại tệp này rồi quay lại từ đầu.</w:t>
+      </w:r>
+    </w:p>
+    <w:p>
+      <w:pPr>
+        <w:numPr>
+          <w:ilvl w:val="0"/>
+          <w:numId w:val="3"/>
+        </w:numPr>
+        <w:spacing w:before="100" w:beforeAutospacing="1" w:after="60" w:line="360" w:lineRule="auto"/>
+        <w:jc w:val="both"/>
+        <w:rPr>
+          <w:rFonts w:eastAsia="Times New Roman"/>
+          <w:sz w:val="26"/>
+          <w:szCs w:val="26"/>
+        </w:rPr>
+      </w:pPr>
+      <w:r>
+        <w:rPr>
+          <w:rFonts w:eastAsia="Times New Roman"/>
+          <w:sz w:val="26"/>
+          <w:szCs w:val="26"/>
+        </w:rPr>
+        <w:t xml:space="preserve">Chỉ muốn chạy thử website (không quay): chạy </w:t>
+      </w:r>
+      <w:r>
+        <w:rPr>
+          <w:rStyle w:val="HTMLCode"/>
+        </w:rPr>
+        <w:t>powershell -ExecutionPolicy Bypass -File docs\demo\dat_lai_du_lieu.ps1 -ChayWeb</w:t>
+      </w:r>
+      <w:r>
+        <w:rPr>
+          <w:rFonts w:eastAsia="Times New Roman"/>
+          <w:sz w:val="26"/>
+          <w:szCs w:val="26"/>
+        </w:rPr>
+        <w:t>, website sẽ được tạo lại dữ liệu và chạy luôn tại http://localhost:5080.</w:t>
       </w:r>
     </w:p>
     <w:p>
@@ -6347,7 +6976,7 @@
           <w:sz w:val="26"/>
           <w:szCs w:val="26"/>
         </w:rPr>
-        <w:t>Mở sẵn 3 cửa sổ trình duyệt, mỗi cửa sổ một phiên đăng nhập riêng, đặt ở http://localhost:5080:</w:t>
+        <w:t>Mở sẵn PowerShell tại thư mục TVUStartup.Web (Shift + chuột phải vào thư mục → Open PowerShell window here), phóng to chữ (Ctrl + lăn chuột) để người xem đọc được lệnh. Có thể dùng Terminal trong Visual Studio (View → Terminal) thay cho PowerShell.</w:t>
       </w:r>
     </w:p>
     <w:p>
@@ -6367,20 +6996,10 @@
       <w:r>
         <w:rPr>
           <w:rFonts w:eastAsia="Times New Roman"/>
-          <w:b/>
-          <w:bCs/>
-          <w:sz w:val="26"/>
-          <w:szCs w:val="26"/>
-        </w:rPr>
-        <w:t>Cửa sổ A – Chrome thường:</w:t>
-      </w:r>
-      <w:r>
-        <w:rPr>
-          <w:rFonts w:eastAsia="Times New Roman"/>
-          <w:sz w:val="26"/>
-          <w:szCs w:val="26"/>
-        </w:rPr>
-        <w:t xml:space="preserve"> sinh viên Lê Văn Bình Phương (chưa đăng nhập, sẽ đăng nhập khi quay).</w:t>
+          <w:sz w:val="26"/>
+          <w:szCs w:val="26"/>
+        </w:rPr>
+        <w:t>Mở sẵn SSMS, đã kết nối .\SQLEXPRESS, mở rộng mục Databases (lúc này chưa có TVUStartupDB).</w:t>
       </w:r>
     </w:p>
     <w:p>
@@ -6400,20 +7019,10 @@
       <w:r>
         <w:rPr>
           <w:rFonts w:eastAsia="Times New Roman"/>
-          <w:b/>
-          <w:bCs/>
-          <w:sz w:val="26"/>
-          <w:szCs w:val="26"/>
-        </w:rPr>
-        <w:t>Cửa sổ B – Microsoft Edge:</w:t>
-      </w:r>
-      <w:r>
-        <w:rPr>
-          <w:rFonts w:eastAsia="Times New Roman"/>
-          <w:sz w:val="26"/>
-          <w:szCs w:val="26"/>
-        </w:rPr>
-        <w:t xml:space="preserve"> quản trị viên (chưa đăng nhập).</w:t>
+          <w:sz w:val="26"/>
+          <w:szCs w:val="26"/>
+        </w:rPr>
+        <w:t>Mở sẵn 3 cửa sổ trình duyệt ở trang trống (website chưa chạy nên chưa mở địa chỉ), mỗi cửa sổ một phiên đăng nhập riêng:</w:t>
       </w:r>
     </w:p>
     <w:p>
@@ -6438,7 +7047,7 @@
           <w:sz w:val="26"/>
           <w:szCs w:val="26"/>
         </w:rPr>
-        <w:t>Cửa sổ C – Chrome ẩn danh (Ctrl+Shift+N):</w:t>
+        <w:t>Cửa sổ A – Chrome thường:</w:t>
       </w:r>
       <w:r>
         <w:rPr>
@@ -6446,15 +7055,7 @@
           <w:sz w:val="26"/>
           <w:szCs w:val="26"/>
         </w:rPr>
-        <w:t xml:space="preserve"> </w:t>
-      </w:r>
-      <w:r>
-        <w:rPr>
-          <w:rFonts w:eastAsia="Times New Roman"/>
-          <w:sz w:val="26"/>
-          <w:szCs w:val="26"/>
-        </w:rPr>
-        <w:t>khách, sau đó đăng ký thành sinh viên mới.</w:t>
+        <w:t xml:space="preserve"> sinh viên Lê Văn Bình Phương (chưa đăng nhập, sẽ đăng nhập khi quay).</w:t>
       </w:r>
     </w:p>
     <w:p>
@@ -6474,10 +7075,20 @@
       <w:r>
         <w:rPr>
           <w:rFonts w:eastAsia="Times New Roman"/>
-          <w:sz w:val="26"/>
-          <w:szCs w:val="26"/>
-        </w:rPr>
-        <w:t>Mở sẵn Visual Studio (solution TVUStartup) và SQL Server Management Studio (đã kết nối .\SQLEXPRESS) cho cảnh mở đầu.</w:t>
+          <w:b/>
+          <w:bCs/>
+          <w:sz w:val="26"/>
+          <w:szCs w:val="26"/>
+        </w:rPr>
+        <w:t>Cửa sổ B – Microsoft Edge:</w:t>
+      </w:r>
+      <w:r>
+        <w:rPr>
+          <w:rFonts w:eastAsia="Times New Roman"/>
+          <w:sz w:val="26"/>
+          <w:szCs w:val="26"/>
+        </w:rPr>
+        <w:t xml:space="preserve"> quản trị viên (chưa đăng nhập).</w:t>
       </w:r>
     </w:p>
     <w:p>
@@ -6497,10 +7108,20 @@
       <w:r>
         <w:rPr>
           <w:rFonts w:eastAsia="Times New Roman"/>
-          <w:sz w:val="26"/>
-          <w:szCs w:val="26"/>
-        </w:rPr>
-        <w:t>Mở sẵn thư mục docs/demo/anh_demo để chọn ảnh nhanh.</w:t>
+          <w:b/>
+          <w:bCs/>
+          <w:sz w:val="26"/>
+          <w:szCs w:val="26"/>
+        </w:rPr>
+        <w:t>Cửa sổ C – Chrome ẩn danh (Ctrl+Shift+N):</w:t>
+      </w:r>
+      <w:r>
+        <w:rPr>
+          <w:rFonts w:eastAsia="Times New Roman"/>
+          <w:sz w:val="26"/>
+          <w:szCs w:val="26"/>
+        </w:rPr>
+        <w:t xml:space="preserve"> khách, sau đó đăng ký thành sinh viên mới.</w:t>
       </w:r>
     </w:p>
     <w:p>
@@ -6523,6 +7144,52 @@
           <w:sz w:val="26"/>
           <w:szCs w:val="26"/>
         </w:rPr>
+        <w:t>Mở sẵn Visual Studio (solution TVUStartup) cho cảnh mở đầu.</w:t>
+      </w:r>
+    </w:p>
+    <w:p>
+      <w:pPr>
+        <w:numPr>
+          <w:ilvl w:val="0"/>
+          <w:numId w:val="4"/>
+        </w:numPr>
+        <w:spacing w:before="100" w:beforeAutospacing="1" w:after="60" w:line="360" w:lineRule="auto"/>
+        <w:jc w:val="both"/>
+        <w:rPr>
+          <w:rFonts w:eastAsia="Times New Roman"/>
+          <w:sz w:val="26"/>
+          <w:szCs w:val="26"/>
+        </w:rPr>
+      </w:pPr>
+      <w:r>
+        <w:rPr>
+          <w:rFonts w:eastAsia="Times New Roman"/>
+          <w:sz w:val="26"/>
+          <w:szCs w:val="26"/>
+        </w:rPr>
+        <w:t>Mở sẵn thư mục docs/demo/anh_demo để chọn ảnh nhanh.</w:t>
+      </w:r>
+    </w:p>
+    <w:p>
+      <w:pPr>
+        <w:numPr>
+          <w:ilvl w:val="0"/>
+          <w:numId w:val="4"/>
+        </w:numPr>
+        <w:spacing w:before="100" w:beforeAutospacing="1" w:after="60" w:line="360" w:lineRule="auto"/>
+        <w:jc w:val="both"/>
+        <w:rPr>
+          <w:rFonts w:eastAsia="Times New Roman"/>
+          <w:sz w:val="26"/>
+          <w:szCs w:val="26"/>
+        </w:rPr>
+      </w:pPr>
+      <w:r>
+        <w:rPr>
+          <w:rFonts w:eastAsia="Times New Roman"/>
+          <w:sz w:val="26"/>
+          <w:szCs w:val="26"/>
+        </w:rPr>
         <w:t>Phần mềm quay: OBS Studio (Display Capture, 1920×1080, 30 fps, có micro) hoặc Xbox Game Bar (Win+Alt+R). Quay thử 10 giây để kiểm tra tiếng trước khi quay thật.</w:t>
       </w:r>
     </w:p>
@@ -6537,6 +7204,12 @@
         <w:rPr>
           <w:rFonts w:eastAsia="Times New Roman"/>
         </w:rPr>
+        <w:br w:type="page"/>
+      </w:r>
+      <w:r>
+        <w:rPr>
+          <w:rFonts w:eastAsia="Times New Roman"/>
+        </w:rPr>
         <w:t>3. Kịch bản chi tiết</w:t>
       </w:r>
     </w:p>
@@ -6551,7 +7224,7 @@
         <w:rPr>
           <w:rFonts w:eastAsia="Times New Roman"/>
         </w:rPr>
-        <w:t>Cảnh 1. Mở đầu (0:00 – 0:40)</w:t>
+        <w:t>Cảnh 1. Mở đầu (0:00 – 0:30)</w:t>
       </w:r>
     </w:p>
     <w:tbl>
@@ -6566,8 +7239,8 @@
         <w:tblLook w:val="04A0" w:firstRow="1" w:lastRow="0" w:firstColumn="1" w:lastColumn="0" w:noHBand="0" w:noVBand="1"/>
       </w:tblPr>
       <w:tblGrid>
-        <w:gridCol w:w="3627"/>
-        <w:gridCol w:w="5429"/>
+        <w:gridCol w:w="3463"/>
+        <w:gridCol w:w="5593"/>
       </w:tblGrid>
       <w:tr>
         <w:tc>
@@ -6710,7 +7383,7 @@
               <w:t>ụ</w:t>
             </w:r>
             <w:r>
-              <w:t>c Controllers, Areas/Admin, Data, Services</w:t>
+              <w:t>c Controllers, Areas/Admin, Data, Services, Views</w:t>
             </w:r>
           </w:p>
         </w:tc>
@@ -6814,298 +7487,19 @@
               <w:t>ằ</w:t>
             </w:r>
             <w:r>
-              <w:t>ng ASP.NET Core MVC .NET 8.</w:t>
-            </w:r>
-          </w:p>
-        </w:tc>
-      </w:tr>
-      <w:tr>
-        <w:tc>
-          <w:tcPr>
-            <w:tcW w:w="0" w:type="auto"/>
-            <w:tcBorders>
-              <w:top w:val="single" w:sz="6" w:space="0" w:color="000000"/>
-              <w:left w:val="single" w:sz="6" w:space="0" w:color="000000"/>
-              <w:bottom w:val="single" w:sz="6" w:space="0" w:color="000000"/>
-              <w:right w:val="single" w:sz="6" w:space="0" w:color="000000"/>
-            </w:tcBorders>
-            <w:tcMar>
-              <w:top w:w="60" w:type="dxa"/>
-              <w:left w:w="100" w:type="dxa"/>
-              <w:bottom w:w="60" w:type="dxa"/>
-              <w:right w:w="100" w:type="dxa"/>
-            </w:tcMar>
-            <w:hideMark/>
-          </w:tcPr>
-          <w:p>
-            <w:pPr>
-              <w:spacing w:line="288" w:lineRule="auto"/>
-            </w:pPr>
-            <w:r>
-              <w:t>Chuy</w:t>
-            </w:r>
-            <w:r>
-              <w:t>ể</w:t>
-            </w:r>
-            <w:r>
-              <w:t>n sang SSMS, m</w:t>
-            </w:r>
-            <w:r>
-              <w:t>ở</w:t>
-            </w:r>
-            <w:r>
-              <w:t xml:space="preserve"> TVUStartupDB → Tables</w:t>
-            </w:r>
-          </w:p>
-        </w:tc>
-        <w:tc>
-          <w:tcPr>
-            <w:tcW w:w="0" w:type="auto"/>
-            <w:tcBorders>
-              <w:top w:val="single" w:sz="6" w:space="0" w:color="000000"/>
-              <w:left w:val="single" w:sz="6" w:space="0" w:color="000000"/>
-              <w:bottom w:val="single" w:sz="6" w:space="0" w:color="000000"/>
-              <w:right w:val="single" w:sz="6" w:space="0" w:color="000000"/>
-            </w:tcBorders>
-            <w:tcMar>
-              <w:top w:w="60" w:type="dxa"/>
-              <w:left w:w="100" w:type="dxa"/>
-              <w:bottom w:w="60" w:type="dxa"/>
-              <w:right w:w="100" w:type="dxa"/>
-            </w:tcMar>
-            <w:hideMark/>
-          </w:tcPr>
-          <w:p>
-            <w:pPr>
-              <w:spacing w:line="288" w:lineRule="auto"/>
-            </w:pPr>
-            <w:r>
-              <w:t>Cơ s</w:t>
-            </w:r>
-            <w:r>
-              <w:t>ở</w:t>
-            </w:r>
-            <w:r>
-              <w:t xml:space="preserve"> d</w:t>
-            </w:r>
-            <w:r>
-              <w:t>ữ</w:t>
-            </w:r>
-            <w:r>
-              <w:t xml:space="preserve"> li</w:t>
-            </w:r>
-            <w:r>
-              <w:t>ệ</w:t>
-            </w:r>
-            <w:r>
-              <w:t>u SQL Server g</w:t>
-            </w:r>
-            <w:r>
-              <w:t>ồ</w:t>
-            </w:r>
-            <w:r>
-              <w:t>m 14 b</w:t>
-            </w:r>
-            <w:r>
-              <w:t>ả</w:t>
-            </w:r>
-            <w:r>
-              <w:t>ng, đư</w:t>
-            </w:r>
-            <w:r>
-              <w:t>ợ</w:t>
-            </w:r>
-            <w:r>
-              <w:t>c t</w:t>
-            </w:r>
-            <w:r>
-              <w:t>ạ</w:t>
-            </w:r>
-            <w:r>
-              <w:t>o b</w:t>
-            </w:r>
-            <w:r>
-              <w:t>ằ</w:t>
-            </w:r>
-            <w:r>
-              <w:t>ng migration c</w:t>
-            </w:r>
-            <w:r>
-              <w:t>ủ</w:t>
-            </w:r>
-            <w:r>
-              <w:t>a Entity Framework Core và n</w:t>
-            </w:r>
-            <w:r>
-              <w:t>ạ</w:t>
-            </w:r>
-            <w:r>
-              <w:t>p d</w:t>
-            </w:r>
-            <w:r>
-              <w:t>ữ</w:t>
-            </w:r>
-            <w:r>
-              <w:t xml:space="preserve"> li</w:t>
-            </w:r>
-            <w:r>
-              <w:t>ệ</w:t>
-            </w:r>
-            <w:r>
-              <w:t>u m</w:t>
-            </w:r>
-            <w:r>
-              <w:t>ẫ</w:t>
-            </w:r>
-            <w:r>
-              <w:t>u khi website kh</w:t>
-            </w:r>
-            <w:r>
-              <w:t>ở</w:t>
-            </w:r>
-            <w:r>
-              <w:t>i đ</w:t>
-            </w:r>
-            <w:r>
-              <w:t>ộ</w:t>
-            </w:r>
-            <w:r>
-              <w:t>ng.</w:t>
-            </w:r>
-          </w:p>
-        </w:tc>
-      </w:tr>
-      <w:tr>
-        <w:tc>
-          <w:tcPr>
-            <w:tcW w:w="0" w:type="auto"/>
-            <w:tcBorders>
-              <w:top w:val="single" w:sz="6" w:space="0" w:color="000000"/>
-              <w:left w:val="single" w:sz="6" w:space="0" w:color="000000"/>
-              <w:bottom w:val="single" w:sz="6" w:space="0" w:color="000000"/>
-              <w:right w:val="single" w:sz="6" w:space="0" w:color="000000"/>
-            </w:tcBorders>
-            <w:tcMar>
-              <w:top w:w="60" w:type="dxa"/>
-              <w:left w:w="100" w:type="dxa"/>
-              <w:bottom w:w="60" w:type="dxa"/>
-              <w:right w:w="100" w:type="dxa"/>
-            </w:tcMar>
-            <w:hideMark/>
-          </w:tcPr>
-          <w:p>
-            <w:pPr>
-              <w:spacing w:line="288" w:lineRule="auto"/>
-            </w:pPr>
-            <w:r>
-              <w:t>Chuy</w:t>
-            </w:r>
-            <w:r>
-              <w:t>ể</w:t>
-            </w:r>
-            <w:r>
-              <w:t>n sang c</w:t>
-            </w:r>
-            <w:r>
-              <w:t>ử</w:t>
-            </w:r>
-            <w:r>
-              <w:t>a s</w:t>
+              <w:t>ng ASP.NET Core MVC .NET 8, t</w:t>
             </w:r>
             <w:r>
               <w:t>ổ</w:t>
             </w:r>
             <w:r>
-              <w:t xml:space="preserve"> C, đang </w:t>
-            </w:r>
-            <w:r>
-              <w:t>ở</w:t>
-            </w:r>
-            <w:r>
-              <w:t xml:space="preserve"> trang ch</w:t>
-            </w:r>
-            <w:r>
-              <w:t>ủ</w:t>
-            </w:r>
-          </w:p>
-        </w:tc>
-        <w:tc>
-          <w:tcPr>
-            <w:tcW w:w="0" w:type="auto"/>
-            <w:tcBorders>
-              <w:top w:val="single" w:sz="6" w:space="0" w:color="000000"/>
-              <w:left w:val="single" w:sz="6" w:space="0" w:color="000000"/>
-              <w:bottom w:val="single" w:sz="6" w:space="0" w:color="000000"/>
-              <w:right w:val="single" w:sz="6" w:space="0" w:color="000000"/>
-            </w:tcBorders>
-            <w:tcMar>
-              <w:top w:w="60" w:type="dxa"/>
-              <w:left w:w="100" w:type="dxa"/>
-              <w:bottom w:w="60" w:type="dxa"/>
-              <w:right w:w="100" w:type="dxa"/>
-            </w:tcMar>
-            <w:hideMark/>
-          </w:tcPr>
-          <w:p>
-            <w:pPr>
-              <w:spacing w:line="288" w:lineRule="auto"/>
-            </w:pPr>
-            <w:r>
-              <w:t>Em s</w:t>
-            </w:r>
-            <w:r>
-              <w:t>ẽ</w:t>
-            </w:r>
-            <w:r>
-              <w:t xml:space="preserve"> demo theo đúng vòng đ</w:t>
-            </w:r>
-            <w:r>
-              <w:t>ờ</w:t>
-            </w:r>
-            <w:r>
-              <w:t>i c</w:t>
-            </w:r>
-            <w:r>
-              <w:t>ủ</w:t>
-            </w:r>
-            <w:r>
-              <w:t>a m</w:t>
-            </w:r>
-            <w:r>
-              <w:t>ộ</w:t>
-            </w:r>
-            <w:r>
-              <w:t>t d</w:t>
-            </w:r>
-            <w:r>
-              <w:t>ự</w:t>
-            </w:r>
-            <w:r>
-              <w:t xml:space="preserve"> án, t</w:t>
-            </w:r>
-            <w:r>
-              <w:t>ừ</w:t>
-            </w:r>
-            <w:r>
-              <w:t xml:space="preserve"> lúc sinh viên đăng cho đ</w:t>
-            </w:r>
-            <w:r>
-              <w:t>ế</w:t>
-            </w:r>
-            <w:r>
-              <w:t>n khi đư</w:t>
-            </w:r>
-            <w:r>
-              <w:t>ợ</w:t>
-            </w:r>
-            <w:r>
-              <w:t>c duy</w:t>
-            </w:r>
-            <w:r>
-              <w:t>ệ</w:t>
-            </w:r>
-            <w:r>
-              <w:t>t và công khai.</w:t>
+              <w:t xml:space="preserve"> ch</w:t>
+            </w:r>
+            <w:r>
+              <w:t>ứ</w:t>
+            </w:r>
+            <w:r>
+              <w:t>c theo mô hình MVC.</w:t>
             </w:r>
           </w:p>
         </w:tc>
@@ -7122,7 +7516,1228 @@
         <w:rPr>
           <w:rFonts w:eastAsia="Times New Roman"/>
         </w:rPr>
-        <w:t>Cảnh 2. Khách xem và tìm kiếm dự án (0:40 – 2:30) – cửa sổ C</w:t>
+        <w:t>Cảnh 2. Khởi tạo cơ sở dữ liệu và chạy website (0:30 – 1:45)</w:t>
+      </w:r>
+    </w:p>
+    <w:tbl>
+      <w:tblPr>
+        <w:tblW w:w="5000" w:type="pct"/>
+        <w:tblCellMar>
+          <w:top w:w="15" w:type="dxa"/>
+          <w:left w:w="15" w:type="dxa"/>
+          <w:bottom w:w="15" w:type="dxa"/>
+          <w:right w:w="15" w:type="dxa"/>
+        </w:tblCellMar>
+        <w:tblLook w:val="04A0" w:firstRow="1" w:lastRow="0" w:firstColumn="1" w:lastColumn="0" w:noHBand="0" w:noVBand="1"/>
+      </w:tblPr>
+      <w:tblGrid>
+        <w:gridCol w:w="5108"/>
+        <w:gridCol w:w="3948"/>
+      </w:tblGrid>
+      <w:tr>
+        <w:tc>
+          <w:tcPr>
+            <w:tcW w:w="0" w:type="auto"/>
+            <w:tcBorders>
+              <w:top w:val="single" w:sz="6" w:space="0" w:color="000000"/>
+              <w:left w:val="single" w:sz="6" w:space="0" w:color="000000"/>
+              <w:bottom w:val="single" w:sz="6" w:space="0" w:color="000000"/>
+              <w:right w:val="single" w:sz="6" w:space="0" w:color="000000"/>
+            </w:tcBorders>
+            <w:shd w:val="clear" w:color="auto" w:fill="D9E2F3"/>
+            <w:tcMar>
+              <w:top w:w="60" w:type="dxa"/>
+              <w:left w:w="100" w:type="dxa"/>
+              <w:bottom w:w="60" w:type="dxa"/>
+              <w:right w:w="100" w:type="dxa"/>
+            </w:tcMar>
+            <w:hideMark/>
+          </w:tcPr>
+          <w:p>
+            <w:pPr>
+              <w:spacing w:line="288" w:lineRule="auto"/>
+              <w:rPr>
+                <w:b/>
+                <w:bCs/>
+              </w:rPr>
+            </w:pPr>
+            <w:r>
+              <w:rPr>
+                <w:b/>
+                <w:bCs/>
+              </w:rPr>
+              <w:t>Thao tác</w:t>
+            </w:r>
+          </w:p>
+        </w:tc>
+        <w:tc>
+          <w:tcPr>
+            <w:tcW w:w="0" w:type="auto"/>
+            <w:tcBorders>
+              <w:top w:val="single" w:sz="6" w:space="0" w:color="000000"/>
+              <w:left w:val="single" w:sz="6" w:space="0" w:color="000000"/>
+              <w:bottom w:val="single" w:sz="6" w:space="0" w:color="000000"/>
+              <w:right w:val="single" w:sz="6" w:space="0" w:color="000000"/>
+            </w:tcBorders>
+            <w:shd w:val="clear" w:color="auto" w:fill="D9E2F3"/>
+            <w:tcMar>
+              <w:top w:w="60" w:type="dxa"/>
+              <w:left w:w="100" w:type="dxa"/>
+              <w:bottom w:w="60" w:type="dxa"/>
+              <w:right w:w="100" w:type="dxa"/>
+            </w:tcMar>
+            <w:hideMark/>
+          </w:tcPr>
+          <w:p>
+            <w:pPr>
+              <w:spacing w:line="288" w:lineRule="auto"/>
+              <w:rPr>
+                <w:b/>
+                <w:bCs/>
+              </w:rPr>
+            </w:pPr>
+            <w:r>
+              <w:rPr>
+                <w:b/>
+                <w:bCs/>
+              </w:rPr>
+              <w:t>L</w:t>
+            </w:r>
+            <w:r>
+              <w:rPr>
+                <w:b/>
+                <w:bCs/>
+              </w:rPr>
+              <w:t>ờ</w:t>
+            </w:r>
+            <w:r>
+              <w:rPr>
+                <w:b/>
+                <w:bCs/>
+              </w:rPr>
+              <w:t>i tho</w:t>
+            </w:r>
+            <w:r>
+              <w:rPr>
+                <w:b/>
+                <w:bCs/>
+              </w:rPr>
+              <w:t>ạ</w:t>
+            </w:r>
+            <w:r>
+              <w:rPr>
+                <w:b/>
+                <w:bCs/>
+              </w:rPr>
+              <w:t>i</w:t>
+            </w:r>
+          </w:p>
+        </w:tc>
+      </w:tr>
+      <w:tr>
+        <w:tc>
+          <w:tcPr>
+            <w:tcW w:w="0" w:type="auto"/>
+            <w:tcBorders>
+              <w:top w:val="single" w:sz="6" w:space="0" w:color="000000"/>
+              <w:left w:val="single" w:sz="6" w:space="0" w:color="000000"/>
+              <w:bottom w:val="single" w:sz="6" w:space="0" w:color="000000"/>
+              <w:right w:val="single" w:sz="6" w:space="0" w:color="000000"/>
+            </w:tcBorders>
+            <w:tcMar>
+              <w:top w:w="60" w:type="dxa"/>
+              <w:left w:w="100" w:type="dxa"/>
+              <w:bottom w:w="60" w:type="dxa"/>
+              <w:right w:w="100" w:type="dxa"/>
+            </w:tcMar>
+            <w:hideMark/>
+          </w:tcPr>
+          <w:p>
+            <w:pPr>
+              <w:spacing w:line="288" w:lineRule="auto"/>
+            </w:pPr>
+            <w:r>
+              <w:t>Chuy</w:t>
+            </w:r>
+            <w:r>
+              <w:t>ể</w:t>
+            </w:r>
+            <w:r>
+              <w:t>n sang SSMS, chu</w:t>
+            </w:r>
+            <w:r>
+              <w:t>ộ</w:t>
+            </w:r>
+            <w:r>
+              <w:t>t ph</w:t>
+            </w:r>
+            <w:r>
+              <w:t>ả</w:t>
+            </w:r>
+            <w:r>
+              <w:t>i Databases → Refresh: chưa có TVUStartupDB</w:t>
+            </w:r>
+          </w:p>
+        </w:tc>
+        <w:tc>
+          <w:tcPr>
+            <w:tcW w:w="0" w:type="auto"/>
+            <w:tcBorders>
+              <w:top w:val="single" w:sz="6" w:space="0" w:color="000000"/>
+              <w:left w:val="single" w:sz="6" w:space="0" w:color="000000"/>
+              <w:bottom w:val="single" w:sz="6" w:space="0" w:color="000000"/>
+              <w:right w:val="single" w:sz="6" w:space="0" w:color="000000"/>
+            </w:tcBorders>
+            <w:tcMar>
+              <w:top w:w="60" w:type="dxa"/>
+              <w:left w:w="100" w:type="dxa"/>
+              <w:bottom w:w="60" w:type="dxa"/>
+              <w:right w:w="100" w:type="dxa"/>
+            </w:tcMar>
+            <w:hideMark/>
+          </w:tcPr>
+          <w:p>
+            <w:pPr>
+              <w:spacing w:line="288" w:lineRule="auto"/>
+            </w:pPr>
+            <w:r>
+              <w:t>Trư</w:t>
+            </w:r>
+            <w:r>
+              <w:t>ớ</w:t>
+            </w:r>
+            <w:r>
+              <w:t>c tiên em t</w:t>
+            </w:r>
+            <w:r>
+              <w:t>ạ</w:t>
+            </w:r>
+            <w:r>
+              <w:t>o cơ s</w:t>
+            </w:r>
+            <w:r>
+              <w:t>ở</w:t>
+            </w:r>
+            <w:r>
+              <w:t xml:space="preserve"> d</w:t>
+            </w:r>
+            <w:r>
+              <w:t>ữ</w:t>
+            </w:r>
+            <w:r>
+              <w:t xml:space="preserve"> li</w:t>
+            </w:r>
+            <w:r>
+              <w:t>ệ</w:t>
+            </w:r>
+            <w:r>
+              <w:t>u. Hi</w:t>
+            </w:r>
+            <w:r>
+              <w:t>ệ</w:t>
+            </w:r>
+            <w:r>
+              <w:t>n trên SQL Server chưa có cơ s</w:t>
+            </w:r>
+            <w:r>
+              <w:t>ở</w:t>
+            </w:r>
+            <w:r>
+              <w:t xml:space="preserve"> d</w:t>
+            </w:r>
+            <w:r>
+              <w:t>ữ</w:t>
+            </w:r>
+            <w:r>
+              <w:t xml:space="preserve"> li</w:t>
+            </w:r>
+            <w:r>
+              <w:t>ệ</w:t>
+            </w:r>
+            <w:r>
+              <w:t>u c</w:t>
+            </w:r>
+            <w:r>
+              <w:t>ủ</w:t>
+            </w:r>
+            <w:r>
+              <w:t>a h</w:t>
+            </w:r>
+            <w:r>
+              <w:t>ệ</w:t>
+            </w:r>
+            <w:r>
+              <w:t xml:space="preserve"> th</w:t>
+            </w:r>
+            <w:r>
+              <w:t>ố</w:t>
+            </w:r>
+            <w:r>
+              <w:t>ng.</w:t>
+            </w:r>
+          </w:p>
+        </w:tc>
+      </w:tr>
+      <w:tr>
+        <w:tc>
+          <w:tcPr>
+            <w:tcW w:w="0" w:type="auto"/>
+            <w:tcBorders>
+              <w:top w:val="single" w:sz="6" w:space="0" w:color="000000"/>
+              <w:left w:val="single" w:sz="6" w:space="0" w:color="000000"/>
+              <w:bottom w:val="single" w:sz="6" w:space="0" w:color="000000"/>
+              <w:right w:val="single" w:sz="6" w:space="0" w:color="000000"/>
+            </w:tcBorders>
+            <w:tcMar>
+              <w:top w:w="60" w:type="dxa"/>
+              <w:left w:w="100" w:type="dxa"/>
+              <w:bottom w:w="60" w:type="dxa"/>
+              <w:right w:w="100" w:type="dxa"/>
+            </w:tcMar>
+            <w:hideMark/>
+          </w:tcPr>
+          <w:p>
+            <w:pPr>
+              <w:spacing w:line="288" w:lineRule="auto"/>
+            </w:pPr>
+            <w:r>
+              <w:t>Visual Studio: m</w:t>
+            </w:r>
+            <w:r>
+              <w:t>ở</w:t>
+            </w:r>
+            <w:r>
+              <w:t xml:space="preserve"> TVUStartup.Web/appsettings.json, tr</w:t>
+            </w:r>
+            <w:r>
+              <w:t>ỏ</w:t>
+            </w:r>
+            <w:r>
+              <w:t xml:space="preserve"> vào dòng DefaultConnection</w:t>
+            </w:r>
+          </w:p>
+        </w:tc>
+        <w:tc>
+          <w:tcPr>
+            <w:tcW w:w="0" w:type="auto"/>
+            <w:tcBorders>
+              <w:top w:val="single" w:sz="6" w:space="0" w:color="000000"/>
+              <w:left w:val="single" w:sz="6" w:space="0" w:color="000000"/>
+              <w:bottom w:val="single" w:sz="6" w:space="0" w:color="000000"/>
+              <w:right w:val="single" w:sz="6" w:space="0" w:color="000000"/>
+            </w:tcBorders>
+            <w:tcMar>
+              <w:top w:w="60" w:type="dxa"/>
+              <w:left w:w="100" w:type="dxa"/>
+              <w:bottom w:w="60" w:type="dxa"/>
+              <w:right w:w="100" w:type="dxa"/>
+            </w:tcMar>
+            <w:hideMark/>
+          </w:tcPr>
+          <w:p>
+            <w:pPr>
+              <w:spacing w:line="288" w:lineRule="auto"/>
+            </w:pPr>
+            <w:r>
+              <w:t>Chu</w:t>
+            </w:r>
+            <w:r>
+              <w:t>ỗ</w:t>
+            </w:r>
+            <w:r>
+              <w:t>i k</w:t>
+            </w:r>
+            <w:r>
+              <w:t>ế</w:t>
+            </w:r>
+            <w:r>
+              <w:t>t n</w:t>
+            </w:r>
+            <w:r>
+              <w:t>ố</w:t>
+            </w:r>
+            <w:r>
+              <w:t>i tr</w:t>
+            </w:r>
+            <w:r>
+              <w:t>ỏ</w:t>
+            </w:r>
+            <w:r>
+              <w:t xml:space="preserve"> t</w:t>
+            </w:r>
+            <w:r>
+              <w:t>ớ</w:t>
+            </w:r>
+            <w:r>
+              <w:t>i SQL Server Express trên máy, cơ s</w:t>
+            </w:r>
+            <w:r>
+              <w:t>ở</w:t>
+            </w:r>
+            <w:r>
+              <w:t xml:space="preserve"> d</w:t>
+            </w:r>
+            <w:r>
+              <w:t>ữ</w:t>
+            </w:r>
+            <w:r>
+              <w:t xml:space="preserve"> li</w:t>
+            </w:r>
+            <w:r>
+              <w:t>ệ</w:t>
+            </w:r>
+            <w:r>
+              <w:t>u tên TVUStartupDB, đăng nh</w:t>
+            </w:r>
+            <w:r>
+              <w:t>ậ</w:t>
+            </w:r>
+            <w:r>
+              <w:t>p b</w:t>
+            </w:r>
+            <w:r>
+              <w:t>ằ</w:t>
+            </w:r>
+            <w:r>
+              <w:t>ng Windows Authentication.</w:t>
+            </w:r>
+          </w:p>
+        </w:tc>
+      </w:tr>
+      <w:tr>
+        <w:tc>
+          <w:tcPr>
+            <w:tcW w:w="0" w:type="auto"/>
+            <w:tcBorders>
+              <w:top w:val="single" w:sz="6" w:space="0" w:color="000000"/>
+              <w:left w:val="single" w:sz="6" w:space="0" w:color="000000"/>
+              <w:bottom w:val="single" w:sz="6" w:space="0" w:color="000000"/>
+              <w:right w:val="single" w:sz="6" w:space="0" w:color="000000"/>
+            </w:tcBorders>
+            <w:tcMar>
+              <w:top w:w="60" w:type="dxa"/>
+              <w:left w:w="100" w:type="dxa"/>
+              <w:bottom w:w="60" w:type="dxa"/>
+              <w:right w:w="100" w:type="dxa"/>
+            </w:tcMar>
+            <w:hideMark/>
+          </w:tcPr>
+          <w:p>
+            <w:pPr>
+              <w:spacing w:line="288" w:lineRule="auto"/>
+            </w:pPr>
+            <w:r>
+              <w:t>M</w:t>
+            </w:r>
+            <w:r>
+              <w:t>ở</w:t>
+            </w:r>
+            <w:r>
+              <w:t xml:space="preserve"> Data/AppDbContext.cs, cu</w:t>
+            </w:r>
+            <w:r>
+              <w:t>ộ</w:t>
+            </w:r>
+            <w:r>
+              <w:t>n qua các DbSet; m</w:t>
+            </w:r>
+            <w:r>
+              <w:t>ở</w:t>
+            </w:r>
+            <w:r>
+              <w:t xml:space="preserve"> thư m</w:t>
+            </w:r>
+            <w:r>
+              <w:t>ụ</w:t>
+            </w:r>
+            <w:r>
+              <w:t>c Data/Migrations</w:t>
+            </w:r>
+          </w:p>
+        </w:tc>
+        <w:tc>
+          <w:tcPr>
+            <w:tcW w:w="0" w:type="auto"/>
+            <w:tcBorders>
+              <w:top w:val="single" w:sz="6" w:space="0" w:color="000000"/>
+              <w:left w:val="single" w:sz="6" w:space="0" w:color="000000"/>
+              <w:bottom w:val="single" w:sz="6" w:space="0" w:color="000000"/>
+              <w:right w:val="single" w:sz="6" w:space="0" w:color="000000"/>
+            </w:tcBorders>
+            <w:tcMar>
+              <w:top w:w="60" w:type="dxa"/>
+              <w:left w:w="100" w:type="dxa"/>
+              <w:bottom w:w="60" w:type="dxa"/>
+              <w:right w:w="100" w:type="dxa"/>
+            </w:tcMar>
+            <w:hideMark/>
+          </w:tcPr>
+          <w:p>
+            <w:pPr>
+              <w:spacing w:line="288" w:lineRule="auto"/>
+            </w:pPr>
+            <w:r>
+              <w:t>Em dùng Entity Framework Core theo hư</w:t>
+            </w:r>
+            <w:r>
+              <w:t>ớ</w:t>
+            </w:r>
+            <w:r>
+              <w:t>ng Code First: các b</w:t>
+            </w:r>
+            <w:r>
+              <w:t>ả</w:t>
+            </w:r>
+            <w:r>
+              <w:t>ng đư</w:t>
+            </w:r>
+            <w:r>
+              <w:t>ợ</w:t>
+            </w:r>
+            <w:r>
+              <w:t>c khai báo b</w:t>
+            </w:r>
+            <w:r>
+              <w:t>ằ</w:t>
+            </w:r>
+            <w:r>
+              <w:t>ng l</w:t>
+            </w:r>
+            <w:r>
+              <w:t>ớ</w:t>
+            </w:r>
+            <w:r>
+              <w:t>p C# trong AppDbContext, t</w:t>
+            </w:r>
+            <w:r>
+              <w:t>ừ</w:t>
+            </w:r>
+            <w:r>
+              <w:t xml:space="preserve"> đó sinh ra migration InitialCreate.</w:t>
+            </w:r>
+          </w:p>
+        </w:tc>
+      </w:tr>
+      <w:tr>
+        <w:tc>
+          <w:tcPr>
+            <w:tcW w:w="0" w:type="auto"/>
+            <w:tcBorders>
+              <w:top w:val="single" w:sz="6" w:space="0" w:color="000000"/>
+              <w:left w:val="single" w:sz="6" w:space="0" w:color="000000"/>
+              <w:bottom w:val="single" w:sz="6" w:space="0" w:color="000000"/>
+              <w:right w:val="single" w:sz="6" w:space="0" w:color="000000"/>
+            </w:tcBorders>
+            <w:tcMar>
+              <w:top w:w="60" w:type="dxa"/>
+              <w:left w:w="100" w:type="dxa"/>
+              <w:bottom w:w="60" w:type="dxa"/>
+              <w:right w:w="100" w:type="dxa"/>
+            </w:tcMar>
+            <w:hideMark/>
+          </w:tcPr>
+          <w:p>
+            <w:pPr>
+              <w:spacing w:line="288" w:lineRule="auto"/>
+            </w:pPr>
+            <w:r>
+              <w:t>Chuy</w:t>
+            </w:r>
+            <w:r>
+              <w:t>ể</w:t>
+            </w:r>
+            <w:r>
+              <w:t>n sang PowerShell (thư m</w:t>
+            </w:r>
+            <w:r>
+              <w:t>ụ</w:t>
+            </w:r>
+            <w:r>
+              <w:t xml:space="preserve">c TVUStartup.Web), gõ </w:t>
+            </w:r>
+            <w:r>
+              <w:rPr>
+                <w:rStyle w:val="HTMLCode"/>
+              </w:rPr>
+              <w:t>dotnet ef database update --no-build</w:t>
+            </w:r>
+            <w:r>
+              <w:t xml:space="preserve"> → Enter, ch</w:t>
+            </w:r>
+            <w:r>
+              <w:t>ờ</w:t>
+            </w:r>
+            <w:r>
+              <w:t xml:space="preserve"> dòng </w:t>
+            </w:r>
+            <w:r>
+              <w:rPr>
+                <w:b/>
+                <w:bCs/>
+              </w:rPr>
+              <w:t>Done.</w:t>
+            </w:r>
+          </w:p>
+        </w:tc>
+        <w:tc>
+          <w:tcPr>
+            <w:tcW w:w="0" w:type="auto"/>
+            <w:tcBorders>
+              <w:top w:val="single" w:sz="6" w:space="0" w:color="000000"/>
+              <w:left w:val="single" w:sz="6" w:space="0" w:color="000000"/>
+              <w:bottom w:val="single" w:sz="6" w:space="0" w:color="000000"/>
+              <w:right w:val="single" w:sz="6" w:space="0" w:color="000000"/>
+            </w:tcBorders>
+            <w:tcMar>
+              <w:top w:w="60" w:type="dxa"/>
+              <w:left w:w="100" w:type="dxa"/>
+              <w:bottom w:w="60" w:type="dxa"/>
+              <w:right w:w="100" w:type="dxa"/>
+            </w:tcMar>
+            <w:hideMark/>
+          </w:tcPr>
+          <w:p>
+            <w:pPr>
+              <w:spacing w:line="288" w:lineRule="auto"/>
+            </w:pPr>
+            <w:r>
+              <w:t>L</w:t>
+            </w:r>
+            <w:r>
+              <w:t>ệ</w:t>
+            </w:r>
+            <w:r>
+              <w:t>nh database update áp d</w:t>
+            </w:r>
+            <w:r>
+              <w:t>ụ</w:t>
+            </w:r>
+            <w:r>
+              <w:t>ng migration lên SQL Server: t</w:t>
+            </w:r>
+            <w:r>
+              <w:t>ạ</w:t>
+            </w:r>
+            <w:r>
+              <w:t>o cơ s</w:t>
+            </w:r>
+            <w:r>
+              <w:t>ở</w:t>
+            </w:r>
+            <w:r>
+              <w:t xml:space="preserve"> d</w:t>
+            </w:r>
+            <w:r>
+              <w:t>ữ</w:t>
+            </w:r>
+            <w:r>
+              <w:t xml:space="preserve"> li</w:t>
+            </w:r>
+            <w:r>
+              <w:t>ệ</w:t>
+            </w:r>
+            <w:r>
+              <w:t>u cùng các b</w:t>
+            </w:r>
+            <w:r>
+              <w:t>ả</w:t>
+            </w:r>
+            <w:r>
+              <w:t>ng, khóa chính, khóa ngo</w:t>
+            </w:r>
+            <w:r>
+              <w:t>ạ</w:t>
+            </w:r>
+            <w:r>
+              <w:t>i và ch</w:t>
+            </w:r>
+            <w:r>
+              <w:t>ỉ</w:t>
+            </w:r>
+            <w:r>
+              <w:t xml:space="preserve"> m</w:t>
+            </w:r>
+            <w:r>
+              <w:t>ụ</w:t>
+            </w:r>
+            <w:r>
+              <w:t>c.</w:t>
+            </w:r>
+          </w:p>
+        </w:tc>
+      </w:tr>
+      <w:tr>
+        <w:tc>
+          <w:tcPr>
+            <w:tcW w:w="0" w:type="auto"/>
+            <w:tcBorders>
+              <w:top w:val="single" w:sz="6" w:space="0" w:color="000000"/>
+              <w:left w:val="single" w:sz="6" w:space="0" w:color="000000"/>
+              <w:bottom w:val="single" w:sz="6" w:space="0" w:color="000000"/>
+              <w:right w:val="single" w:sz="6" w:space="0" w:color="000000"/>
+            </w:tcBorders>
+            <w:tcMar>
+              <w:top w:w="60" w:type="dxa"/>
+              <w:left w:w="100" w:type="dxa"/>
+              <w:bottom w:w="60" w:type="dxa"/>
+              <w:right w:w="100" w:type="dxa"/>
+            </w:tcMar>
+            <w:hideMark/>
+          </w:tcPr>
+          <w:p>
+            <w:pPr>
+              <w:spacing w:line="288" w:lineRule="auto"/>
+            </w:pPr>
+            <w:r>
+              <w:t>SSMS: Refresh Databases → m</w:t>
+            </w:r>
+            <w:r>
+              <w:t>ở</w:t>
+            </w:r>
+            <w:r>
+              <w:t xml:space="preserve"> TVUStartupDB → Tables</w:t>
+            </w:r>
+          </w:p>
+        </w:tc>
+        <w:tc>
+          <w:tcPr>
+            <w:tcW w:w="0" w:type="auto"/>
+            <w:tcBorders>
+              <w:top w:val="single" w:sz="6" w:space="0" w:color="000000"/>
+              <w:left w:val="single" w:sz="6" w:space="0" w:color="000000"/>
+              <w:bottom w:val="single" w:sz="6" w:space="0" w:color="000000"/>
+              <w:right w:val="single" w:sz="6" w:space="0" w:color="000000"/>
+            </w:tcBorders>
+            <w:tcMar>
+              <w:top w:w="60" w:type="dxa"/>
+              <w:left w:w="100" w:type="dxa"/>
+              <w:bottom w:w="60" w:type="dxa"/>
+              <w:right w:w="100" w:type="dxa"/>
+            </w:tcMar>
+            <w:hideMark/>
+          </w:tcPr>
+          <w:p>
+            <w:pPr>
+              <w:spacing w:line="288" w:lineRule="auto"/>
+            </w:pPr>
+            <w:r>
+              <w:t>Cơ s</w:t>
+            </w:r>
+            <w:r>
+              <w:t>ở</w:t>
+            </w:r>
+            <w:r>
+              <w:t xml:space="preserve"> d</w:t>
+            </w:r>
+            <w:r>
+              <w:t>ữ</w:t>
+            </w:r>
+            <w:r>
+              <w:t xml:space="preserve"> li</w:t>
+            </w:r>
+            <w:r>
+              <w:t>ệ</w:t>
+            </w:r>
+            <w:r>
+              <w:t>u đã đư</w:t>
+            </w:r>
+            <w:r>
+              <w:t>ợ</w:t>
+            </w:r>
+            <w:r>
+              <w:t>c t</w:t>
+            </w:r>
+            <w:r>
+              <w:t>ạ</w:t>
+            </w:r>
+            <w:r>
+              <w:t>o v</w:t>
+            </w:r>
+            <w:r>
+              <w:t>ớ</w:t>
+            </w:r>
+            <w:r>
+              <w:t>i 14 b</w:t>
+            </w:r>
+            <w:r>
+              <w:t>ả</w:t>
+            </w:r>
+            <w:r>
+              <w:t>ng, hi</w:t>
+            </w:r>
+            <w:r>
+              <w:t>ệ</w:t>
+            </w:r>
+            <w:r>
+              <w:t>n chưa có d</w:t>
+            </w:r>
+            <w:r>
+              <w:t>ữ</w:t>
+            </w:r>
+            <w:r>
+              <w:t xml:space="preserve"> li</w:t>
+            </w:r>
+            <w:r>
+              <w:t>ệ</w:t>
+            </w:r>
+            <w:r>
+              <w:t>u.</w:t>
+            </w:r>
+          </w:p>
+        </w:tc>
+      </w:tr>
+      <w:tr>
+        <w:tc>
+          <w:tcPr>
+            <w:tcW w:w="0" w:type="auto"/>
+            <w:tcBorders>
+              <w:top w:val="single" w:sz="6" w:space="0" w:color="000000"/>
+              <w:left w:val="single" w:sz="6" w:space="0" w:color="000000"/>
+              <w:bottom w:val="single" w:sz="6" w:space="0" w:color="000000"/>
+              <w:right w:val="single" w:sz="6" w:space="0" w:color="000000"/>
+            </w:tcBorders>
+            <w:tcMar>
+              <w:top w:w="60" w:type="dxa"/>
+              <w:left w:w="100" w:type="dxa"/>
+              <w:bottom w:w="60" w:type="dxa"/>
+              <w:right w:w="100" w:type="dxa"/>
+            </w:tcMar>
+            <w:hideMark/>
+          </w:tcPr>
+          <w:p>
+            <w:pPr>
+              <w:spacing w:line="288" w:lineRule="auto"/>
+            </w:pPr>
+            <w:r>
+              <w:t xml:space="preserve">PowerShell: gõ </w:t>
+            </w:r>
+            <w:r>
+              <w:rPr>
+                <w:rStyle w:val="HTMLCode"/>
+              </w:rPr>
+              <w:t>dotnet run --no-build --urls http://localhost:5080</w:t>
+            </w:r>
+            <w:r>
+              <w:t xml:space="preserve"> → ch</w:t>
+            </w:r>
+            <w:r>
+              <w:t>ờ</w:t>
+            </w:r>
+            <w:r>
+              <w:t xml:space="preserve"> dòng </w:t>
+            </w:r>
+            <w:r>
+              <w:rPr>
+                <w:b/>
+                <w:bCs/>
+              </w:rPr>
+              <w:t>Now listening on: http://localhost:5080</w:t>
+            </w:r>
+          </w:p>
+        </w:tc>
+        <w:tc>
+          <w:tcPr>
+            <w:tcW w:w="0" w:type="auto"/>
+            <w:tcBorders>
+              <w:top w:val="single" w:sz="6" w:space="0" w:color="000000"/>
+              <w:left w:val="single" w:sz="6" w:space="0" w:color="000000"/>
+              <w:bottom w:val="single" w:sz="6" w:space="0" w:color="000000"/>
+              <w:right w:val="single" w:sz="6" w:space="0" w:color="000000"/>
+            </w:tcBorders>
+            <w:tcMar>
+              <w:top w:w="60" w:type="dxa"/>
+              <w:left w:w="100" w:type="dxa"/>
+              <w:bottom w:w="60" w:type="dxa"/>
+              <w:right w:w="100" w:type="dxa"/>
+            </w:tcMar>
+            <w:hideMark/>
+          </w:tcPr>
+          <w:p>
+            <w:pPr>
+              <w:spacing w:line="288" w:lineRule="auto"/>
+            </w:pPr>
+            <w:r>
+              <w:t>Bây gi</w:t>
+            </w:r>
+            <w:r>
+              <w:t>ờ</w:t>
+            </w:r>
+            <w:r>
+              <w:t xml:space="preserve"> em ch</w:t>
+            </w:r>
+            <w:r>
+              <w:t>ạ</w:t>
+            </w:r>
+            <w:r>
+              <w:t>y website. Khi kh</w:t>
+            </w:r>
+            <w:r>
+              <w:t>ở</w:t>
+            </w:r>
+            <w:r>
+              <w:t>i đ</w:t>
+            </w:r>
+            <w:r>
+              <w:t>ộ</w:t>
+            </w:r>
+            <w:r>
+              <w:t>ng, l</w:t>
+            </w:r>
+            <w:r>
+              <w:t>ớ</w:t>
+            </w:r>
+            <w:r>
+              <w:t>p DbSeeder ki</w:t>
+            </w:r>
+            <w:r>
+              <w:t>ể</w:t>
+            </w:r>
+            <w:r>
+              <w:t>m tra cơ s</w:t>
+            </w:r>
+            <w:r>
+              <w:t>ở</w:t>
+            </w:r>
+            <w:r>
+              <w:t xml:space="preserve"> d</w:t>
+            </w:r>
+            <w:r>
+              <w:t>ữ</w:t>
+            </w:r>
+            <w:r>
+              <w:t xml:space="preserve"> li</w:t>
+            </w:r>
+            <w:r>
+              <w:t>ệ</w:t>
+            </w:r>
+            <w:r>
+              <w:t>u còn tr</w:t>
+            </w:r>
+            <w:r>
+              <w:t>ố</w:t>
+            </w:r>
+            <w:r>
+              <w:t>ng thì n</w:t>
+            </w:r>
+            <w:r>
+              <w:t>ạ</w:t>
+            </w:r>
+            <w:r>
+              <w:t>p d</w:t>
+            </w:r>
+            <w:r>
+              <w:t>ữ</w:t>
+            </w:r>
+            <w:r>
+              <w:t xml:space="preserve"> li</w:t>
+            </w:r>
+            <w:r>
+              <w:t>ệ</w:t>
+            </w:r>
+            <w:r>
+              <w:t>u m</w:t>
+            </w:r>
+            <w:r>
+              <w:t>ẫ</w:t>
+            </w:r>
+            <w:r>
+              <w:t>u: 7 khoa, 8 lĩnh v</w:t>
+            </w:r>
+            <w:r>
+              <w:t>ự</w:t>
+            </w:r>
+            <w:r>
+              <w:t>c, các tài kho</w:t>
+            </w:r>
+            <w:r>
+              <w:t>ả</w:t>
+            </w:r>
+            <w:r>
+              <w:t>n và 13 d</w:t>
+            </w:r>
+            <w:r>
+              <w:t>ự</w:t>
+            </w:r>
+            <w:r>
+              <w:t xml:space="preserve"> án.</w:t>
+            </w:r>
+          </w:p>
+        </w:tc>
+      </w:tr>
+      <w:tr>
+        <w:tc>
+          <w:tcPr>
+            <w:tcW w:w="0" w:type="auto"/>
+            <w:tcBorders>
+              <w:top w:val="single" w:sz="6" w:space="0" w:color="000000"/>
+              <w:left w:val="single" w:sz="6" w:space="0" w:color="000000"/>
+              <w:bottom w:val="single" w:sz="6" w:space="0" w:color="000000"/>
+              <w:right w:val="single" w:sz="6" w:space="0" w:color="000000"/>
+            </w:tcBorders>
+            <w:tcMar>
+              <w:top w:w="60" w:type="dxa"/>
+              <w:left w:w="100" w:type="dxa"/>
+              <w:bottom w:w="60" w:type="dxa"/>
+              <w:right w:w="100" w:type="dxa"/>
+            </w:tcMar>
+            <w:hideMark/>
+          </w:tcPr>
+          <w:p>
+            <w:pPr>
+              <w:spacing w:line="288" w:lineRule="auto"/>
+            </w:pPr>
+            <w:r>
+              <w:t xml:space="preserve">SSMS: New Query → gõ </w:t>
+            </w:r>
+            <w:r>
+              <w:rPr>
+                <w:rStyle w:val="HTMLCode"/>
+              </w:rPr>
+              <w:t>SELECT ProjectName, Status FROM Project</w:t>
+            </w:r>
+            <w:r>
+              <w:t xml:space="preserve"> → Execute (F5)</w:t>
+            </w:r>
+          </w:p>
+        </w:tc>
+        <w:tc>
+          <w:tcPr>
+            <w:tcW w:w="0" w:type="auto"/>
+            <w:tcBorders>
+              <w:top w:val="single" w:sz="6" w:space="0" w:color="000000"/>
+              <w:left w:val="single" w:sz="6" w:space="0" w:color="000000"/>
+              <w:bottom w:val="single" w:sz="6" w:space="0" w:color="000000"/>
+              <w:right w:val="single" w:sz="6" w:space="0" w:color="000000"/>
+            </w:tcBorders>
+            <w:tcMar>
+              <w:top w:w="60" w:type="dxa"/>
+              <w:left w:w="100" w:type="dxa"/>
+              <w:bottom w:w="60" w:type="dxa"/>
+              <w:right w:w="100" w:type="dxa"/>
+            </w:tcMar>
+            <w:hideMark/>
+          </w:tcPr>
+          <w:p>
+            <w:pPr>
+              <w:spacing w:line="288" w:lineRule="auto"/>
+            </w:pPr>
+            <w:r>
+              <w:t>Ki</w:t>
+            </w:r>
+            <w:r>
+              <w:t>ể</w:t>
+            </w:r>
+            <w:r>
+              <w:t>m tra l</w:t>
+            </w:r>
+            <w:r>
+              <w:t>ạ</w:t>
+            </w:r>
+            <w:r>
+              <w:t>i, b</w:t>
+            </w:r>
+            <w:r>
+              <w:t>ả</w:t>
+            </w:r>
+            <w:r>
+              <w:t>ng Project đã có 13 d</w:t>
+            </w:r>
+            <w:r>
+              <w:t>ự</w:t>
+            </w:r>
+            <w:r>
+              <w:t xml:space="preserve"> án m</w:t>
+            </w:r>
+            <w:r>
+              <w:t>ẫ</w:t>
+            </w:r>
+            <w:r>
+              <w:t>u.</w:t>
+            </w:r>
+          </w:p>
+        </w:tc>
+      </w:tr>
+      <w:tr>
+        <w:tc>
+          <w:tcPr>
+            <w:tcW w:w="0" w:type="auto"/>
+            <w:tcBorders>
+              <w:top w:val="single" w:sz="6" w:space="0" w:color="000000"/>
+              <w:left w:val="single" w:sz="6" w:space="0" w:color="000000"/>
+              <w:bottom w:val="single" w:sz="6" w:space="0" w:color="000000"/>
+              <w:right w:val="single" w:sz="6" w:space="0" w:color="000000"/>
+            </w:tcBorders>
+            <w:tcMar>
+              <w:top w:w="60" w:type="dxa"/>
+              <w:left w:w="100" w:type="dxa"/>
+              <w:bottom w:w="60" w:type="dxa"/>
+              <w:right w:w="100" w:type="dxa"/>
+            </w:tcMar>
+            <w:hideMark/>
+          </w:tcPr>
+          <w:p>
+            <w:pPr>
+              <w:spacing w:line="288" w:lineRule="auto"/>
+            </w:pPr>
+            <w:r>
+              <w:t>M</w:t>
+            </w:r>
+            <w:r>
+              <w:t>ở</w:t>
+            </w:r>
+            <w:r>
+              <w:t xml:space="preserve"> c</w:t>
+            </w:r>
+            <w:r>
+              <w:t>ử</w:t>
+            </w:r>
+            <w:r>
+              <w:t>a s</w:t>
+            </w:r>
+            <w:r>
+              <w:t>ổ</w:t>
+            </w:r>
+            <w:r>
+              <w:t xml:space="preserve"> C, gõ http://localhost:5080. M</w:t>
+            </w:r>
+            <w:r>
+              <w:t>ở</w:t>
+            </w:r>
+            <w:r>
+              <w:t xml:space="preserve"> thêm đ</w:t>
+            </w:r>
+            <w:r>
+              <w:t>ị</w:t>
+            </w:r>
+            <w:r>
+              <w:t>a ch</w:t>
+            </w:r>
+            <w:r>
+              <w:t>ỉ</w:t>
+            </w:r>
+            <w:r>
+              <w:t xml:space="preserve"> này </w:t>
+            </w:r>
+            <w:r>
+              <w:t>ở</w:t>
+            </w:r>
+            <w:r>
+              <w:t xml:space="preserve"> c</w:t>
+            </w:r>
+            <w:r>
+              <w:t>ử</w:t>
+            </w:r>
+            <w:r>
+              <w:t>a s</w:t>
+            </w:r>
+            <w:r>
+              <w:t>ổ</w:t>
+            </w:r>
+            <w:r>
+              <w:t xml:space="preserve"> A và B</w:t>
+            </w:r>
+          </w:p>
+        </w:tc>
+        <w:tc>
+          <w:tcPr>
+            <w:tcW w:w="0" w:type="auto"/>
+            <w:tcBorders>
+              <w:top w:val="single" w:sz="6" w:space="0" w:color="000000"/>
+              <w:left w:val="single" w:sz="6" w:space="0" w:color="000000"/>
+              <w:bottom w:val="single" w:sz="6" w:space="0" w:color="000000"/>
+              <w:right w:val="single" w:sz="6" w:space="0" w:color="000000"/>
+            </w:tcBorders>
+            <w:tcMar>
+              <w:top w:w="60" w:type="dxa"/>
+              <w:left w:w="100" w:type="dxa"/>
+              <w:bottom w:w="60" w:type="dxa"/>
+              <w:right w:w="100" w:type="dxa"/>
+            </w:tcMar>
+            <w:hideMark/>
+          </w:tcPr>
+          <w:p>
+            <w:pPr>
+              <w:spacing w:line="288" w:lineRule="auto"/>
+            </w:pPr>
+            <w:r>
+              <w:t>Website đã ch</w:t>
+            </w:r>
+            <w:r>
+              <w:t>ạ</w:t>
+            </w:r>
+            <w:r>
+              <w:t>y trên localhost. Em s</w:t>
+            </w:r>
+            <w:r>
+              <w:t>ẽ</w:t>
+            </w:r>
+            <w:r>
+              <w:t xml:space="preserve"> demo theo đúng vòng đ</w:t>
+            </w:r>
+            <w:r>
+              <w:t>ờ</w:t>
+            </w:r>
+            <w:r>
+              <w:t>i c</w:t>
+            </w:r>
+            <w:r>
+              <w:t>ủ</w:t>
+            </w:r>
+            <w:r>
+              <w:t>a m</w:t>
+            </w:r>
+            <w:r>
+              <w:t>ộ</w:t>
+            </w:r>
+            <w:r>
+              <w:t>t d</w:t>
+            </w:r>
+            <w:r>
+              <w:t>ự</w:t>
+            </w:r>
+            <w:r>
+              <w:t xml:space="preserve"> án, t</w:t>
+            </w:r>
+            <w:r>
+              <w:t>ừ</w:t>
+            </w:r>
+            <w:r>
+              <w:t xml:space="preserve"> lúc sinh viên đăng cho đ</w:t>
+            </w:r>
+            <w:r>
+              <w:t>ế</w:t>
+            </w:r>
+            <w:r>
+              <w:t>n khi đư</w:t>
+            </w:r>
+            <w:r>
+              <w:t>ợ</w:t>
+            </w:r>
+            <w:r>
+              <w:t>c duy</w:t>
+            </w:r>
+            <w:r>
+              <w:t>ệ</w:t>
+            </w:r>
+            <w:r>
+              <w:t>t và công khai.</w:t>
+            </w:r>
+          </w:p>
+        </w:tc>
+      </w:tr>
+    </w:tbl>
+    <w:p>
+      <w:pPr>
+        <w:pStyle w:val="Heading3"/>
+        <w:rPr>
+          <w:rFonts w:eastAsia="Times New Roman"/>
+        </w:rPr>
+      </w:pPr>
+      <w:r>
+        <w:rPr>
+          <w:rFonts w:eastAsia="Times New Roman"/>
+        </w:rPr>
+        <w:t>Cảnh 3. Khách xem và tìm kiếm dự án (1:45 – 3:15) – cửa sổ C</w:t>
       </w:r>
     </w:p>
     <w:tbl>
@@ -7679,7 +9294,10 @@
               <w:t>tra mang cau</w:t>
             </w:r>
             <w:r>
-              <w:t xml:space="preserve"> (không d</w:t>
+              <w:t xml:space="preserve"> </w:t>
+            </w:r>
+            <w:r>
+              <w:t>(không d</w:t>
             </w:r>
             <w:r>
               <w:t>ấ</w:t>
@@ -8075,7 +9693,10 @@
               <w:t>p tác</w:t>
             </w:r>
             <w:r>
-              <w:t xml:space="preserve"> → nh</w:t>
+              <w:t xml:space="preserve"> </w:t>
+            </w:r>
+            <w:r>
+              <w:t>→ nh</w:t>
             </w:r>
             <w:r>
               <w:t>ậ</w:t>
@@ -8320,7 +9941,19 @@
               <w:spacing w:line="288" w:lineRule="auto"/>
             </w:pPr>
             <w:r>
-              <w:t>Nh</w:t>
+              <w:t>(N</w:t>
+            </w:r>
+            <w:r>
+              <w:t>ế</w:t>
+            </w:r>
+            <w:r>
+              <w:t>u còn th</w:t>
+            </w:r>
+            <w:r>
+              <w:t>ờ</w:t>
+            </w:r>
+            <w:r>
+              <w:t>i gian) Nh</w:t>
             </w:r>
             <w:r>
               <w:t>ấ</w:t>
@@ -8450,7 +10083,7 @@
         <w:rPr>
           <w:rFonts w:eastAsia="Times New Roman"/>
         </w:rPr>
-        <w:t>Cảnh 3. Đăng ký tài khoản (2:30 – 3:15) – cửa sổ C</w:t>
+        <w:t>Cảnh 4. Đăng ký tài khoản (3:15 – 3:50) – cửa sổ C</w:t>
       </w:r>
     </w:p>
     <w:tbl>
@@ -8990,7 +10623,7 @@
         <w:rPr>
           <w:rFonts w:eastAsia="Times New Roman"/>
         </w:rPr>
-        <w:t>Cảnh 4. Sinh viên đăng dự án (3:15 – 6:00) – cửa sổ A</w:t>
+        <w:t>Cảnh 5. Sinh viên đăng dự án (3:50 – 6:15) – cửa sổ A</w:t>
       </w:r>
     </w:p>
     <w:tbl>
@@ -10581,7 +12214,7 @@
         <w:rPr>
           <w:rFonts w:eastAsia="Times New Roman"/>
         </w:rPr>
-        <w:t>Cảnh 5. Quản trị viên kiểm duyệt (6:00 – 8:00) – cửa sổ B và A</w:t>
+        <w:t>Cảnh 6. Quản trị viên kiểm duyệt (6:15 – 8:00) – cửa sổ B và A</w:t>
       </w:r>
     </w:p>
     <w:tbl>
@@ -11741,10 +13374,7 @@
               <w:t>Xem website</w:t>
             </w:r>
             <w:r>
-              <w:t xml:space="preserve"> </w:t>
-            </w:r>
-            <w:r>
-              <w:t>→ trang ch</w:t>
+              <w:t xml:space="preserve"> → trang ch</w:t>
             </w:r>
             <w:r>
               <w:t>ủ</w:t>
@@ -12041,7 +13671,7 @@
         <w:rPr>
           <w:rFonts w:eastAsia="Times New Roman"/>
         </w:rPr>
-        <w:t>Cảnh 6. Bình luận, đánh giá, bình chọn (8:00 – 9:00) – cửa sổ C và A</w:t>
+        <w:t>Cảnh 7. Bình luận, đánh giá, bình chọn (8:00 – 8:50) – cửa sổ C và A</w:t>
       </w:r>
     </w:p>
     <w:tbl>
@@ -12878,7 +14508,7 @@
         <w:rPr>
           <w:rFonts w:eastAsia="Times New Roman"/>
         </w:rPr>
-        <w:t>Cảnh 7. Phân quyền, khóa tài khoản và kết thúc (9:00 – 10:00)</w:t>
+        <w:t>Cảnh 8. Phân quyền, khóa tài khoản và kết thúc (8:50 – 9:50)</w:t>
       </w:r>
     </w:p>
     <w:tbl>
@@ -13688,7 +15318,7 @@
           <w:sz w:val="26"/>
           <w:szCs w:val="26"/>
         </w:rPr>
-        <w:t>Chạy lại dat_lai_du_lieu.ps1 nếu cần trả website về dữ liệu mẫu ban đầu.</w:t>
+        <w:t>Nhấn Ctrl+C ở cửa sổ PowerShell để dừng website. Chạy lại dat_lai_du_lieu.ps1 nếu cần quay lại từ đầu.</w:t>
       </w:r>
     </w:p>
     <w:sectPr>
@@ -13704,9 +15334,9 @@
 <file path=word/numbering.xml><?xml version="1.0" encoding="utf-8"?>
 <w:numbering xmlns:wpc="http://schemas.microsoft.com/office/word/2010/wordprocessingCanvas" xmlns:cx="http://schemas.microsoft.com/office/drawing/2014/chartex" xmlns:cx1="http://schemas.microsoft.com/office/drawing/2015/9/8/chartex" xmlns:cx2="http://schemas.microsoft.com/office/drawing/2015/10/21/chartex" xmlns:cx3="http://schemas.microsoft.com/office/drawing/2016/5/9/chartex" xmlns:cx4="http://schemas.microsoft.com/office/drawing/2016/5/10/chartex" xmlns:cx5="http://schemas.microsoft.com/office/drawing/2016/5/11/chartex" xmlns:cx6="http://schemas.microsoft.com/office/drawing/2016/5/12/chartex" xmlns:cx7="http://schemas.microsoft.com/office/drawing/2016/5/13/chartex" xmlns:cx8="http://schemas.microsoft.com/office/drawing/2016/5/14/chartex" xmlns:mc="http://schemas.openxmlformats.org/markup-compatibility/2006" xmlns:aink="http://schemas.microsoft.com/office/drawing/2016/ink" xmlns:am3d="http://schemas.microsoft.com/office/drawing/2017/model3d" xmlns:o="urn:schemas-microsoft-com:office:office" xmlns:oel="http://schemas.microsoft.com/office/2019/extlst" xmlns:r="http://schemas.openxmlformats.org/officeDocument/2006/relationships" xmlns:m="http://schemas.openxmlformats.org/officeDocument/2006/math" xmlns:v="urn:schemas-microsoft-com:vml" xmlns:wp14="http://schemas.microsoft.com/office/word/2010/wordprocessingDrawing" xmlns:wp="http://schemas.openxmlformats.org/drawingml/2006/wordprocessingDrawing" xmlns:w10="urn:schemas-microsoft-com:office:word" xmlns:w="http://schemas.openxmlformats.org/wordprocessingml/2006/main" xmlns:w14="http://schemas.microsoft.com/office/word/2010/wordml" xmlns:w15="http://schemas.microsoft.com/office/word/2012/wordml" xmlns:w16cex="http://schemas.microsoft.com/office/word/2018/wordml/cex" xmlns:w16cid="http://schemas.microsoft.com/office/word/2016/wordml/cid" xmlns:w16="http://schemas.microsoft.com/office/word/2018/wordml" xmlns:w16du="http://schemas.microsoft.com/office/word/2023/wordml/word16du" xmlns:w16sdtdh="http://schemas.microsoft.com/office/word/2020/wordml/sdtdatahash" xmlns:w16sdtfl="http://schemas.microsoft.com/office/word/2024/wordml/sdtformatlock" xmlns:w16se="http://schemas.microsoft.com/office/word/2015/wordml/symex" xmlns:wpg="http://schemas.microsoft.com/office/word/2010/wordprocessingGroup" xmlns:wpi="http://schemas.microsoft.com/office/word/2010/wordprocessingInk" xmlns:wne="http://schemas.microsoft.com/office/word/2006/wordml" xmlns:wps="http://schemas.microsoft.com/office/word/2010/wordprocessingShape" mc:Ignorable="w14 w15 w16se w16cid w16 w16cex w16sdtdh w16sdtfl w16du wp14">
   <w:abstractNum w:abstractNumId="0" w15:restartNumberingAfterBreak="0">
-    <w:nsid w:val="2B72795F"/>
+    <w:nsid w:val="377D6CA2"/>
     <w:multiLevelType w:val="multilevel"/>
-    <w:tmpl w:val="08DEA598"/>
+    <w:tmpl w:val="A3BE32F0"/>
     <w:lvl w:ilvl="0">
       <w:start w:val="1"/>
       <w:numFmt w:val="bullet"/>
@@ -13853,9 +15483,9 @@
     </w:lvl>
   </w:abstractNum>
   <w:abstractNum w:abstractNumId="1" w15:restartNumberingAfterBreak="0">
-    <w:nsid w:val="3A434B9A"/>
+    <w:nsid w:val="4C593F14"/>
     <w:multiLevelType w:val="multilevel"/>
-    <w:tmpl w:val="0B8A12AE"/>
+    <w:tmpl w:val="5B706014"/>
     <w:lvl w:ilvl="0">
       <w:start w:val="1"/>
       <w:numFmt w:val="bullet"/>
@@ -14002,9 +15632,9 @@
     </w:lvl>
   </w:abstractNum>
   <w:abstractNum w:abstractNumId="2" w15:restartNumberingAfterBreak="0">
-    <w:nsid w:val="3B945390"/>
+    <w:nsid w:val="51B008B6"/>
     <w:multiLevelType w:val="multilevel"/>
-    <w:tmpl w:val="0CB60E9A"/>
+    <w:tmpl w:val="9A401CDE"/>
     <w:lvl w:ilvl="0">
       <w:start w:val="1"/>
       <w:numFmt w:val="bullet"/>
@@ -14151,9 +15781,9 @@
     </w:lvl>
   </w:abstractNum>
   <w:abstractNum w:abstractNumId="3" w15:restartNumberingAfterBreak="0">
-    <w:nsid w:val="4DD354F2"/>
+    <w:nsid w:val="57C27291"/>
     <w:multiLevelType w:val="multilevel"/>
-    <w:tmpl w:val="22F2F748"/>
+    <w:tmpl w:val="DE6EBCEA"/>
     <w:lvl w:ilvl="0">
       <w:start w:val="1"/>
       <w:numFmt w:val="bullet"/>
@@ -14300,9 +15930,9 @@
     </w:lvl>
   </w:abstractNum>
   <w:abstractNum w:abstractNumId="4" w15:restartNumberingAfterBreak="0">
-    <w:nsid w:val="4E1E202D"/>
+    <w:nsid w:val="7625393A"/>
     <w:multiLevelType w:val="multilevel"/>
-    <w:tmpl w:val="3B801D90"/>
+    <w:tmpl w:val="24BC81F0"/>
     <w:lvl w:ilvl="0">
       <w:start w:val="1"/>
       <w:numFmt w:val="bullet"/>
@@ -14448,20 +16078,20 @@
       </w:rPr>
     </w:lvl>
   </w:abstractNum>
-  <w:num w:numId="1" w16cid:durableId="396632326">
+  <w:num w:numId="1" w16cid:durableId="1545436797">
+    <w:abstractNumId w:val="2"/>
+  </w:num>
+  <w:num w:numId="2" w16cid:durableId="1906258670">
     <w:abstractNumId w:val="3"/>
   </w:num>
-  <w:num w:numId="2" w16cid:durableId="542257347">
-    <w:abstractNumId w:val="0"/>
+  <w:num w:numId="3" w16cid:durableId="1034307406">
+    <w:abstractNumId w:val="1"/>
   </w:num>
-  <w:num w:numId="3" w16cid:durableId="1398943642">
+  <w:num w:numId="4" w16cid:durableId="622931489">
     <w:abstractNumId w:val="4"/>
   </w:num>
-  <w:num w:numId="4" w16cid:durableId="35741857">
-    <w:abstractNumId w:val="1"/>
-  </w:num>
-  <w:num w:numId="5" w16cid:durableId="1086267174">
-    <w:abstractNumId w:val="2"/>
+  <w:num w:numId="5" w16cid:durableId="1130053061">
+    <w:abstractNumId w:val="0"/>
   </w:num>
 </w:numbering>
 </file>

</xml_diff>